<commit_message>
v3.3.2: Use one-liner install in setup guide Chapter 6
- Replaced manual git clone + ./install.sh with curl | bash one-liner
- Updated changelog and CHANGELOG.md
- Bumped to v3.3.2
</commit_message>
<xml_diff>
--- a/setup-guide/setup-guide.docx
+++ b/setup-guide/setup-guide.docx
@@ -70,7 +70,7 @@
         <w:pStyle w:val="CoverMeta"/>
       </w:pPr>
       <w:r>
-        <w:t xml:space="preserve">v3.3.0</w:t>
+        <w:t xml:space="preserve">v3.3.2</w:t>
       </w:r>
     </w:p>
     <w:p>
@@ -10809,7 +10809,22 @@
         </w:numPr>
       </w:pPr>
       <w:r>
-        <w:t xml:space="preserve">Clone the repository:</w:t>
+        <w:t xml:space="preserve">Run the one-liner install (clones the repo to</w:t>
+      </w:r>
+      <w:r>
+        <w:t xml:space="preserve"> </w:t>
+      </w:r>
+      <w:r>
+        <w:rPr>
+          <w:rStyle w:val="VerbatimChar"/>
+        </w:rPr>
+        <w:t xml:space="preserve">/home/huawei-doc-templates</w:t>
+      </w:r>
+      <w:r>
+        <w:t xml:space="preserve"> </w:t>
+      </w:r>
+      <w:r>
+        <w:t xml:space="preserve">and installs everything):</w:t>
       </w:r>
     </w:p>
     <w:p>
@@ -10837,68 +10852,45 @@
       </w:r>
       <w:r>
         <w:rPr>
+          <w:rStyle w:val="ExtensionTok"/>
+        </w:rPr>
+        <w:t xml:space="preserve">curl</w:t>
+      </w:r>
+      <w:r>
+        <w:rPr>
+          <w:rStyle w:val="NormalTok"/>
+        </w:rPr>
+        <w:t xml:space="preserve"> </w:t>
+      </w:r>
+      <w:r>
+        <w:rPr>
+          <w:rStyle w:val="AttributeTok"/>
+        </w:rPr>
+        <w:t xml:space="preserve">-fsSL</w:t>
+      </w:r>
+      <w:r>
+        <w:rPr>
+          <w:rStyle w:val="NormalTok"/>
+        </w:rPr>
+        <w:t xml:space="preserve"> https://raw.githubusercontent.com/wallacelw/huawei-doc-templates/main/install.sh </w:t>
+      </w:r>
+      <w:r>
+        <w:rPr>
+          <w:rStyle w:val="KeywordTok"/>
+        </w:rPr>
+        <w:t xml:space="preserve">|</w:t>
+      </w:r>
+      <w:r>
+        <w:rPr>
+          <w:rStyle w:val="NormalTok"/>
+        </w:rPr>
+        <w:t xml:space="preserve"> </w:t>
+      </w:r>
+      <w:r>
+        <w:rPr>
           <w:rStyle w:val="FunctionTok"/>
         </w:rPr>
-        <w:t xml:space="preserve">git</w:t>
-      </w:r>
-      <w:r>
-        <w:rPr>
-          <w:rStyle w:val="NormalTok"/>
-        </w:rPr>
-        <w:t xml:space="preserve"> clone https://github.com/wallacelw/huawei-doc-templates.git</w:t>
-      </w:r>
-      <w:r>
-        <w:br/>
-      </w:r>
-      <w:r>
-        <w:rPr>
-          <w:rStyle w:val="BuiltInTok"/>
-        </w:rPr>
-        <w:t xml:space="preserve">cd</w:t>
-      </w:r>
-      <w:r>
-        <w:rPr>
-          <w:rStyle w:val="NormalTok"/>
-        </w:rPr>
-        <w:t xml:space="preserve"> huawei-doc-templates</w:t>
-      </w:r>
-    </w:p>
-    <w:p>
-      <w:pPr>
-        <w:numPr>
-          <w:ilvl w:val="0"/>
-          <w:numId w:val="1024"/>
-        </w:numPr>
-      </w:pPr>
-      <w:r>
-        <w:t xml:space="preserve">Run the setup script (installs XeLaTeX, latexmk, fonts, the coding</w:t>
-      </w:r>
-      <w:r>
-        <w:t xml:space="preserve"> </w:t>
-      </w:r>
-      <w:r>
-        <w:t xml:space="preserve">agent skill, and configures VS Code LaTeX Workshop at the user</w:t>
-      </w:r>
-      <w:r>
-        <w:t xml:space="preserve"> </w:t>
-      </w:r>
-      <w:r>
-        <w:t xml:space="preserve">level):</w:t>
-      </w:r>
-    </w:p>
-    <w:p>
-      <w:pPr>
-        <w:numPr>
-          <w:ilvl w:val="0"/>
-          <w:numId w:val="1000"/>
-        </w:numPr>
-        <w:pStyle w:val="SourceCode"/>
-      </w:pPr>
-      <w:r>
-        <w:rPr>
-          <w:rStyle w:val="ExtensionTok"/>
-        </w:rPr>
-        <w:t xml:space="preserve">./install.sh</w:t>
+        <w:t xml:space="preserve">bash</w:t>
       </w:r>
     </w:p>
     <w:tbl>
@@ -10907,7 +10899,7 @@
         <w:tblLayout w:type="fixed"/>
         <w:tblBorders>
           <w:top w:val="none" w:sz="0" w:space="0" w:color="auto"/>
-          <w:left w:val="single" w:sz="24" w:space="0" w:color="F57C00"/>
+          <w:left w:val="single" w:sz="24" w:space="0" w:color="1565C0"/>
           <w:bottom w:val="none" w:sz="0" w:space="0" w:color="auto"/>
           <w:right w:val="none" w:sz="0" w:space="0" w:color="auto"/>
         </w:tblBorders>
@@ -10922,18 +10914,18 @@
         <w:tc>
           <w:tcPr>
             <w:tcW w:w="9638" w:type="dxa"/>
-            <w:shd w:val="clear" w:color="auto" w:fill="FFF8E1"/>
+            <w:shd w:val="clear" w:color="auto" w:fill="E3F2FD"/>
           </w:tcPr>
           <w:p>
             <w:r>
               <w:rPr>
                 <w:rFonts w:ascii="HarmonyOS Sans" w:hAnsi="HarmonyOS Sans"/>
                 <w:b/>
-                <w:color w:val="C7000B"/>
+                <w:color w:val="1565C0"/>
                 <w:sz w:val="21"/>
                 <w:szCs w:val="21"/>
               </w:rPr>
-              <w:t>Important</w:t>
+              <w:t>Info</w:t>
             </w:r>
           </w:p>
           <w:p>
@@ -10944,46 +10936,40 @@
               </w:numPr>
             </w:pPr>
             <w:r>
-              <w:t xml:space="preserve">The script runs</w:t>
+              <w:t xml:space="preserve">The script installs XeLaTeX, latexmk, fonts (HarmonyOS Sans + Cascadia Code),</w:t>
             </w:r>
             <w:r>
               <w:t xml:space="preserve"> </w:t>
             </w:r>
             <w:r>
+              <w:t xml:space="preserve">the opencode skills, and configures VS Code LaTeX Workshop. It is idempotent</w:t>
+            </w:r>
+            <w:r>
+              <w:t xml:space="preserve"> </w:t>
+            </w:r>
+            <w:r>
+              <w:t xml:space="preserve">— safe to re-run. It runs</w:t>
+            </w:r>
+            <w:r>
+              <w:t xml:space="preserve"> </w:t>
+            </w:r>
+            <w:r>
               <w:rPr>
                 <w:rStyle w:val="VerbatimChar"/>
               </w:rPr>
-              <w:t xml:space="preserve">sudo apt-get install</w:t>
+              <w:t xml:space="preserve">apt-get install</w:t>
             </w:r>
             <w:r>
               <w:t xml:space="preserve"> </w:t>
             </w:r>
             <w:r>
-              <w:t xml:space="preserve">for TeX Live packages. If you</w:t>
+              <w:t xml:space="preserve">for TeX Live packages;</w:t>
             </w:r>
             <w:r>
               <w:t xml:space="preserve"> </w:t>
             </w:r>
             <w:r>
-              <w:t xml:space="preserve">do not have sudo access, ask your administrator to install the packages</w:t>
-            </w:r>
-            <w:r>
-              <w:t xml:space="preserve"> </w:t>
-            </w:r>
-            <w:r>
-              <w:t xml:space="preserve">listed in</w:t>
-            </w:r>
-            <w:r>
-              <w:t xml:space="preserve"> </w:t>
-            </w:r>
-            <w:r>
-              <w:rPr>
-                <w:rStyle w:val="VerbatimChar"/>
-              </w:rPr>
-              <w:t xml:space="preserve">install.sh</w:t>
-            </w:r>
-            <w:r>
-              <w:t xml:space="preserve">.</w:t>
+              <w:t xml:space="preserve">if you do not have sudo access, ask your administrator to install them.</w:t>
             </w:r>
           </w:p>
         </w:tc>
@@ -14506,6 +14492,81 @@
         </w:pBdr>
         <w:spacing w:after="120"/>
       </w:pPr>
+    </w:p>
+    <w:p>
+      <w:pPr>
+        <w:tabs>
+          <w:tab w:val="right" w:pos="9638"/>
+        </w:tabs>
+      </w:pPr>
+      <w:r>
+        <w:rPr>
+          <w:b/>
+        </w:rPr>
+        <w:t xml:space="preserve">3.3.2</w:t>
+      </w:r>
+      <w:r>
+        <w:tab/>
+      </w:r>
+      <w:r>
+        <w:rPr>
+          <w:i/>
+        </w:rPr>
+        <w:t xml:space="preserve">2026-09-11</w:t>
+      </w:r>
+    </w:p>
+    <w:p>
+      <w:pPr>
+        <w:pStyle w:val="BodyText"/>
+      </w:pPr>
+      <w:r>
+        <w:t xml:space="preserve">Replaced manual</w:t>
+      </w:r>
+      <w:r>
+        <w:t xml:space="preserve"> </w:t>
+      </w:r>
+      <w:r>
+        <w:rPr>
+          <w:rStyle w:val="VerbatimChar"/>
+        </w:rPr>
+        <w:t xml:space="preserve">git clone</w:t>
+      </w:r>
+      <w:r>
+        <w:t xml:space="preserve"> </w:t>
+      </w:r>
+      <w:r>
+        <w:t xml:space="preserve">+</w:t>
+      </w:r>
+      <w:r>
+        <w:t xml:space="preserve"> </w:t>
+      </w:r>
+      <w:r>
+        <w:rPr>
+          <w:rStyle w:val="VerbatimChar"/>
+        </w:rPr>
+        <w:t xml:space="preserve">./install.sh</w:t>
+      </w:r>
+      <w:r>
+        <w:t xml:space="preserve"> </w:t>
+      </w:r>
+      <w:r>
+        <w:t xml:space="preserve">steps in Chapter 6 with one-liner</w:t>
+      </w:r>
+      <w:r>
+        <w:t xml:space="preserve"> </w:t>
+      </w:r>
+      <w:r>
+        <w:rPr>
+          <w:rStyle w:val="VerbatimChar"/>
+        </w:rPr>
+        <w:t xml:space="preserve">curl | bash</w:t>
+      </w:r>
+      <w:r>
+        <w:t xml:space="preserve"> </w:t>
+      </w:r>
+      <w:r>
+        <w:t xml:space="preserve">command.</w:t>
+      </w:r>
     </w:p>
     <w:p>
       <w:pPr>

</xml_diff>

<commit_message>
v3.4.0: Optional install prompts, remove LTeX, update docs
install.sh:
- opencode skills and VS Code are now optional prompts (default yes)
- One-liner detects existing installation, shows version, prompts to update
- Uses absolute paths to prevent nested clones
- Removed LTeX extension (was failing, added noise)

uninstall.sh:
- Added one-liner support (curl | bash)
- Added 'Remove 100%' nuclear option (option 4)
- Removed LTeX uninstall line

Documentation:
- README.md: Updated Quick start and Uninstalling sections
- setup-guide.tex: Chapter 6 (optional prompts, update detection),
  Chapter 7 (one-liner update/uninstall, full menu docs), changelog
- CHANGELOG.md: v3.4.0 entry
- guide.cls / technical.cls: Bumped to v3.4.0
</commit_message>
<xml_diff>
--- a/setup-guide/setup-guide.docx
+++ b/setup-guide/setup-guide.docx
@@ -70,7 +70,7 @@
         <w:pStyle w:val="CoverMeta"/>
       </w:pPr>
       <w:r>
-        <w:t xml:space="preserve">v3.3.2</w:t>
+        <w:t xml:space="preserve">v3.4.0</w:t>
       </w:r>
     </w:p>
     <w:p>
@@ -10942,34 +10942,121 @@
               <w:t xml:space="preserve"> </w:t>
             </w:r>
             <w:r>
-              <w:t xml:space="preserve">the opencode skills, and configures VS Code LaTeX Workshop. It is idempotent</w:t>
+              <w:t xml:space="preserve">the opencode skills, and configures VS Code LaTeX Workshop. When run</w:t>
             </w:r>
             <w:r>
               <w:t xml:space="preserve"> </w:t>
             </w:r>
             <w:r>
-              <w:t xml:space="preserve">— safe to re-run. It runs</w:t>
+              <w:t xml:space="preserve">interactively (</w:t>
+            </w:r>
+            <w:r>
+              <w:rPr>
+                <w:rStyle w:val="VerbatimChar"/>
+              </w:rPr>
+              <w:t xml:space="preserve">./install.sh</w:t>
+            </w:r>
+            <w:r>
+              <w:t xml:space="preserve">), it prompts for optional components</w:t>
             </w:r>
             <w:r>
               <w:t xml:space="preserve"> </w:t>
             </w:r>
             <w:r>
+              <w:t xml:space="preserve">(skills and VS Code — both default to yes). When run via one-liner, all</w:t>
+            </w:r>
+            <w:r>
+              <w:t xml:space="preserve"> </w:t>
+            </w:r>
+            <w:r>
+              <w:t xml:space="preserve">components are installed automatically. It is idempotent — safe to re-run.</w:t>
+            </w:r>
+          </w:p>
+        </w:tc>
+      </w:tr>
+    </w:tbl>
+    <w:p>
+      <w:pPr>
+        <w:spacing w:before="120" w:after="0"/>
+      </w:pPr>
+    </w:p>
+    <w:tbl>
+      <w:tblPr>
+        <w:tblW w:w="9638" w:type="dxa"/>
+        <w:tblLayout w:type="fixed"/>
+        <w:tblBorders>
+          <w:top w:val="none" w:sz="0" w:space="0" w:color="auto"/>
+          <w:left w:val="single" w:sz="24" w:space="0" w:color="1565C0"/>
+          <w:bottom w:val="none" w:sz="0" w:space="0" w:color="auto"/>
+          <w:right w:val="none" w:sz="0" w:space="0" w:color="auto"/>
+        </w:tblBorders>
+        <w:tblCellMar>
+          <w:top w:w="120" w:type="dxa"/>
+          <w:left w:w="160" w:type="dxa"/>
+          <w:bottom w:w="120" w:type="dxa"/>
+          <w:right w:w="160" w:type="dxa"/>
+        </w:tblCellMar>
+      </w:tblPr>
+      <w:tr>
+        <w:tc>
+          <w:tcPr>
+            <w:tcW w:w="9638" w:type="dxa"/>
+            <w:shd w:val="clear" w:color="auto" w:fill="E3F2FD"/>
+          </w:tcPr>
+          <w:p>
+            <w:r>
+              <w:rPr>
+                <w:rFonts w:ascii="HarmonyOS Sans" w:hAnsi="HarmonyOS Sans"/>
+                <w:b/>
+                <w:color w:val="1565C0"/>
+                <w:sz w:val="21"/>
+                <w:szCs w:val="21"/>
+              </w:rPr>
+              <w:t>Info</w:t>
+            </w:r>
+          </w:p>
+          <w:p>
+            <w:pPr>
+              <w:numPr>
+                <w:ilvl w:val="0"/>
+                <w:numId w:val="1000"/>
+              </w:numPr>
+            </w:pPr>
+            <w:r>
+              <w:t xml:space="preserve">If an existing installation is detected, the one-liner prompts to update:</w:t>
+            </w:r>
+            <w:r>
+              <w:t xml:space="preserve"> </w:t>
+            </w:r>
+            <w:r>
               <w:rPr>
                 <w:rStyle w:val="VerbatimChar"/>
               </w:rPr>
-              <w:t xml:space="preserve">apt-get install</w:t>
+              <w:t xml:space="preserve">Update v3.3.6 → v3.3.7? [Y/n]</w:t>
+            </w:r>
+            <w:r>
+              <w:t xml:space="preserve">. It pulls the latest version and</w:t>
             </w:r>
             <w:r>
               <w:t xml:space="preserve"> </w:t>
             </w:r>
             <w:r>
-              <w:t xml:space="preserve">for TeX Live packages;</w:t>
+              <w:t xml:space="preserve">re-runs the installer. No need to</w:t>
             </w:r>
             <w:r>
               <w:t xml:space="preserve"> </w:t>
             </w:r>
             <w:r>
-              <w:t xml:space="preserve">if you do not have sudo access, ask your administrator to install them.</w:t>
+              <w:rPr>
+                <w:rStyle w:val="VerbatimChar"/>
+              </w:rPr>
+              <w:t xml:space="preserve">git pull</w:t>
+            </w:r>
+            <w:r>
+              <w:t xml:space="preserve"> </w:t>
+            </w:r>
+            <w:r>
+              <w:t xml:space="preserve">manually.</w:t>
             </w:r>
           </w:p>
         </w:tc>
@@ -12905,7 +12992,13 @@
         </w:numPr>
       </w:pPr>
       <w:r>
-        <w:t xml:space="preserve">Pull the latest changes and re-run the installer (idempotent):</w:t>
+        <w:t xml:space="preserve">Re-run the one-liner — it detects the existing installation and</w:t>
+      </w:r>
+      <w:r>
+        <w:t xml:space="preserve"> </w:t>
+      </w:r>
+      <w:r>
+        <w:t xml:space="preserve">prompts to update:</w:t>
       </w:r>
     </w:p>
     <w:p>
@@ -12918,51 +13011,45 @@
       </w:pPr>
       <w:r>
         <w:rPr>
-          <w:rStyle w:val="BuiltInTok"/>
-        </w:rPr>
-        <w:t xml:space="preserve">cd</w:t>
+          <w:rStyle w:val="ExtensionTok"/>
+        </w:rPr>
+        <w:t xml:space="preserve">curl</w:t>
       </w:r>
       <w:r>
         <w:rPr>
           <w:rStyle w:val="NormalTok"/>
         </w:rPr>
-        <w:t xml:space="preserve"> /home/huawei-doc-templates</w:t>
-      </w:r>
-      <w:r>
-        <w:br/>
+        <w:t xml:space="preserve"> </w:t>
+      </w:r>
+      <w:r>
+        <w:rPr>
+          <w:rStyle w:val="AttributeTok"/>
+        </w:rPr>
+        <w:t xml:space="preserve">-fsSL</w:t>
+      </w:r>
+      <w:r>
+        <w:rPr>
+          <w:rStyle w:val="NormalTok"/>
+        </w:rPr>
+        <w:t xml:space="preserve"> https://raw.githubusercontent.com/wallacelw/huawei-doc-templates/main/install.sh </w:t>
+      </w:r>
+      <w:r>
+        <w:rPr>
+          <w:rStyle w:val="KeywordTok"/>
+        </w:rPr>
+        <w:t xml:space="preserve">|</w:t>
+      </w:r>
+      <w:r>
+        <w:rPr>
+          <w:rStyle w:val="NormalTok"/>
+        </w:rPr>
+        <w:t xml:space="preserve"> </w:t>
       </w:r>
       <w:r>
         <w:rPr>
           <w:rStyle w:val="FunctionTok"/>
         </w:rPr>
-        <w:t xml:space="preserve">git</w:t>
-      </w:r>
-      <w:r>
-        <w:rPr>
-          <w:rStyle w:val="NormalTok"/>
-        </w:rPr>
-        <w:t xml:space="preserve"> pull</w:t>
-      </w:r>
-      <w:r>
-        <w:br/>
-      </w:r>
-      <w:r>
-        <w:rPr>
-          <w:rStyle w:val="ExtensionTok"/>
-        </w:rPr>
-        <w:t xml:space="preserve">./install.sh</w:t>
-      </w:r>
-      <w:r>
-        <w:rPr>
-          <w:rStyle w:val="NormalTok"/>
-        </w:rPr>
-        <w:t xml:space="preserve"> </w:t>
-      </w:r>
-      <w:r>
-        <w:rPr>
-          <w:rStyle w:val="AttributeTok"/>
-        </w:rPr>
-        <w:t xml:space="preserve">--yes</w:t>
+        <w:t xml:space="preserve">bash</w:t>
       </w:r>
     </w:p>
     <w:p>
@@ -12973,7 +13060,22 @@
         </w:numPr>
       </w:pPr>
       <w:r>
-        <w:t xml:space="preserve">The installer skips components that are already up to date. New</w:t>
+        <w:t xml:space="preserve">The script pulls the latest version, shows the version change</w:t>
+      </w:r>
+      <w:r>
+        <w:t xml:space="preserve"> </w:t>
+      </w:r>
+      <w:r>
+        <w:t xml:space="preserve">(</w:t>
+      </w:r>
+      <w:r>
+        <w:rPr>
+          <w:rStyle w:val="VerbatimChar"/>
+        </w:rPr>
+        <w:t xml:space="preserve">v3.3.6 → v3.3.7</w:t>
+      </w:r>
+      <w:r>
+        <w:t xml:space="preserve">), and re-runs the installer. New</w:t>
       </w:r>
       <w:r>
         <w:t xml:space="preserve"> </w:t>
@@ -13233,7 +13335,7 @@
         </w:numPr>
       </w:pPr>
       <w:r>
-        <w:t xml:space="preserve">Run the uninstall script:</w:t>
+        <w:t xml:space="preserve">Run the uninstall script (interactive menu with 5 options):</w:t>
       </w:r>
     </w:p>
     <w:p>
@@ -13265,30 +13367,6 @@
         </w:rPr>
         <w:t xml:space="preserve">./uninstall.sh</w:t>
       </w:r>
-      <w:r>
-        <w:rPr>
-          <w:rStyle w:val="NormalTok"/>
-        </w:rPr>
-        <w:t xml:space="preserve"> </w:t>
-      </w:r>
-      <w:r>
-        <w:rPr>
-          <w:rStyle w:val="AttributeTok"/>
-        </w:rPr>
-        <w:t xml:space="preserve">--all</w:t>
-      </w:r>
-      <w:r>
-        <w:rPr>
-          <w:rStyle w:val="NormalTok"/>
-        </w:rPr>
-        <w:t xml:space="preserve"> </w:t>
-      </w:r>
-      <w:r>
-        <w:rPr>
-          <w:rStyle w:val="AttributeTok"/>
-        </w:rPr>
-        <w:t xml:space="preserve">--yes</w:t>
-      </w:r>
     </w:p>
     <w:p>
       <w:pPr>
@@ -13298,49 +13376,124 @@
         </w:numPr>
       </w:pPr>
       <w:r>
-        <w:t xml:space="preserve">This removes: opencode skills,</w:t>
-      </w:r>
-      <w:r>
-        <w:t xml:space="preserve"> </w:t>
-      </w:r>
-      <w:r>
-        <w:rPr>
-          <w:rStyle w:val="VerbatimChar"/>
-        </w:rPr>
-        <w:t xml:space="preserve">.sty</w:t>
-      </w:r>
-      <w:r>
-        <w:t xml:space="preserve"> </w:t>
-      </w:r>
-      <w:r>
-        <w:t xml:space="preserve">modules from TDS,</w:t>
-      </w:r>
-      <w:r>
-        <w:t xml:space="preserve"> </w:t>
-      </w:r>
-      <w:r>
-        <w:t xml:space="preserve">HarmonyOS Sans font,</w:t>
-      </w:r>
-      <w:r>
-        <w:t xml:space="preserve"> </w:t>
-      </w:r>
-      <w:r>
-        <w:rPr>
-          <w:rStyle w:val="VerbatimChar"/>
-        </w:rPr>
-        <w:t xml:space="preserve">/etc/LatexMk</w:t>
-      </w:r>
-      <w:r>
-        <w:t xml:space="preserve"> </w:t>
-      </w:r>
-      <w:r>
-        <w:t xml:space="preserve">fix, and VS Code</w:t>
-      </w:r>
-      <w:r>
-        <w:t xml:space="preserve"> </w:t>
-      </w:r>
-      <w:r>
-        <w:t xml:space="preserve">settings + extensions.</w:t>
+        <w:t xml:space="preserve">Or use the one-liner:</w:t>
+      </w:r>
+    </w:p>
+    <w:p>
+      <w:pPr>
+        <w:numPr>
+          <w:ilvl w:val="0"/>
+          <w:numId w:val="1000"/>
+        </w:numPr>
+        <w:pStyle w:val="SourceCode"/>
+      </w:pPr>
+      <w:r>
+        <w:rPr>
+          <w:rStyle w:val="ExtensionTok"/>
+        </w:rPr>
+        <w:t xml:space="preserve">curl</w:t>
+      </w:r>
+      <w:r>
+        <w:rPr>
+          <w:rStyle w:val="NormalTok"/>
+        </w:rPr>
+        <w:t xml:space="preserve"> </w:t>
+      </w:r>
+      <w:r>
+        <w:rPr>
+          <w:rStyle w:val="AttributeTok"/>
+        </w:rPr>
+        <w:t xml:space="preserve">-fsSL</w:t>
+      </w:r>
+      <w:r>
+        <w:rPr>
+          <w:rStyle w:val="NormalTok"/>
+        </w:rPr>
+        <w:t xml:space="preserve"> https://raw.githubusercontent.com/wallacelw/huawei-doc-templates/main/uninstall.sh </w:t>
+      </w:r>
+      <w:r>
+        <w:rPr>
+          <w:rStyle w:val="KeywordTok"/>
+        </w:rPr>
+        <w:t xml:space="preserve">|</w:t>
+      </w:r>
+      <w:r>
+        <w:rPr>
+          <w:rStyle w:val="NormalTok"/>
+        </w:rPr>
+        <w:t xml:space="preserve"> </w:t>
+      </w:r>
+      <w:r>
+        <w:rPr>
+          <w:rStyle w:val="FunctionTok"/>
+        </w:rPr>
+        <w:t xml:space="preserve">bash</w:t>
+      </w:r>
+    </w:p>
+    <w:p>
+      <w:pPr>
+        <w:numPr>
+          <w:ilvl w:val="0"/>
+          <w:numId w:val="1033"/>
+        </w:numPr>
+      </w:pPr>
+      <w:r>
+        <w:t xml:space="preserve">The interactive menu offers:</w:t>
+      </w:r>
+    </w:p>
+    <w:p>
+      <w:pPr>
+        <w:numPr>
+          <w:ilvl w:val="1"/>
+          <w:numId w:val="1034"/>
+        </w:numPr>
+      </w:pPr>
+      <w:r>
+        <w:t xml:space="preserve">Option 1: All installed components (skills, modules, font, VS Code)</w:t>
+      </w:r>
+    </w:p>
+    <w:p>
+      <w:pPr>
+        <w:numPr>
+          <w:ilvl w:val="1"/>
+          <w:numId w:val="1034"/>
+        </w:numPr>
+      </w:pPr>
+      <w:r>
+        <w:t xml:space="preserve">Option 2: Everything + apt packages (WARNING: breaks other TeX)</w:t>
+      </w:r>
+    </w:p>
+    <w:p>
+      <w:pPr>
+        <w:numPr>
+          <w:ilvl w:val="1"/>
+          <w:numId w:val="1034"/>
+        </w:numPr>
+      </w:pPr>
+      <w:r>
+        <w:t xml:space="preserve">Option 3: Delete repository directory (all files, guides, documents)</w:t>
+      </w:r>
+    </w:p>
+    <w:p>
+      <w:pPr>
+        <w:numPr>
+          <w:ilvl w:val="1"/>
+          <w:numId w:val="1034"/>
+        </w:numPr>
+      </w:pPr>
+      <w:r>
+        <w:t xml:space="preserve">Option 4: Remove 100% — everything + apt + repo (nuclear option)</w:t>
+      </w:r>
+    </w:p>
+    <w:p>
+      <w:pPr>
+        <w:numPr>
+          <w:ilvl w:val="1"/>
+          <w:numId w:val="1034"/>
+        </w:numPr>
+      </w:pPr>
+      <w:r>
+        <w:t xml:space="preserve">Option 5: Choose specific components individually</w:t>
       </w:r>
     </w:p>
     <w:p>
@@ -13573,7 +13726,7 @@
       <w:pPr>
         <w:numPr>
           <w:ilvl w:val="0"/>
-          <w:numId w:val="1034"/>
+          <w:numId w:val="1035"/>
         </w:numPr>
       </w:pPr>
       <w:r>
@@ -13597,7 +13750,7 @@
       <w:pPr>
         <w:numPr>
           <w:ilvl w:val="0"/>
-          <w:numId w:val="1034"/>
+          <w:numId w:val="1035"/>
         </w:numPr>
       </w:pPr>
       <w:r>
@@ -13655,7 +13808,7 @@
       <w:pPr>
         <w:numPr>
           <w:ilvl w:val="0"/>
-          <w:numId w:val="1034"/>
+          <w:numId w:val="1035"/>
         </w:numPr>
       </w:pPr>
       <w:r>
@@ -13672,7 +13825,7 @@
       <w:pPr>
         <w:numPr>
           <w:ilvl w:val="0"/>
-          <w:numId w:val="1034"/>
+          <w:numId w:val="1035"/>
         </w:numPr>
       </w:pPr>
       <w:r>
@@ -13724,7 +13877,7 @@
       <w:pPr>
         <w:numPr>
           <w:ilvl w:val="0"/>
-          <w:numId w:val="1034"/>
+          <w:numId w:val="1035"/>
         </w:numPr>
       </w:pPr>
       <w:r>
@@ -14503,7 +14656,7 @@
         <w:rPr>
           <w:b/>
         </w:rPr>
-        <w:t xml:space="preserve">3.3.2</w:t>
+        <w:t xml:space="preserve">3.4.0</w:t>
       </w:r>
       <w:r>
         <w:tab/>
@@ -14520,40 +14673,36 @@
         <w:pStyle w:val="BodyText"/>
       </w:pPr>
       <w:r>
-        <w:t xml:space="preserve">Replaced manual</w:t>
-      </w:r>
-      <w:r>
-        <w:t xml:space="preserve"> </w:t>
-      </w:r>
-      <w:r>
-        <w:rPr>
-          <w:rStyle w:val="VerbatimChar"/>
-        </w:rPr>
-        <w:t xml:space="preserve">git clone</w:t>
-      </w:r>
-      <w:r>
-        <w:t xml:space="preserve"> </w:t>
-      </w:r>
-      <w:r>
-        <w:t xml:space="preserve">+</w:t>
-      </w:r>
-      <w:r>
-        <w:t xml:space="preserve"> </w:t>
-      </w:r>
-      <w:r>
-        <w:rPr>
-          <w:rStyle w:val="VerbatimChar"/>
-        </w:rPr>
-        <w:t xml:space="preserve">./install.sh</w:t>
-      </w:r>
-      <w:r>
-        <w:t xml:space="preserve"> </w:t>
-      </w:r>
-      <w:r>
-        <w:t xml:space="preserve">steps in Chapter 6 with one-liner</w:t>
-      </w:r>
-      <w:r>
-        <w:t xml:space="preserve"> </w:t>
+        <w:rPr>
+          <w:rStyle w:val="VerbatimChar"/>
+        </w:rPr>
+        <w:t xml:space="preserve">install.sh</w:t>
+      </w:r>
+      <w:r>
+        <w:t xml:space="preserve">: opencode skills and VS Code LaTeX Workshop are now optional prompts (default yes). Removed LTeX extension (was failing to install). One-liner detects existing installation and prompts to update with version display (</w:t>
+      </w:r>
+      <w:r>
+        <w:rPr>
+          <w:rStyle w:val="VerbatimChar"/>
+        </w:rPr>
+        <w:t xml:space="preserve">v3.3.6 → v3.3.7</w:t>
+      </w:r>
+      <w:r>
+        <w:t xml:space="preserve">). Uses absolute paths to prevent nested clones.</w:t>
+      </w:r>
+    </w:p>
+    <w:p>
+      <w:pPr>
+        <w:pStyle w:val="BodyText"/>
+      </w:pPr>
+      <w:r>
+        <w:rPr>
+          <w:rStyle w:val="VerbatimChar"/>
+        </w:rPr>
+        <w:t xml:space="preserve">uninstall.sh</w:t>
+      </w:r>
+      <w:r>
+        <w:t xml:space="preserve">: Added one-liner support (</w:t>
       </w:r>
       <w:r>
         <w:rPr>
@@ -14562,10 +14711,48 @@
         <w:t xml:space="preserve">curl | bash</w:t>
       </w:r>
       <w:r>
-        <w:t xml:space="preserve"> </w:t>
-      </w:r>
-      <w:r>
-        <w:t xml:space="preserve">command.</w:t>
+        <w:t xml:space="preserve">). Added</w:t>
+      </w:r>
+      <w:r>
+        <w:t xml:space="preserve"> </w:t>
+      </w:r>
+      <w:r>
+        <w:t xml:space="preserve">“</w:t>
+      </w:r>
+      <w:r>
+        <w:t xml:space="preserve">Remove 100%</w:t>
+      </w:r>
+      <w:r>
+        <w:t xml:space="preserve">”</w:t>
+      </w:r>
+      <w:r>
+        <w:t xml:space="preserve"> </w:t>
+      </w:r>
+      <w:r>
+        <w:t xml:space="preserve">nuclear option (option 4) to interactive menu. Added</w:t>
+      </w:r>
+      <w:r>
+        <w:t xml:space="preserve"> </w:t>
+      </w:r>
+      <w:r>
+        <w:rPr>
+          <w:rStyle w:val="VerbatimChar"/>
+        </w:rPr>
+        <w:t xml:space="preserve">–repo</w:t>
+      </w:r>
+      <w:r>
+        <w:t xml:space="preserve"> </w:t>
+      </w:r>
+      <w:r>
+        <w:t xml:space="preserve">flag.</w:t>
+      </w:r>
+    </w:p>
+    <w:p>
+      <w:pPr>
+        <w:pStyle w:val="BodyText"/>
+      </w:pPr>
+      <w:r>
+        <w:t xml:space="preserve">Updated Chapter 6 with optional component prompts and update detection. Updated Chapter 7 with one-liner update/uninstall and full menu documentation.</w:t>
       </w:r>
     </w:p>
     <w:p>
@@ -17979,6 +18166,9 @@
     </w:lvlOverride>
   </w:num>
   <w:num w:numId="1034">
+    <w:abstractNumId w:val="991"/>
+  </w:num>
+  <w:num w:numId="1035">
     <w:abstractNumId w:val="99201"/>
     <w:lvlOverride w:ilvl="0">
       <w:startOverride w:val="1"/>

</xml_diff>

<commit_message>
v3.7.0: Add testbook template for POC/acceptance test cases
New template: templates/testbook/
- testbook.cls with testcase environment (Objective, Prerequisites,
  Procedure, Expected Result, Remarks, Test Result)
- [noanswers] class option to hide Remarks/Test Result (clean handouts)
- testbook-pandoc.lua with testcase env handler for DOCX/MD/HTML
- testbook-template.html with testcase-table CSS
- testbook-reference.docx (based on guide reference styles)
- SKILL.md (600 lines) with full command reference
- README.md with class options and quick example
- Samples: examples/testbook/pt/ + en/ (20 pages each)

Bug fixes:
- scripts/build.sh: Fix REPO_ROOT to go up from scripts/ to repo root
  (was broken since v3.5.0 move to scripts/)
- testbook-pandoc.lua: Fix trim() call (function was local to factory)

Version bumps:
- guide.cls, technical.cls, setup-guide.tex → v3.7.0
</commit_message>
<xml_diff>
--- a/setup-guide/setup-guide.docx
+++ b/setup-guide/setup-guide.docx
@@ -70,7 +70,7 @@
         <w:pStyle w:val="CoverMeta"/>
       </w:pPr>
       <w:r>
-        <w:t xml:space="preserve">v3.4.0</w:t>
+        <w:t xml:space="preserve">v3.7.0</w:t>
       </w:r>
     </w:p>
     <w:p>
@@ -10872,7 +10872,7 @@
         <w:rPr>
           <w:rStyle w:val="NormalTok"/>
         </w:rPr>
-        <w:t xml:space="preserve"> https://raw.githubusercontent.com/wallacelw/huawei-doc-templates/main/install.sh </w:t>
+        <w:t xml:space="preserve"> https://raw.githubusercontent.com/wallacelw/huawei-doc-templates/main/scripts/install.sh </w:t>
       </w:r>
       <w:r>
         <w:rPr>
@@ -10954,7 +10954,7 @@
               <w:rPr>
                 <w:rStyle w:val="VerbatimChar"/>
               </w:rPr>
-              <w:t xml:space="preserve">./install.sh</w:t>
+              <w:t xml:space="preserve">./scripts/install.sh</w:t>
             </w:r>
             <w:r>
               <w:t xml:space="preserve">), it prompts for optional components</w:t>
@@ -13031,7 +13031,7 @@
         <w:rPr>
           <w:rStyle w:val="NormalTok"/>
         </w:rPr>
-        <w:t xml:space="preserve"> https://raw.githubusercontent.com/wallacelw/huawei-doc-templates/main/install.sh </w:t>
+        <w:t xml:space="preserve"> https://raw.githubusercontent.com/wallacelw/huawei-doc-templates/main/scripts/install.sh </w:t>
       </w:r>
       <w:r>
         <w:rPr>
@@ -13365,7 +13365,7 @@
         <w:rPr>
           <w:rStyle w:val="ExtensionTok"/>
         </w:rPr>
-        <w:t xml:space="preserve">./uninstall.sh</w:t>
+        <w:t xml:space="preserve">./scripts/uninstall.sh</w:t>
       </w:r>
     </w:p>
     <w:p>
@@ -13409,7 +13409,7 @@
         <w:rPr>
           <w:rStyle w:val="NormalTok"/>
         </w:rPr>
-        <w:t xml:space="preserve"> https://raw.githubusercontent.com/wallacelw/huawei-doc-templates/main/uninstall.sh </w:t>
+        <w:t xml:space="preserve"> https://raw.githubusercontent.com/wallacelw/huawei-doc-templates/main/scripts/uninstall.sh </w:t>
       </w:r>
       <w:r>
         <w:rPr>
@@ -13519,7 +13519,7 @@
         <w:rPr>
           <w:rStyle w:val="ExtensionTok"/>
         </w:rPr>
-        <w:t xml:space="preserve">./uninstall.sh</w:t>
+        <w:t xml:space="preserve">./scripts/uninstall.sh</w:t>
       </w:r>
       <w:r>
         <w:rPr>
@@ -13569,7 +13569,7 @@
         <w:rPr>
           <w:rStyle w:val="ExtensionTok"/>
         </w:rPr>
-        <w:t xml:space="preserve">./uninstall.sh</w:t>
+        <w:t xml:space="preserve">./scripts/uninstall.sh</w:t>
       </w:r>
       <w:r>
         <w:rPr>
@@ -14163,7 +14163,7 @@
                 <w:sz w:val="18"/>
                 <w:szCs w:val="18"/>
               </w:rPr>
-              <w:t>`git pull &amp;&amp; ./install.sh`</w:t>
+              <w:t>`git pull &amp;&amp; ./scripts/install.sh`</w:t>
             </w:r>
           </w:p>
         </w:tc>
@@ -14275,7 +14275,7 @@
                 <w:sz w:val="18"/>
                 <w:szCs w:val="18"/>
               </w:rPr>
-              <w:t>`./uninstall.sh –all`</w:t>
+              <w:t>`./scripts/uninstall.sh –all`</w:t>
             </w:r>
           </w:p>
         </w:tc>
@@ -14656,7 +14656,7 @@
         <w:rPr>
           <w:b/>
         </w:rPr>
-        <w:t xml:space="preserve">3.4.0</w:t>
+        <w:t xml:space="preserve">3.7.0</w:t>
       </w:r>
       <w:r>
         <w:tab/>
@@ -14665,7 +14665,7 @@
         <w:rPr>
           <w:i/>
         </w:rPr>
-        <w:t xml:space="preserve">2026-09-11</w:t>
+        <w:t xml:space="preserve">2026-09-12</w:t>
       </w:r>
     </w:p>
     <w:p>
@@ -14673,86 +14673,52 @@
         <w:pStyle w:val="BodyText"/>
       </w:pPr>
       <w:r>
-        <w:rPr>
-          <w:rStyle w:val="VerbatimChar"/>
-        </w:rPr>
-        <w:t xml:space="preserve">install.sh</w:t>
-      </w:r>
-      <w:r>
-        <w:t xml:space="preserve">: opencode skills and VS Code LaTeX Workshop are now optional prompts (default yes). Removed LTeX extension (was failing to install). One-liner detects existing installation and prompts to update with version display (</w:t>
-      </w:r>
-      <w:r>
-        <w:rPr>
-          <w:rStyle w:val="VerbatimChar"/>
-        </w:rPr>
-        <w:t xml:space="preserve">v3.3.6 → v3.3.7</w:t>
-      </w:r>
-      <w:r>
-        <w:t xml:space="preserve">). Uses absolute paths to prevent nested clones.</w:t>
-      </w:r>
-    </w:p>
-    <w:p>
-      <w:pPr>
-        <w:pStyle w:val="BodyText"/>
-      </w:pPr>
-      <w:r>
-        <w:rPr>
-          <w:rStyle w:val="VerbatimChar"/>
-        </w:rPr>
-        <w:t xml:space="preserve">uninstall.sh</w:t>
-      </w:r>
-      <w:r>
-        <w:t xml:space="preserve">: Added one-liner support (</w:t>
-      </w:r>
-      <w:r>
-        <w:rPr>
-          <w:rStyle w:val="VerbatimChar"/>
-        </w:rPr>
-        <w:t xml:space="preserve">curl | bash</w:t>
-      </w:r>
-      <w:r>
-        <w:t xml:space="preserve">). Added</w:t>
-      </w:r>
-      <w:r>
-        <w:t xml:space="preserve"> </w:t>
-      </w:r>
-      <w:r>
-        <w:t xml:space="preserve">“</w:t>
-      </w:r>
-      <w:r>
-        <w:t xml:space="preserve">Remove 100%</w:t>
-      </w:r>
-      <w:r>
-        <w:t xml:space="preserve">”</w:t>
-      </w:r>
-      <w:r>
-        <w:t xml:space="preserve"> </w:t>
-      </w:r>
-      <w:r>
-        <w:t xml:space="preserve">nuclear option (option 4) to interactive menu. Added</w:t>
-      </w:r>
-      <w:r>
-        <w:t xml:space="preserve"> </w:t>
-      </w:r>
-      <w:r>
-        <w:rPr>
-          <w:rStyle w:val="VerbatimChar"/>
-        </w:rPr>
-        <w:t xml:space="preserve">–repo</w:t>
-      </w:r>
-      <w:r>
-        <w:t xml:space="preserve"> </w:t>
-      </w:r>
-      <w:r>
-        <w:t xml:space="preserve">flag.</w:t>
-      </w:r>
-    </w:p>
-    <w:p>
-      <w:pPr>
-        <w:pStyle w:val="BodyText"/>
-      </w:pPr>
-      <w:r>
-        <w:t xml:space="preserve">Updated Chapter 6 with optional component prompts and update detection. Updated Chapter 7 with one-liner update/uninstall and full menu documentation.</w:t>
+        <w:t xml:space="preserve">Added</w:t>
+      </w:r>
+      <w:r>
+        <w:t xml:space="preserve"> </w:t>
+      </w:r>
+      <w:r>
+        <w:rPr>
+          <w:rStyle w:val="VerbatimChar"/>
+        </w:rPr>
+        <w:t xml:space="preserve">testbook</w:t>
+      </w:r>
+      <w:r>
+        <w:t xml:space="preserve"> </w:t>
+      </w:r>
+      <w:r>
+        <w:t xml:space="preserve">template for POC/acceptance test case documents with</w:t>
+      </w:r>
+      <w:r>
+        <w:t xml:space="preserve"> </w:t>
+      </w:r>
+      <w:r>
+        <w:rPr>
+          <w:rStyle w:val="VerbatimChar"/>
+        </w:rPr>
+        <w:t xml:space="preserve">testcase</w:t>
+      </w:r>
+      <w:r>
+        <w:t xml:space="preserve"> </w:t>
+      </w:r>
+      <w:r>
+        <w:t xml:space="preserve">environment and</w:t>
+      </w:r>
+      <w:r>
+        <w:t xml:space="preserve"> </w:t>
+      </w:r>
+      <w:r>
+        <w:rPr>
+          <w:rStyle w:val="VerbatimChar"/>
+        </w:rPr>
+        <w:t xml:space="preserve">[noanswers]</w:t>
+      </w:r>
+      <w:r>
+        <w:t xml:space="preserve"> </w:t>
+      </w:r>
+      <w:r>
+        <w:t xml:space="preserve">option.</w:t>
       </w:r>
     </w:p>
     <w:p>
@@ -14765,7 +14731,7 @@
         <w:rPr>
           <w:b/>
         </w:rPr>
-        <w:t xml:space="preserve">3.3.0</w:t>
+        <w:t xml:space="preserve">3.6.0</w:t>
       </w:r>
       <w:r>
         <w:tab/>
@@ -14774,7 +14740,7 @@
         <w:rPr>
           <w:i/>
         </w:rPr>
-        <w:t xml:space="preserve">2026-09-11</w:t>
+        <w:t xml:space="preserve">2026-09-12</w:t>
       </w:r>
     </w:p>
     <w:p>
@@ -14782,73 +14748,52 @@
         <w:pStyle w:val="BodyText"/>
       </w:pPr>
       <w:r>
-        <w:t xml:space="preserve">Moved pre-compiled setup guide to</w:t>
-      </w:r>
-      <w:r>
-        <w:t xml:space="preserve"> </w:t>
-      </w:r>
-      <w:r>
-        <w:rPr>
-          <w:rStyle w:val="VerbatimChar"/>
-        </w:rPr>
-        <w:t xml:space="preserve">setup-guide/</w:t>
-      </w:r>
-      <w:r>
-        <w:t xml:space="preserve"> </w:t>
-      </w:r>
-      <w:r>
-        <w:t xml:space="preserve">folder in repo root with all four formats (PDF, MD, DOCX, HTML). Users can read these before cloning to understand the installation process.</w:t>
-      </w:r>
-    </w:p>
-    <w:p>
-      <w:pPr>
-        <w:pStyle w:val="BodyText"/>
-      </w:pPr>
-      <w:r>
-        <w:t xml:space="preserve">Updated Makefile</w:t>
-      </w:r>
-      <w:r>
-        <w:t xml:space="preserve"> </w:t>
-      </w:r>
-      <w:r>
-        <w:rPr>
-          <w:rStyle w:val="VerbatimChar"/>
-        </w:rPr>
-        <w:t xml:space="preserve">setup-guide</w:t>
-      </w:r>
-      <w:r>
-        <w:t xml:space="preserve"> </w:t>
-      </w:r>
-      <w:r>
-        <w:t xml:space="preserve">target to generate and copy all four formats.</w:t>
-      </w:r>
-    </w:p>
-    <w:p>
-      <w:pPr>
-        <w:pStyle w:val="BodyText"/>
-      </w:pPr>
-      <w:r>
-        <w:t xml:space="preserve">Updated README with pre-compiled setup guide section and format comparison table.</w:t>
-      </w:r>
-    </w:p>
-    <w:p>
-      <w:pPr>
-        <w:pStyle w:val="BodyText"/>
-      </w:pPr>
-      <w:r>
-        <w:t xml:space="preserve">Updated .gitignore to track all four formats in</w:t>
-      </w:r>
-      <w:r>
-        <w:t xml:space="preserve"> </w:t>
-      </w:r>
-      <w:r>
-        <w:rPr>
-          <w:rStyle w:val="VerbatimChar"/>
-        </w:rPr>
-        <w:t xml:space="preserve">setup-guide/</w:t>
-      </w:r>
-      <w:r>
-        <w:t xml:space="preserve">.</w:t>
+        <w:t xml:space="preserve">Added</w:t>
+      </w:r>
+      <w:r>
+        <w:t xml:space="preserve"> </w:t>
+      </w:r>
+      <w:r>
+        <w:rPr>
+          <w:rStyle w:val="VerbatimChar"/>
+        </w:rPr>
+        <w:t xml:space="preserve">\setdocauthors</w:t>
+      </w:r>
+      <w:r>
+        <w:t xml:space="preserve"> </w:t>
+      </w:r>
+      <w:r>
+        <w:t xml:space="preserve">command and</w:t>
+      </w:r>
+      <w:r>
+        <w:t xml:space="preserve"> </w:t>
+      </w:r>
+      <w:r>
+        <w:rPr>
+          <w:rStyle w:val="VerbatimChar"/>
+        </w:rPr>
+        <w:t xml:space="preserve">[noauthors]</w:t>
+      </w:r>
+      <w:r>
+        <w:t xml:space="preserve"> </w:t>
+      </w:r>
+      <w:r>
+        <w:t xml:space="preserve">class option to both templates. Authors are displayed on the cover page (optional — hidden if not set or if</w:t>
+      </w:r>
+      <w:r>
+        <w:t xml:space="preserve"> </w:t>
+      </w:r>
+      <w:r>
+        <w:rPr>
+          <w:rStyle w:val="VerbatimChar"/>
+        </w:rPr>
+        <w:t xml:space="preserve">[noauthors]</w:t>
+      </w:r>
+      <w:r>
+        <w:t xml:space="preserve"> </w:t>
+      </w:r>
+      <w:r>
+        <w:t xml:space="preserve">is passed). Demonstrated in all 4 samples.</w:t>
       </w:r>
     </w:p>
     <w:p>
@@ -14861,7 +14806,7 @@
         <w:rPr>
           <w:b/>
         </w:rPr>
-        <w:t xml:space="preserve">3.2.1</w:t>
+        <w:t xml:space="preserve">3.5.0</w:t>
       </w:r>
       <w:r>
         <w:tab/>
@@ -14870,7 +14815,7 @@
         <w:rPr>
           <w:i/>
         </w:rPr>
-        <w:t xml:space="preserve">2026-09-11</w:t>
+        <w:t xml:space="preserve">2026-09-12</w:t>
       </w:r>
     </w:p>
     <w:p>
@@ -14878,40 +14823,73 @@
         <w:pStyle w:val="BodyText"/>
       </w:pPr>
       <w:r>
-        <w:t xml:space="preserve">Renamed Chapter 7 from</w:t>
-      </w:r>
-      <w:r>
-        <w:t xml:space="preserve"> </w:t>
-      </w:r>
-      <w:r>
-        <w:t xml:space="preserve">“</w:t>
-      </w:r>
-      <w:r>
-        <w:t xml:space="preserve">Clean Up</w:t>
-      </w:r>
-      <w:r>
-        <w:t xml:space="preserve">”</w:t>
-      </w:r>
-      <w:r>
-        <w:t xml:space="preserve"> </w:t>
-      </w:r>
-      <w:r>
-        <w:t xml:space="preserve">to</w:t>
-      </w:r>
-      <w:r>
-        <w:t xml:space="preserve"> </w:t>
-      </w:r>
-      <w:r>
-        <w:t xml:space="preserve">“</w:t>
-      </w:r>
-      <w:r>
-        <w:t xml:space="preserve">Operations and Maintenance</w:t>
-      </w:r>
-      <w:r>
-        <w:t xml:space="preserve">”</w:t>
-      </w:r>
-      <w:r>
-        <w:t xml:space="preserve">. Added subsections for updating and uninstalling both the MaaS Gateway and the document templates. Added cloud resource cleanup as an optional subsection.</w:t>
+        <w:t xml:space="preserve">Reorganized project structure: moved</w:t>
+      </w:r>
+      <w:r>
+        <w:t xml:space="preserve"> </w:t>
+      </w:r>
+      <w:r>
+        <w:rPr>
+          <w:rStyle w:val="VerbatimChar"/>
+        </w:rPr>
+        <w:t xml:space="preserve">build.sh</w:t>
+      </w:r>
+      <w:r>
+        <w:t xml:space="preserve">,</w:t>
+      </w:r>
+      <w:r>
+        <w:t xml:space="preserve"> </w:t>
+      </w:r>
+      <w:r>
+        <w:rPr>
+          <w:rStyle w:val="VerbatimChar"/>
+        </w:rPr>
+        <w:t xml:space="preserve">install.sh</w:t>
+      </w:r>
+      <w:r>
+        <w:t xml:space="preserve">, and</w:t>
+      </w:r>
+      <w:r>
+        <w:t xml:space="preserve"> </w:t>
+      </w:r>
+      <w:r>
+        <w:rPr>
+          <w:rStyle w:val="VerbatimChar"/>
+        </w:rPr>
+        <w:t xml:space="preserve">uninstall.sh</w:t>
+      </w:r>
+      <w:r>
+        <w:t xml:space="preserve"> </w:t>
+      </w:r>
+      <w:r>
+        <w:t xml:space="preserve">from repo root to</w:t>
+      </w:r>
+      <w:r>
+        <w:t xml:space="preserve"> </w:t>
+      </w:r>
+      <w:r>
+        <w:rPr>
+          <w:rStyle w:val="VerbatimChar"/>
+        </w:rPr>
+        <w:t xml:space="preserve">scripts/</w:t>
+      </w:r>
+      <w:r>
+        <w:t xml:space="preserve"> </w:t>
+      </w:r>
+      <w:r>
+        <w:t xml:space="preserve">directory. Updated all references in Makefile, README, AGENTS.md, SKILL.md, and setup guide. One-liner URLs now use</w:t>
+      </w:r>
+      <w:r>
+        <w:t xml:space="preserve"> </w:t>
+      </w:r>
+      <w:r>
+        <w:rPr>
+          <w:rStyle w:val="VerbatimChar"/>
+        </w:rPr>
+        <w:t xml:space="preserve">main/scripts/install.sh</w:t>
+      </w:r>
+      <w:r>
+        <w:t xml:space="preserve">.</w:t>
       </w:r>
     </w:p>
     <w:p>
@@ -14924,7 +14902,7 @@
         <w:rPr>
           <w:b/>
         </w:rPr>
-        <w:t xml:space="preserve">3.2.0</w:t>
+        <w:t xml:space="preserve">3.4.0</w:t>
       </w:r>
       <w:r>
         <w:tab/>
@@ -14933,7 +14911,7 @@
         <w:rPr>
           <w:i/>
         </w:rPr>
-        <w:t xml:space="preserve">2026-09-11</w:t>
+        <w:t xml:space="preserve">2026-09-12</w:t>
       </w:r>
     </w:p>
     <w:p>
@@ -14941,11 +14919,28 @@
         <w:pStyle w:val="BodyText"/>
       </w:pPr>
       <w:r>
-        <w:t xml:space="preserve">Added</w:t>
-      </w:r>
-      <w:r>
-        <w:t xml:space="preserve"> </w:t>
-      </w:r>
+        <w:rPr>
+          <w:rStyle w:val="VerbatimChar"/>
+        </w:rPr>
+        <w:t xml:space="preserve">install.sh</w:t>
+      </w:r>
+      <w:r>
+        <w:t xml:space="preserve">: opencode skills and VS Code LaTeX Workshop are now optional prompts (default yes). Removed LTeX extension (was failing to install). One-liner detects existing installation and prompts to update with version display (</w:t>
+      </w:r>
+      <w:r>
+        <w:rPr>
+          <w:rStyle w:val="VerbatimChar"/>
+        </w:rPr>
+        <w:t xml:space="preserve">v3.3.6 → v3.3.7</w:t>
+      </w:r>
+      <w:r>
+        <w:t xml:space="preserve">). Uses absolute paths to prevent nested clones.</w:t>
+      </w:r>
+    </w:p>
+    <w:p>
+      <w:pPr>
+        <w:pStyle w:val="BodyText"/>
+      </w:pPr>
       <w:r>
         <w:rPr>
           <w:rStyle w:val="VerbatimChar"/>
@@ -14953,49 +14948,49 @@
         <w:t xml:space="preserve">uninstall.sh</w:t>
       </w:r>
       <w:r>
-        <w:t xml:space="preserve"> </w:t>
-      </w:r>
-      <w:r>
-        <w:t xml:space="preserve">script with interactive menu,</w:t>
-      </w:r>
-      <w:r>
-        <w:t xml:space="preserve"> </w:t>
-      </w:r>
-      <w:r>
-        <w:rPr>
-          <w:rStyle w:val="VerbatimChar"/>
-        </w:rPr>
-        <w:t xml:space="preserve">–all</w:t>
-      </w:r>
-      <w:r>
-        <w:t xml:space="preserve">,</w:t>
-      </w:r>
-      <w:r>
-        <w:t xml:space="preserve"> </w:t>
-      </w:r>
-      <w:r>
-        <w:rPr>
-          <w:rStyle w:val="VerbatimChar"/>
-        </w:rPr>
-        <w:t xml:space="preserve">–yes</w:t>
-      </w:r>
-      <w:r>
-        <w:t xml:space="preserve">, and</w:t>
-      </w:r>
-      <w:r>
-        <w:t xml:space="preserve"> </w:t>
-      </w:r>
-      <w:r>
-        <w:rPr>
-          <w:rStyle w:val="VerbatimChar"/>
-        </w:rPr>
-        <w:t xml:space="preserve">–dry-run</w:t>
-      </w:r>
-      <w:r>
-        <w:t xml:space="preserve"> </w:t>
-      </w:r>
-      <w:r>
-        <w:t xml:space="preserve">flags. Removes opencode skills, .sty modules, HarmonyOS Sans font, /etc/LatexMk fix, and VS Code settings.</w:t>
+        <w:t xml:space="preserve">: Added one-liner support (</w:t>
+      </w:r>
+      <w:r>
+        <w:rPr>
+          <w:rStyle w:val="VerbatimChar"/>
+        </w:rPr>
+        <w:t xml:space="preserve">curl | bash</w:t>
+      </w:r>
+      <w:r>
+        <w:t xml:space="preserve">). Added</w:t>
+      </w:r>
+      <w:r>
+        <w:t xml:space="preserve"> </w:t>
+      </w:r>
+      <w:r>
+        <w:t xml:space="preserve">“</w:t>
+      </w:r>
+      <w:r>
+        <w:t xml:space="preserve">Remove 100%</w:t>
+      </w:r>
+      <w:r>
+        <w:t xml:space="preserve">”</w:t>
+      </w:r>
+      <w:r>
+        <w:t xml:space="preserve"> </w:t>
+      </w:r>
+      <w:r>
+        <w:t xml:space="preserve">nuclear option (option 4) to interactive menu. Added</w:t>
+      </w:r>
+      <w:r>
+        <w:t xml:space="preserve"> </w:t>
+      </w:r>
+      <w:r>
+        <w:rPr>
+          <w:rStyle w:val="VerbatimChar"/>
+        </w:rPr>
+        <w:t xml:space="preserve">–repo</w:t>
+      </w:r>
+      <w:r>
+        <w:t xml:space="preserve"> </w:t>
+      </w:r>
+      <w:r>
+        <w:t xml:space="preserve">flag.</w:t>
       </w:r>
     </w:p>
     <w:p>
@@ -15003,48 +14998,7 @@
         <w:pStyle w:val="BodyText"/>
       </w:pPr>
       <w:r>
-        <w:t xml:space="preserve">Fixed</w:t>
-      </w:r>
-      <w:r>
-        <w:t xml:space="preserve"> </w:t>
-      </w:r>
-      <w:r>
-        <w:rPr>
-          <w:rStyle w:val="VerbatimChar"/>
-        </w:rPr>
-        <w:t xml:space="preserve">install.sh</w:t>
-      </w:r>
-      <w:r>
-        <w:t xml:space="preserve">: show apt-get output (was hidden), suppress fvextra build noise, fix font detection (</w:t>
-      </w:r>
-      <w:r>
-        <w:rPr>
-          <w:rStyle w:val="VerbatimChar"/>
-        </w:rPr>
-        <w:t xml:space="preserve">fc-list : family</w:t>
-      </w:r>
-      <w:r>
-        <w:t xml:space="preserve">), fix test compilation paths (</w:t>
-      </w:r>
-      <w:r>
-        <w:rPr>
-          <w:rStyle w:val="VerbatimChar"/>
-        </w:rPr>
-        <w:t xml:space="preserve">src/</w:t>
-      </w:r>
-      <w:r>
-        <w:t xml:space="preserve"> </w:t>
-      </w:r>
-      <w:r>
-        <w:t xml:space="preserve">subdirectory), fix LTeX extension success/failure reporting.</w:t>
-      </w:r>
-    </w:p>
-    <w:p>
-      <w:pPr>
-        <w:pStyle w:val="BodyText"/>
-      </w:pPr>
-      <w:r>
-        <w:t xml:space="preserve">Updated Chapter 7 with uninstall instructions.</w:t>
+        <w:t xml:space="preserve">Updated Chapter 6 with optional component prompts and update detection. Updated Chapter 7 with one-liner update/uninstall and full menu documentation.</w:t>
       </w:r>
     </w:p>
     <w:p>
@@ -15057,7 +15011,7 @@
         <w:rPr>
           <w:b/>
         </w:rPr>
-        <w:t xml:space="preserve">3.1.2</w:t>
+        <w:t xml:space="preserve">3.3.0</w:t>
       </w:r>
       <w:r>
         <w:tab/>
@@ -15066,7 +15020,7 @@
         <w:rPr>
           <w:i/>
         </w:rPr>
-        <w:t xml:space="preserve">2026-09-11</w:t>
+        <w:t xml:space="preserve">2026-09-12</w:t>
       </w:r>
     </w:p>
     <w:p>
@@ -15074,7 +15028,73 @@
         <w:pStyle w:val="BodyText"/>
       </w:pPr>
       <w:r>
-        <w:t xml:space="preserve">Added output format guide to README.md: comparison table of PDF, Markdown, DOCX, and HTML with purpose, copy-paste quality, and limitations. Recommends Markdown for copy-paste.</w:t>
+        <w:t xml:space="preserve">Moved pre-compiled setup guide to</w:t>
+      </w:r>
+      <w:r>
+        <w:t xml:space="preserve"> </w:t>
+      </w:r>
+      <w:r>
+        <w:rPr>
+          <w:rStyle w:val="VerbatimChar"/>
+        </w:rPr>
+        <w:t xml:space="preserve">setup-guide/</w:t>
+      </w:r>
+      <w:r>
+        <w:t xml:space="preserve"> </w:t>
+      </w:r>
+      <w:r>
+        <w:t xml:space="preserve">folder in repo root with all four formats (PDF, MD, DOCX, HTML). Users can read these before cloning to understand the installation process.</w:t>
+      </w:r>
+    </w:p>
+    <w:p>
+      <w:pPr>
+        <w:pStyle w:val="BodyText"/>
+      </w:pPr>
+      <w:r>
+        <w:t xml:space="preserve">Updated Makefile</w:t>
+      </w:r>
+      <w:r>
+        <w:t xml:space="preserve"> </w:t>
+      </w:r>
+      <w:r>
+        <w:rPr>
+          <w:rStyle w:val="VerbatimChar"/>
+        </w:rPr>
+        <w:t xml:space="preserve">setup-guide</w:t>
+      </w:r>
+      <w:r>
+        <w:t xml:space="preserve"> </w:t>
+      </w:r>
+      <w:r>
+        <w:t xml:space="preserve">target to generate and copy all four formats.</w:t>
+      </w:r>
+    </w:p>
+    <w:p>
+      <w:pPr>
+        <w:pStyle w:val="BodyText"/>
+      </w:pPr>
+      <w:r>
+        <w:t xml:space="preserve">Updated README with pre-compiled setup guide section and format comparison table.</w:t>
+      </w:r>
+    </w:p>
+    <w:p>
+      <w:pPr>
+        <w:pStyle w:val="BodyText"/>
+      </w:pPr>
+      <w:r>
+        <w:t xml:space="preserve">Updated .gitignore to track all four formats in</w:t>
+      </w:r>
+      <w:r>
+        <w:t xml:space="preserve"> </w:t>
+      </w:r>
+      <w:r>
+        <w:rPr>
+          <w:rStyle w:val="VerbatimChar"/>
+        </w:rPr>
+        <w:t xml:space="preserve">setup-guide/</w:t>
+      </w:r>
+      <w:r>
+        <w:t xml:space="preserve">.</w:t>
       </w:r>
     </w:p>
     <w:p>
@@ -15087,7 +15107,7 @@
         <w:rPr>
           <w:b/>
         </w:rPr>
-        <w:t xml:space="preserve">3.1.1</w:t>
+        <w:t xml:space="preserve">3.2.1</w:t>
       </w:r>
       <w:r>
         <w:tab/>
@@ -15096,7 +15116,7 @@
         <w:rPr>
           <w:i/>
         </w:rPr>
-        <w:t xml:space="preserve">2026-09-11</w:t>
+        <w:t xml:space="preserve">2026-09-12</w:t>
       </w:r>
     </w:p>
     <w:p>
@@ -15104,62 +15124,40 @@
         <w:pStyle w:val="BodyText"/>
       </w:pPr>
       <w:r>
-        <w:t xml:space="preserve">Updated MaaS Gateway chapter to v1.10.9: non-interactive mode (</w:t>
-      </w:r>
-      <w:r>
-        <w:rPr>
-          <w:rStyle w:val="VerbatimChar"/>
-        </w:rPr>
-        <w:t xml:space="preserve">-y</w:t>
-      </w:r>
-      <w:r>
-        <w:t xml:space="preserve">) now suppresses all prompts (prerequisites, tool selection, skill install).</w:t>
-      </w:r>
-    </w:p>
-    <w:p>
-      <w:pPr>
-        <w:pStyle w:val="BodyText"/>
-      </w:pPr>
-      <w:r>
-        <w:t xml:space="preserve">Changed project clone path from</w:t>
-      </w:r>
-      <w:r>
-        <w:t xml:space="preserve"> </w:t>
-      </w:r>
-      <w:r>
-        <w:rPr>
-          <w:rStyle w:val="VerbatimChar"/>
-        </w:rPr>
-        <w:t xml:space="preserve">~</w:t>
-      </w:r>
-      <w:r>
-        <w:t xml:space="preserve"> </w:t>
-      </w:r>
-      <w:r>
-        <w:t xml:space="preserve">(root home) to</w:t>
-      </w:r>
-      <w:r>
-        <w:t xml:space="preserve"> </w:t>
-      </w:r>
-      <w:r>
-        <w:rPr>
-          <w:rStyle w:val="VerbatimChar"/>
-        </w:rPr>
-        <w:t xml:space="preserve">/home</w:t>
-      </w:r>
-      <w:r>
-        <w:t xml:space="preserve"> </w:t>
-      </w:r>
-      <w:r>
-        <w:t xml:space="preserve">as default working directory.</w:t>
-      </w:r>
-    </w:p>
-    <w:p>
-      <w:pPr>
-        <w:pStyle w:val="BodyText"/>
-      </w:pPr>
-      <w:r>
-        <w:t xml:space="preserve">Added project standards to AGENTS.md: workflow, end-to-end validation, code style, git conventions, when unsure.</w:t>
+        <w:t xml:space="preserve">Renamed Chapter 7 from</w:t>
+      </w:r>
+      <w:r>
+        <w:t xml:space="preserve"> </w:t>
+      </w:r>
+      <w:r>
+        <w:t xml:space="preserve">“</w:t>
+      </w:r>
+      <w:r>
+        <w:t xml:space="preserve">Clean Up</w:t>
+      </w:r>
+      <w:r>
+        <w:t xml:space="preserve">”</w:t>
+      </w:r>
+      <w:r>
+        <w:t xml:space="preserve"> </w:t>
+      </w:r>
+      <w:r>
+        <w:t xml:space="preserve">to</w:t>
+      </w:r>
+      <w:r>
+        <w:t xml:space="preserve"> </w:t>
+      </w:r>
+      <w:r>
+        <w:t xml:space="preserve">“</w:t>
+      </w:r>
+      <w:r>
+        <w:t xml:space="preserve">Operations and Maintenance</w:t>
+      </w:r>
+      <w:r>
+        <w:t xml:space="preserve">”</w:t>
+      </w:r>
+      <w:r>
+        <w:t xml:space="preserve">. Added subsections for updating and uninstalling both the MaaS Gateway and the document templates. Added cloud resource cleanup as an optional subsection.</w:t>
       </w:r>
     </w:p>
     <w:p>
@@ -15172,7 +15170,7 @@
         <w:rPr>
           <w:b/>
         </w:rPr>
-        <w:t xml:space="preserve">3.1.0</w:t>
+        <w:t xml:space="preserve">3.2.0</w:t>
       </w:r>
       <w:r>
         <w:tab/>
@@ -15181,7 +15179,7 @@
         <w:rPr>
           <w:i/>
         </w:rPr>
-        <w:t xml:space="preserve">2026-09-11</w:t>
+        <w:t xml:space="preserve">2026-09-12</w:t>
       </w:r>
     </w:p>
     <w:p>
@@ -15189,19 +15187,61 @@
         <w:pStyle w:val="BodyText"/>
       </w:pPr>
       <w:r>
-        <w:t xml:space="preserve">Switched from ECS to Flexus X instance (4 vCPU, 16 GB RAM via slider, flavor</w:t>
-      </w:r>
-      <w:r>
-        <w:t xml:space="preserve"> </w:t>
-      </w:r>
-      <w:r>
-        <w:rPr>
-          <w:rStyle w:val="VerbatimChar"/>
-        </w:rPr>
-        <w:t xml:space="preserve">x1.4u.16g</w:t>
-      </w:r>
-      <w:r>
-        <w:t xml:space="preserve">) — more cost-efficient and robust. Updated creation steps to match Flexus X console order: billing mode first, vCPU/RAM slider (no flavor dropdown), Cloud Eye monitoring (recommended), then instance name and key pair login. Replaced screenshots with Flexus X console images.</w:t>
+        <w:t xml:space="preserve">Added</w:t>
+      </w:r>
+      <w:r>
+        <w:t xml:space="preserve"> </w:t>
+      </w:r>
+      <w:r>
+        <w:rPr>
+          <w:rStyle w:val="VerbatimChar"/>
+        </w:rPr>
+        <w:t xml:space="preserve">uninstall.sh</w:t>
+      </w:r>
+      <w:r>
+        <w:t xml:space="preserve"> </w:t>
+      </w:r>
+      <w:r>
+        <w:t xml:space="preserve">script with interactive menu,</w:t>
+      </w:r>
+      <w:r>
+        <w:t xml:space="preserve"> </w:t>
+      </w:r>
+      <w:r>
+        <w:rPr>
+          <w:rStyle w:val="VerbatimChar"/>
+        </w:rPr>
+        <w:t xml:space="preserve">–all</w:t>
+      </w:r>
+      <w:r>
+        <w:t xml:space="preserve">,</w:t>
+      </w:r>
+      <w:r>
+        <w:t xml:space="preserve"> </w:t>
+      </w:r>
+      <w:r>
+        <w:rPr>
+          <w:rStyle w:val="VerbatimChar"/>
+        </w:rPr>
+        <w:t xml:space="preserve">–yes</w:t>
+      </w:r>
+      <w:r>
+        <w:t xml:space="preserve">, and</w:t>
+      </w:r>
+      <w:r>
+        <w:t xml:space="preserve"> </w:t>
+      </w:r>
+      <w:r>
+        <w:rPr>
+          <w:rStyle w:val="VerbatimChar"/>
+        </w:rPr>
+        <w:t xml:space="preserve">–dry-run</w:t>
+      </w:r>
+      <w:r>
+        <w:t xml:space="preserve"> </w:t>
+      </w:r>
+      <w:r>
+        <w:t xml:space="preserve">flags. Removes opencode skills, .sty modules, HarmonyOS Sans font, /etc/LatexMk fix, and VS Code settings.</w:t>
       </w:r>
     </w:p>
     <w:p>
@@ -15209,37 +15249,40 @@
         <w:pStyle w:val="BodyText"/>
       </w:pPr>
       <w:r>
-        <w:t xml:space="preserve">Rewrote Chapter 3: switched from</w:t>
-      </w:r>
-      <w:r>
-        <w:t xml:space="preserve"> </w:t>
-      </w:r>
-      <w:r>
-        <w:rPr>
-          <w:rStyle w:val="VerbatimChar"/>
-        </w:rPr>
-        <w:t xml:space="preserve">connect.exe</w:t>
-      </w:r>
-      <w:r>
-        <w:t xml:space="preserve"> </w:t>
-      </w:r>
-      <w:r>
-        <w:t xml:space="preserve">to</w:t>
-      </w:r>
-      <w:r>
-        <w:t xml:space="preserve"> </w:t>
-      </w:r>
-      <w:r>
-        <w:rPr>
-          <w:rStyle w:val="VerbatimChar"/>
-        </w:rPr>
-        <w:t xml:space="preserve">ncat</w:t>
-      </w:r>
-      <w:r>
-        <w:t xml:space="preserve"> </w:t>
-      </w:r>
-      <w:r>
-        <w:t xml:space="preserve">(from Nmap) as the SSH ProxyCommand. Added explanation of HTTP CONNECT method, why port 4444 works, why ncat is chosen, ncat installation with antivirus exclusions, flag reference table, and improved keepalive settings.</w:t>
+        <w:t xml:space="preserve">Fixed</w:t>
+      </w:r>
+      <w:r>
+        <w:t xml:space="preserve"> </w:t>
+      </w:r>
+      <w:r>
+        <w:rPr>
+          <w:rStyle w:val="VerbatimChar"/>
+        </w:rPr>
+        <w:t xml:space="preserve">install.sh</w:t>
+      </w:r>
+      <w:r>
+        <w:t xml:space="preserve">: show apt-get output (was hidden), suppress fvextra build noise, fix font detection (</w:t>
+      </w:r>
+      <w:r>
+        <w:rPr>
+          <w:rStyle w:val="VerbatimChar"/>
+        </w:rPr>
+        <w:t xml:space="preserve">fc-list : family</w:t>
+      </w:r>
+      <w:r>
+        <w:t xml:space="preserve">), fix test compilation paths (</w:t>
+      </w:r>
+      <w:r>
+        <w:rPr>
+          <w:rStyle w:val="VerbatimChar"/>
+        </w:rPr>
+        <w:t xml:space="preserve">src/</w:t>
+      </w:r>
+      <w:r>
+        <w:t xml:space="preserve"> </w:t>
+      </w:r>
+      <w:r>
+        <w:t xml:space="preserve">subdirectory), fix LTeX extension success/failure reporting.</w:t>
       </w:r>
     </w:p>
     <w:p>
@@ -15247,23 +15290,7 @@
         <w:pStyle w:val="BodyText"/>
       </w:pPr>
       <w:r>
-        <w:t xml:space="preserve">Restructured chapters: moved SSH config and VS Code connection to new Chapter 4 (Install VS Code and Connect via Remote-SSH). Chapters 5–7 renumbered.</w:t>
-      </w:r>
-    </w:p>
-    <w:p>
-      <w:pPr>
-        <w:pStyle w:val="BodyText"/>
-      </w:pPr>
-      <w:r>
-        <w:t xml:space="preserve">Added verification checklist tables to all 7 chapters.</w:t>
-      </w:r>
-    </w:p>
-    <w:p>
-      <w:pPr>
-        <w:pStyle w:val="BodyText"/>
-      </w:pPr>
-      <w:r>
-        <w:t xml:space="preserve">Added mandatory reboot warning in Chapter 2 (SSH port change). Added troubleshooting subsection in Chapter 4 with common SSH connection issues and ncat debugging commands.</w:t>
+        <w:t xml:space="preserve">Updated Chapter 7 with uninstall instructions.</w:t>
       </w:r>
     </w:p>
     <w:p>
@@ -15276,7 +15303,7 @@
         <w:rPr>
           <w:b/>
         </w:rPr>
-        <w:t xml:space="preserve">3.0.1</w:t>
+        <w:t xml:space="preserve">3.1.2</w:t>
       </w:r>
       <w:r>
         <w:tab/>
@@ -15285,7 +15312,7 @@
         <w:rPr>
           <w:i/>
         </w:rPr>
-        <w:t xml:space="preserve">2026-09-11</w:t>
+        <w:t xml:space="preserve">2026-09-12</w:t>
       </w:r>
     </w:p>
     <w:p>
@@ -15293,7 +15320,7 @@
         <w:pStyle w:val="BodyText"/>
       </w:pPr>
       <w:r>
-        <w:t xml:space="preserve">Minor fixes: test-filter.sh auto-discovery, build.sh help text, Makefile aggregate descriptions, 5-section comment correction, CHANGELOG version gap note, callout-in-code fix, CI font auto-discovery, dofile path comment, test-sync.sh header.</w:t>
+        <w:t xml:space="preserve">Added output format guide to README.md: comparison table of PDF, Markdown, DOCX, and HTML with purpose, copy-paste quality, and limitations. Recommends Markdown for copy-paste.</w:t>
       </w:r>
     </w:p>
     <w:p>
@@ -15306,7 +15333,7 @@
         <w:rPr>
           <w:b/>
         </w:rPr>
-        <w:t xml:space="preserve">3.0.0</w:t>
+        <w:t xml:space="preserve">3.1.1</w:t>
       </w:r>
       <w:r>
         <w:tab/>
@@ -15315,7 +15342,7 @@
         <w:rPr>
           <w:i/>
         </w:rPr>
-        <w:t xml:space="preserve">2026-09-11</w:t>
+        <w:t xml:space="preserve">2026-09-12</w:t>
       </w:r>
     </w:p>
     <w:p>
@@ -15323,7 +15350,62 @@
         <w:pStyle w:val="BodyText"/>
       </w:pPr>
       <w:r>
-        <w:t xml:space="preserve">Modular pipeline refactoring: shared Lua filter factory, shared DOCX fix logic, build system auto-discovery, unified format pipeline, GitHub Actions CI.</w:t>
+        <w:t xml:space="preserve">Updated MaaS Gateway chapter to v1.10.9: non-interactive mode (</w:t>
+      </w:r>
+      <w:r>
+        <w:rPr>
+          <w:rStyle w:val="VerbatimChar"/>
+        </w:rPr>
+        <w:t xml:space="preserve">-y</w:t>
+      </w:r>
+      <w:r>
+        <w:t xml:space="preserve">) now suppresses all prompts (prerequisites, tool selection, skill install).</w:t>
+      </w:r>
+    </w:p>
+    <w:p>
+      <w:pPr>
+        <w:pStyle w:val="BodyText"/>
+      </w:pPr>
+      <w:r>
+        <w:t xml:space="preserve">Changed project clone path from</w:t>
+      </w:r>
+      <w:r>
+        <w:t xml:space="preserve"> </w:t>
+      </w:r>
+      <w:r>
+        <w:rPr>
+          <w:rStyle w:val="VerbatimChar"/>
+        </w:rPr>
+        <w:t xml:space="preserve">~</w:t>
+      </w:r>
+      <w:r>
+        <w:t xml:space="preserve"> </w:t>
+      </w:r>
+      <w:r>
+        <w:t xml:space="preserve">(root home) to</w:t>
+      </w:r>
+      <w:r>
+        <w:t xml:space="preserve"> </w:t>
+      </w:r>
+      <w:r>
+        <w:rPr>
+          <w:rStyle w:val="VerbatimChar"/>
+        </w:rPr>
+        <w:t xml:space="preserve">/home</w:t>
+      </w:r>
+      <w:r>
+        <w:t xml:space="preserve"> </w:t>
+      </w:r>
+      <w:r>
+        <w:t xml:space="preserve">as default working directory.</w:t>
+      </w:r>
+    </w:p>
+    <w:p>
+      <w:pPr>
+        <w:pStyle w:val="BodyText"/>
+      </w:pPr>
+      <w:r>
+        <w:t xml:space="preserve">Added project standards to AGENTS.md: workflow, end-to-end validation, code style, git conventions, when unsure.</w:t>
       </w:r>
     </w:p>
     <w:p>
@@ -15336,6 +15418,170 @@
         <w:rPr>
           <w:b/>
         </w:rPr>
+        <w:t xml:space="preserve">3.1.0</w:t>
+      </w:r>
+      <w:r>
+        <w:tab/>
+      </w:r>
+      <w:r>
+        <w:rPr>
+          <w:i/>
+        </w:rPr>
+        <w:t xml:space="preserve">2026-09-12</w:t>
+      </w:r>
+    </w:p>
+    <w:p>
+      <w:pPr>
+        <w:pStyle w:val="BodyText"/>
+      </w:pPr>
+      <w:r>
+        <w:t xml:space="preserve">Switched from ECS to Flexus X instance (4 vCPU, 16 GB RAM via slider, flavor</w:t>
+      </w:r>
+      <w:r>
+        <w:t xml:space="preserve"> </w:t>
+      </w:r>
+      <w:r>
+        <w:rPr>
+          <w:rStyle w:val="VerbatimChar"/>
+        </w:rPr>
+        <w:t xml:space="preserve">x1.4u.16g</w:t>
+      </w:r>
+      <w:r>
+        <w:t xml:space="preserve">) — more cost-efficient and robust. Updated creation steps to match Flexus X console order: billing mode first, vCPU/RAM slider (no flavor dropdown), Cloud Eye monitoring (recommended), then instance name and key pair login. Replaced screenshots with Flexus X console images.</w:t>
+      </w:r>
+    </w:p>
+    <w:p>
+      <w:pPr>
+        <w:pStyle w:val="BodyText"/>
+      </w:pPr>
+      <w:r>
+        <w:t xml:space="preserve">Rewrote Chapter 3: switched from</w:t>
+      </w:r>
+      <w:r>
+        <w:t xml:space="preserve"> </w:t>
+      </w:r>
+      <w:r>
+        <w:rPr>
+          <w:rStyle w:val="VerbatimChar"/>
+        </w:rPr>
+        <w:t xml:space="preserve">connect.exe</w:t>
+      </w:r>
+      <w:r>
+        <w:t xml:space="preserve"> </w:t>
+      </w:r>
+      <w:r>
+        <w:t xml:space="preserve">to</w:t>
+      </w:r>
+      <w:r>
+        <w:t xml:space="preserve"> </w:t>
+      </w:r>
+      <w:r>
+        <w:rPr>
+          <w:rStyle w:val="VerbatimChar"/>
+        </w:rPr>
+        <w:t xml:space="preserve">ncat</w:t>
+      </w:r>
+      <w:r>
+        <w:t xml:space="preserve"> </w:t>
+      </w:r>
+      <w:r>
+        <w:t xml:space="preserve">(from Nmap) as the SSH ProxyCommand. Added explanation of HTTP CONNECT method, why port 4444 works, why ncat is chosen, ncat installation with antivirus exclusions, flag reference table, and improved keepalive settings.</w:t>
+      </w:r>
+    </w:p>
+    <w:p>
+      <w:pPr>
+        <w:pStyle w:val="BodyText"/>
+      </w:pPr>
+      <w:r>
+        <w:t xml:space="preserve">Restructured chapters: moved SSH config and VS Code connection to new Chapter 4 (Install VS Code and Connect via Remote-SSH). Chapters 5–7 renumbered.</w:t>
+      </w:r>
+    </w:p>
+    <w:p>
+      <w:pPr>
+        <w:pStyle w:val="BodyText"/>
+      </w:pPr>
+      <w:r>
+        <w:t xml:space="preserve">Added verification checklist tables to all 7 chapters.</w:t>
+      </w:r>
+    </w:p>
+    <w:p>
+      <w:pPr>
+        <w:pStyle w:val="BodyText"/>
+      </w:pPr>
+      <w:r>
+        <w:t xml:space="preserve">Added mandatory reboot warning in Chapter 2 (SSH port change). Added troubleshooting subsection in Chapter 4 with common SSH connection issues and ncat debugging commands.</w:t>
+      </w:r>
+    </w:p>
+    <w:p>
+      <w:pPr>
+        <w:tabs>
+          <w:tab w:val="right" w:pos="9638"/>
+        </w:tabs>
+      </w:pPr>
+      <w:r>
+        <w:rPr>
+          <w:b/>
+        </w:rPr>
+        <w:t xml:space="preserve">3.0.1</w:t>
+      </w:r>
+      <w:r>
+        <w:tab/>
+      </w:r>
+      <w:r>
+        <w:rPr>
+          <w:i/>
+        </w:rPr>
+        <w:t xml:space="preserve">2026-09-12</w:t>
+      </w:r>
+    </w:p>
+    <w:p>
+      <w:pPr>
+        <w:pStyle w:val="BodyText"/>
+      </w:pPr>
+      <w:r>
+        <w:t xml:space="preserve">Minor fixes: test-filter.sh auto-discovery, build.sh help text, Makefile aggregate descriptions, 5-section comment correction, CHANGELOG version gap note, callout-in-code fix, CI font auto-discovery, dofile path comment, test-sync.sh header.</w:t>
+      </w:r>
+    </w:p>
+    <w:p>
+      <w:pPr>
+        <w:tabs>
+          <w:tab w:val="right" w:pos="9638"/>
+        </w:tabs>
+      </w:pPr>
+      <w:r>
+        <w:rPr>
+          <w:b/>
+        </w:rPr>
+        <w:t xml:space="preserve">3.0.0</w:t>
+      </w:r>
+      <w:r>
+        <w:tab/>
+      </w:r>
+      <w:r>
+        <w:rPr>
+          <w:i/>
+        </w:rPr>
+        <w:t xml:space="preserve">2026-09-12</w:t>
+      </w:r>
+    </w:p>
+    <w:p>
+      <w:pPr>
+        <w:pStyle w:val="BodyText"/>
+      </w:pPr>
+      <w:r>
+        <w:t xml:space="preserve">Modular pipeline refactoring: shared Lua filter factory, shared DOCX fix logic, build system auto-discovery, unified format pipeline, GitHub Actions CI.</w:t>
+      </w:r>
+    </w:p>
+    <w:p>
+      <w:pPr>
+        <w:tabs>
+          <w:tab w:val="right" w:pos="9638"/>
+        </w:tabs>
+      </w:pPr>
+      <w:r>
+        <w:rPr>
+          <w:b/>
+        </w:rPr>
         <w:t xml:space="preserve">2.16.0</w:t>
       </w:r>
       <w:r>
@@ -15345,7 +15591,7 @@
         <w:rPr>
           <w:i/>
         </w:rPr>
-        <w:t xml:space="preserve">2026-09-11</w:t>
+        <w:t xml:space="preserve">2026-09-12</w:t>
       </w:r>
     </w:p>
     <w:p>

</xml_diff>

<commit_message>
Add missing extended-keys-format csi-u to tmux config in setup guide
Without this setting, tmux doesn't use CSI-u encoding that opencode
recognizes for Shift+Enter. This was the root cause of Shift+Enter
not working in VS Code terminal → tmux → opencode.
</commit_message>
<xml_diff>
--- a/setup-guide/setup-guide.docx
+++ b/setup-guide/setup-guide.docx
@@ -13891,6 +13891,33 @@
           <w:rStyle w:val="StringTok"/>
         </w:rPr>
         <w:t xml:space="preserve">'xterm*:extkeys'</w:t>
+      </w:r>
+      <w:r>
+        <w:br/>
+      </w:r>
+      <w:r>
+        <w:rPr>
+          <w:rStyle w:val="BuiltInTok"/>
+        </w:rPr>
+        <w:t xml:space="preserve">set</w:t>
+      </w:r>
+      <w:r>
+        <w:rPr>
+          <w:rStyle w:val="NormalTok"/>
+        </w:rPr>
+        <w:t xml:space="preserve"> </w:t>
+      </w:r>
+      <w:r>
+        <w:rPr>
+          <w:rStyle w:val="AttributeTok"/>
+        </w:rPr>
+        <w:t xml:space="preserve">-g</w:t>
+      </w:r>
+      <w:r>
+        <w:rPr>
+          <w:rStyle w:val="NormalTok"/>
+        </w:rPr>
+        <w:t xml:space="preserve"> extended-keys-format csi-u</w:t>
       </w:r>
     </w:p>
     <w:p>

</xml_diff>

<commit_message>
Update tmux config section with upgrade instructions
- Note that extended-keys-format csi-u requires tmux 3.5+
- Add build-from-source instructions for upgrading tmux
- Add Ctrl+J fallback tip for older tmux versions
- Fix extended-keys to use -s flag (server option) instead of -g
</commit_message>
<xml_diff>
--- a/setup-guide/setup-guide.docx
+++ b/setup-guide/setup-guide.docx
@@ -13851,7 +13851,7 @@
         <w:rPr>
           <w:rStyle w:val="AttributeTok"/>
         </w:rPr>
-        <w:t xml:space="preserve">-g</w:t>
+        <w:t xml:space="preserve">-s</w:t>
       </w:r>
       <w:r>
         <w:rPr>
@@ -13896,6 +13896,18 @@
         <w:br/>
       </w:r>
       <w:r>
+        <w:br/>
+      </w:r>
+      <w:r>
+        <w:rPr>
+          <w:rStyle w:val="CommentTok"/>
+        </w:rPr>
+        <w:t xml:space="preserve"># Use CSI-u encoding format (requires tmux 3.5+)</w:t>
+      </w:r>
+      <w:r>
+        <w:br/>
+      </w:r>
+      <w:r>
         <w:rPr>
           <w:rStyle w:val="BuiltInTok"/>
         </w:rPr>
@@ -13911,7 +13923,7 @@
         <w:rPr>
           <w:rStyle w:val="AttributeTok"/>
         </w:rPr>
-        <w:t xml:space="preserve">-g</w:t>
+        <w:t xml:space="preserve">-s</w:t>
       </w:r>
       <w:r>
         <w:rPr>
@@ -14028,6 +14040,442 @@
             </w:r>
             <w:r>
               <w:t xml:space="preserve">or lower.</w:t>
+            </w:r>
+          </w:p>
+        </w:tc>
+      </w:tr>
+    </w:tbl>
+    <w:p>
+      <w:pPr>
+        <w:spacing w:before="120" w:after="0"/>
+      </w:pPr>
+    </w:p>
+    <w:tbl>
+      <w:tblPr>
+        <w:tblW w:w="9638" w:type="dxa"/>
+        <w:tblLayout w:type="fixed"/>
+        <w:tblBorders>
+          <w:top w:val="none" w:sz="0" w:space="0" w:color="auto"/>
+          <w:left w:val="single" w:sz="24" w:space="0" w:color="F57C00"/>
+          <w:bottom w:val="none" w:sz="0" w:space="0" w:color="auto"/>
+          <w:right w:val="none" w:sz="0" w:space="0" w:color="auto"/>
+        </w:tblBorders>
+        <w:tblCellMar>
+          <w:top w:w="120" w:type="dxa"/>
+          <w:left w:w="160" w:type="dxa"/>
+          <w:bottom w:w="120" w:type="dxa"/>
+          <w:right w:w="160" w:type="dxa"/>
+        </w:tblCellMar>
+      </w:tblPr>
+      <w:tr>
+        <w:tc>
+          <w:tcPr>
+            <w:tcW w:w="9638" w:type="dxa"/>
+            <w:shd w:val="clear" w:color="auto" w:fill="FFF8E1"/>
+          </w:tcPr>
+          <w:p>
+            <w:r>
+              <w:rPr>
+                <w:rFonts w:ascii="HarmonyOS Sans" w:hAnsi="HarmonyOS Sans"/>
+                <w:b/>
+                <w:color w:val="C7000B"/>
+                <w:sz w:val="21"/>
+                <w:szCs w:val="21"/>
+              </w:rPr>
+              <w:t>Important</w:t>
+            </w:r>
+          </w:p>
+          <w:p>
+            <w:pPr>
+              <w:pStyle w:val="BodyText"/>
+            </w:pPr>
+            <w:r>
+              <w:t xml:space="preserve">The</w:t>
+            </w:r>
+            <w:r>
+              <w:t xml:space="preserve"> </w:t>
+            </w:r>
+            <w:r>
+              <w:rPr>
+                <w:rStyle w:val="VerbatimChar"/>
+              </w:rPr>
+              <w:t xml:space="preserve">extended-keys-format csi-u</w:t>
+            </w:r>
+            <w:r>
+              <w:t xml:space="preserve"> </w:t>
+            </w:r>
+            <w:r>
+              <w:t xml:space="preserve">setting requires</w:t>
+            </w:r>
+            <w:r>
+              <w:t xml:space="preserve"> </w:t>
+            </w:r>
+            <w:r>
+              <w:rPr>
+                <w:bCs/>
+                <w:b/>
+              </w:rPr>
+              <w:t xml:space="preserve">tmux 3.5</w:t>
+            </w:r>
+            <w:r>
+              <w:rPr>
+                <w:bCs/>
+                <w:b/>
+              </w:rPr>
+              <w:t xml:space="preserve"> </w:t>
+            </w:r>
+            <w:r>
+              <w:rPr>
+                <w:bCs/>
+                <w:b/>
+              </w:rPr>
+              <w:t xml:space="preserve">or later</w:t>
+            </w:r>
+            <w:r>
+              <w:t xml:space="preserve">. If you get an</w:t>
+            </w:r>
+            <w:r>
+              <w:t xml:space="preserve"> </w:t>
+            </w:r>
+            <w:r>
+              <w:rPr>
+                <w:rStyle w:val="VerbatimChar"/>
+              </w:rPr>
+              <w:t xml:space="preserve">invalid option: extended-keys-format</w:t>
+            </w:r>
+            <w:r>
+              <w:t xml:space="preserve"> </w:t>
+            </w:r>
+            <w:r>
+              <w:t xml:space="preserve">error, your tmux is too old. Check with</w:t>
+            </w:r>
+            <w:r>
+              <w:t xml:space="preserve"> </w:t>
+            </w:r>
+            <w:r>
+              <w:rPr>
+                <w:rStyle w:val="VerbatimChar"/>
+              </w:rPr>
+              <w:t xml:space="preserve">tmux -V</w:t>
+            </w:r>
+            <w:r>
+              <w:t xml:space="preserve">. To upgrade</w:t>
+            </w:r>
+            <w:r>
+              <w:t xml:space="preserve"> </w:t>
+            </w:r>
+            <w:r>
+              <w:t xml:space="preserve">tmux to 3.5+ from source:</w:t>
+            </w:r>
+          </w:p>
+          <w:p>
+            <w:pPr>
+              <w:pStyle w:val="SourceCode"/>
+            </w:pPr>
+            <w:r>
+              <w:rPr>
+                <w:rStyle w:val="FunctionTok"/>
+              </w:rPr>
+              <w:t xml:space="preserve">sudo</w:t>
+            </w:r>
+            <w:r>
+              <w:rPr>
+                <w:rStyle w:val="NormalTok"/>
+              </w:rPr>
+              <w:t xml:space="preserve"> apt install build-essential autotools-dev libevent-dev libncurses-dev</w:t>
+            </w:r>
+            <w:r>
+              <w:br/>
+            </w:r>
+            <w:r>
+              <w:rPr>
+                <w:rStyle w:val="BuiltInTok"/>
+              </w:rPr>
+              <w:t xml:space="preserve">cd</w:t>
+            </w:r>
+            <w:r>
+              <w:rPr>
+                <w:rStyle w:val="NormalTok"/>
+              </w:rPr>
+              <w:t xml:space="preserve"> /tmp </w:t>
+            </w:r>
+            <w:r>
+              <w:rPr>
+                <w:rStyle w:val="KeywordTok"/>
+              </w:rPr>
+              <w:t xml:space="preserve">&amp;&amp;</w:t>
+            </w:r>
+            <w:r>
+              <w:rPr>
+                <w:rStyle w:val="NormalTok"/>
+              </w:rPr>
+              <w:t xml:space="preserve"> </w:t>
+            </w:r>
+            <w:r>
+              <w:rPr>
+                <w:rStyle w:val="FunctionTok"/>
+              </w:rPr>
+              <w:t xml:space="preserve">git</w:t>
+            </w:r>
+            <w:r>
+              <w:rPr>
+                <w:rStyle w:val="NormalTok"/>
+              </w:rPr>
+              <w:t xml:space="preserve"> clone https://github.com/tmux/tmux.git </w:t>
+            </w:r>
+            <w:r>
+              <w:rPr>
+                <w:rStyle w:val="KeywordTok"/>
+              </w:rPr>
+              <w:t xml:space="preserve">&amp;&amp;</w:t>
+            </w:r>
+            <w:r>
+              <w:rPr>
+                <w:rStyle w:val="NormalTok"/>
+              </w:rPr>
+              <w:t xml:space="preserve"> </w:t>
+            </w:r>
+            <w:r>
+              <w:rPr>
+                <w:rStyle w:val="BuiltInTok"/>
+              </w:rPr>
+              <w:t xml:space="preserve">cd</w:t>
+            </w:r>
+            <w:r>
+              <w:rPr>
+                <w:rStyle w:val="NormalTok"/>
+              </w:rPr>
+              <w:t xml:space="preserve"> tmux</w:t>
+            </w:r>
+            <w:r>
+              <w:br/>
+            </w:r>
+            <w:r>
+              <w:rPr>
+                <w:rStyle w:val="FunctionTok"/>
+              </w:rPr>
+              <w:t xml:space="preserve">sh</w:t>
+            </w:r>
+            <w:r>
+              <w:rPr>
+                <w:rStyle w:val="NormalTok"/>
+              </w:rPr>
+              <w:t xml:space="preserve"> autogen.sh </w:t>
+            </w:r>
+            <w:r>
+              <w:rPr>
+                <w:rStyle w:val="KeywordTok"/>
+              </w:rPr>
+              <w:t xml:space="preserve">&amp;&amp;</w:t>
+            </w:r>
+            <w:r>
+              <w:rPr>
+                <w:rStyle w:val="NormalTok"/>
+              </w:rPr>
+              <w:t xml:space="preserve"> </w:t>
+            </w:r>
+            <w:r>
+              <w:rPr>
+                <w:rStyle w:val="ExtensionTok"/>
+              </w:rPr>
+              <w:t xml:space="preserve">./configure</w:t>
+            </w:r>
+            <w:r>
+              <w:rPr>
+                <w:rStyle w:val="NormalTok"/>
+              </w:rPr>
+              <w:t xml:space="preserve"> </w:t>
+            </w:r>
+            <w:r>
+              <w:rPr>
+                <w:rStyle w:val="KeywordTok"/>
+              </w:rPr>
+              <w:t xml:space="preserve">&amp;&amp;</w:t>
+            </w:r>
+            <w:r>
+              <w:rPr>
+                <w:rStyle w:val="NormalTok"/>
+              </w:rPr>
+              <w:t xml:space="preserve"> </w:t>
+            </w:r>
+            <w:r>
+              <w:rPr>
+                <w:rStyle w:val="FunctionTok"/>
+              </w:rPr>
+              <w:t xml:space="preserve">make</w:t>
+            </w:r>
+            <w:r>
+              <w:rPr>
+                <w:rStyle w:val="NormalTok"/>
+              </w:rPr>
+              <w:t xml:space="preserve"> </w:t>
+            </w:r>
+            <w:r>
+              <w:rPr>
+                <w:rStyle w:val="KeywordTok"/>
+              </w:rPr>
+              <w:t xml:space="preserve">&amp;&amp;</w:t>
+            </w:r>
+            <w:r>
+              <w:rPr>
+                <w:rStyle w:val="NormalTok"/>
+              </w:rPr>
+              <w:t xml:space="preserve"> </w:t>
+            </w:r>
+            <w:r>
+              <w:rPr>
+                <w:rStyle w:val="FunctionTok"/>
+              </w:rPr>
+              <w:t xml:space="preserve">sudo</w:t>
+            </w:r>
+            <w:r>
+              <w:rPr>
+                <w:rStyle w:val="NormalTok"/>
+              </w:rPr>
+              <w:t xml:space="preserve"> make install</w:t>
+            </w:r>
+          </w:p>
+          <w:p>
+            <w:pPr>
+              <w:pStyle w:val="FirstParagraph"/>
+            </w:pPr>
+            <w:r>
+              <w:t xml:space="preserve">After upgrading, remove the old binary from</w:t>
+            </w:r>
+            <w:r>
+              <w:t xml:space="preserve"> </w:t>
+            </w:r>
+            <w:r>
+              <w:rPr>
+                <w:rStyle w:val="VerbatimChar"/>
+              </w:rPr>
+              <w:t xml:space="preserve">/usr/bin/tmux</w:t>
+            </w:r>
+            <w:r>
+              <w:t xml:space="preserve"> </w:t>
+            </w:r>
+            <w:r>
+              <w:t xml:space="preserve">if</w:t>
+            </w:r>
+            <w:r>
+              <w:t xml:space="preserve"> </w:t>
+            </w:r>
+            <w:r>
+              <w:t xml:space="preserve">needed (</w:t>
+            </w:r>
+            <w:r>
+              <w:rPr>
+                <w:rStyle w:val="VerbatimChar"/>
+              </w:rPr>
+              <w:t xml:space="preserve">which tmux</w:t>
+            </w:r>
+            <w:r>
+              <w:t xml:space="preserve"> </w:t>
+            </w:r>
+            <w:r>
+              <w:t xml:space="preserve">should point to</w:t>
+            </w:r>
+            <w:r>
+              <w:t xml:space="preserve"> </w:t>
+            </w:r>
+            <w:r>
+              <w:rPr>
+                <w:rStyle w:val="VerbatimChar"/>
+              </w:rPr>
+              <w:t xml:space="preserve">/usr/local/bin/tmux</w:t>
+            </w:r>
+            <w:r>
+              <w:t xml:space="preserve">).</w:t>
+            </w:r>
+            <w:r>
+              <w:t xml:space="preserve"> </w:t>
+            </w:r>
+            <w:r>
+              <w:t xml:space="preserve">Then reload the config:</w:t>
+            </w:r>
+            <w:r>
+              <w:t xml:space="preserve"> </w:t>
+            </w:r>
+            <w:r>
+              <w:rPr>
+                <w:rStyle w:val="VerbatimChar"/>
+              </w:rPr>
+              <w:t xml:space="preserve">tmux source-file  /.tmux.conf</w:t>
+            </w:r>
+            <w:r>
+              <w:t xml:space="preserve">.</w:t>
+            </w:r>
+          </w:p>
+        </w:tc>
+      </w:tr>
+    </w:tbl>
+    <w:p>
+      <w:pPr>
+        <w:spacing w:before="120" w:after="0"/>
+      </w:pPr>
+    </w:p>
+    <w:tbl>
+      <w:tblPr>
+        <w:tblW w:w="9638" w:type="dxa"/>
+        <w:tblLayout w:type="fixed"/>
+        <w:tblBorders>
+          <w:top w:val="none" w:sz="0" w:space="0" w:color="auto"/>
+          <w:left w:val="single" w:sz="24" w:space="0" w:color="2E7D32"/>
+          <w:bottom w:val="none" w:sz="0" w:space="0" w:color="auto"/>
+          <w:right w:val="none" w:sz="0" w:space="0" w:color="auto"/>
+        </w:tblBorders>
+        <w:tblCellMar>
+          <w:top w:w="120" w:type="dxa"/>
+          <w:left w:w="160" w:type="dxa"/>
+          <w:bottom w:w="120" w:type="dxa"/>
+          <w:right w:w="160" w:type="dxa"/>
+        </w:tblCellMar>
+      </w:tblPr>
+      <w:tr>
+        <w:tc>
+          <w:tcPr>
+            <w:tcW w:w="9638" w:type="dxa"/>
+            <w:shd w:val="clear" w:color="auto" w:fill="E8F5E9"/>
+          </w:tcPr>
+          <w:p>
+            <w:r>
+              <w:rPr>
+                <w:rFonts w:ascii="HarmonyOS Sans" w:hAnsi="HarmonyOS Sans"/>
+                <w:b/>
+                <w:color w:val="2E7D32"/>
+                <w:sz w:val="21"/>
+                <w:szCs w:val="21"/>
+              </w:rPr>
+              <w:t>Tip</w:t>
+            </w:r>
+          </w:p>
+          <w:p>
+            <w:pPr>
+              <w:pStyle w:val="BodyText"/>
+            </w:pPr>
+            <w:r>
+              <w:t xml:space="preserve">If you cannot upgrade tmux, use</w:t>
+            </w:r>
+            <w:r>
+              <w:t xml:space="preserve"> </w:t>
+            </w:r>
+            <w:r>
+              <w:rPr>
+                <w:rStyle w:val="VerbatimChar"/>
+              </w:rPr>
+              <w:t xml:space="preserve">Ctrl+J</w:t>
+            </w:r>
+            <w:r>
+              <w:t xml:space="preserve"> </w:t>
+            </w:r>
+            <w:r>
+              <w:t xml:space="preserve">to insert a newline</w:t>
+            </w:r>
+            <w:r>
+              <w:t xml:space="preserve"> </w:t>
+            </w:r>
+            <w:r>
+              <w:t xml:space="preserve">in opencode — it works with zero configuration on any tmux version.</w:t>
             </w:r>
           </w:p>
         </w:tc>

</xml_diff>

<commit_message>
Rollback Tips and Tricks chapter (tmux approach)
- Removed Chapter 7: Tips and Tricks entirely
- O&M chapter restored as Chapter 7
- tmux config requires VS Code-specific keybindings that don't
  generalize across terminal setups — not suitable for the guide
- Changelog updated to reflect removal
</commit_message>
<xml_diff>
--- a/setup-guide/setup-guide.docx
+++ b/setup-guide/setup-guide.docx
@@ -12750,7 +12750,7 @@
           <w:tab w:val="right" w:pos="9638"/>
         </w:tabs>
       </w:pPr>
-      <w:bookmarkStart w:id="129" w:name="tips-and-tricks"/>
+      <w:bookmarkStart w:id="129" w:name="operations-and-maintenance"/>
       <w:r>
         <w:rPr>
           <w:sz w:val="112"/>
@@ -12762,7 +12762,7 @@
         <w:tab/>
       </w:r>
       <w:r>
-        <w:t xml:space="preserve">Tips and Tricks</w:t>
+        <w:t xml:space="preserve">Operations and Maintenance</w:t>
       </w:r>
       <w:bookmarkEnd w:id="129"/>
     </w:p>
@@ -12781,19 +12781,13 @@
         <w:t xml:space="preserve"> </w:t>
       </w:r>
       <w:r>
-        <w:t xml:space="preserve">Learn practical tips for working efficiently with the</w:t>
-      </w:r>
-      <w:r>
-        <w:t xml:space="preserve"> </w:t>
-      </w:r>
-      <w:r>
-        <w:t xml:space="preserve">Huawei Cloud development environment, including persistent terminal</w:t>
-      </w:r>
-      <w:r>
-        <w:t xml:space="preserve"> </w:t>
-      </w:r>
-      <w:r>
-        <w:t xml:space="preserve">sessions with tmux.</w:t>
+        <w:t xml:space="preserve">Update, uninstall, or clean up the software and cloud</w:t>
+      </w:r>
+      <w:r>
+        <w:t xml:space="preserve"> </w:t>
+      </w:r>
+      <w:r>
+        <w:t xml:space="preserve">resources created in this guide. All operations in this chapter are optional.</w:t>
       </w:r>
     </w:p>
     <w:p>
@@ -12808,12 +12802,12 @@
       <w:pPr>
         <w:pStyle w:val="Heading2"/>
       </w:pPr>
-      <w:bookmarkStart w:id="130" w:name="using-tmux-for-persistent-sessions"/>
+      <w:bookmarkStart w:id="130" w:name="updating-the-maas-gateway"/>
       <w:r>
         <w:t xml:space="preserve">7.1</w:t>
       </w:r>
       <w:r>
-        <w:t xml:space="preserve"> Using tmux for persistent sessions</w:t>
+        <w:t xml:space="preserve"> Updating the MaaS Gateway</w:t>
       </w:r>
       <w:bookmarkEnd w:id="130"/>
     </w:p>
@@ -12822,53 +12816,7 @@
         <w:pStyle w:val="BodyText"/>
       </w:pPr>
       <w:r>
-        <w:t xml:space="preserve">When working over SSH, your opencode session is tied to the SSH connection.</w:t>
-      </w:r>
-      <w:r>
-        <w:t xml:space="preserve"> </w:t>
-      </w:r>
-      <w:r>
-        <w:t xml:space="preserve">If the connection drops (network issue, VPN timeout, laptop sleep), the</w:t>
-      </w:r>
-      <w:r>
-        <w:t xml:space="preserve"> </w:t>
-      </w:r>
-      <w:r>
-        <w:t xml:space="preserve">opencode process is killed and all context is lost.</w:t>
-      </w:r>
-      <w:r>
-        <w:t xml:space="preserve"> </w:t>
-      </w:r>
-      <w:r>
-        <w:rPr>
-          <w:bCs/>
-          <w:b/>
-        </w:rPr>
-        <w:t xml:space="preserve">tmux</w:t>
-      </w:r>
-      <w:r>
-        <w:t xml:space="preserve"> </w:t>
-      </w:r>
-      <w:r>
-        <w:t xml:space="preserve">solves</w:t>
-      </w:r>
-      <w:r>
-        <w:t xml:space="preserve"> </w:t>
-      </w:r>
-      <w:r>
-        <w:t xml:space="preserve">this by decoupling the terminal from the SSH connection — the session</w:t>
-      </w:r>
-      <w:r>
-        <w:t xml:space="preserve"> </w:t>
-      </w:r>
-      <w:r>
-        <w:t xml:space="preserve">keeps running on the server even when you disconnect, and you can reattach</w:t>
-      </w:r>
-      <w:r>
-        <w:t xml:space="preserve"> </w:t>
-      </w:r>
-      <w:r>
-        <w:t xml:space="preserve">to it when you reconnect.</w:t>
+        <w:t xml:space="preserve">To update the oh-my-coding-maas-gateway to a newer version:</w:t>
       </w:r>
     </w:p>
     <w:p>
@@ -12891,7 +12839,7 @@
         </w:numPr>
       </w:pPr>
       <w:r>
-        <w:t xml:space="preserve">Install tmux (if not already installed):</w:t>
+        <w:t xml:space="preserve">Re-run the bootstrap script in the VS Code remote terminal:</w:t>
       </w:r>
     </w:p>
     <w:p>
@@ -12904,15 +12852,45 @@
       </w:pPr>
       <w:r>
         <w:rPr>
+          <w:rStyle w:val="ExtensionTok"/>
+        </w:rPr>
+        <w:t xml:space="preserve">curl</w:t>
+      </w:r>
+      <w:r>
+        <w:rPr>
+          <w:rStyle w:val="NormalTok"/>
+        </w:rPr>
+        <w:t xml:space="preserve"> </w:t>
+      </w:r>
+      <w:r>
+        <w:rPr>
+          <w:rStyle w:val="AttributeTok"/>
+        </w:rPr>
+        <w:t xml:space="preserve">-fsSL</w:t>
+      </w:r>
+      <w:r>
+        <w:rPr>
+          <w:rStyle w:val="NormalTok"/>
+        </w:rPr>
+        <w:t xml:space="preserve"> https://raw.githubusercontent.com/wallacelw/oh-my-coding-maas-gateway/main/scripts/bootstrap.sh </w:t>
+      </w:r>
+      <w:r>
+        <w:rPr>
+          <w:rStyle w:val="KeywordTok"/>
+        </w:rPr>
+        <w:t xml:space="preserve">|</w:t>
+      </w:r>
+      <w:r>
+        <w:rPr>
+          <w:rStyle w:val="NormalTok"/>
+        </w:rPr>
+        <w:t xml:space="preserve"> </w:t>
+      </w:r>
+      <w:r>
+        <w:rPr>
           <w:rStyle w:val="FunctionTok"/>
         </w:rPr>
-        <w:t xml:space="preserve">sudo</w:t>
-      </w:r>
-      <w:r>
-        <w:rPr>
-          <w:rStyle w:val="NormalTok"/>
-        </w:rPr>
-        <w:t xml:space="preserve"> apt install tmux</w:t>
+        <w:t xml:space="preserve">bash</w:t>
       </w:r>
     </w:p>
     <w:p>
@@ -12923,7 +12901,24 @@
         </w:numPr>
       </w:pPr>
       <w:r>
-        <w:t xml:space="preserve">Start a new tmux session before launching opencode:</w:t>
+        <w:t xml:space="preserve">The installer detects the existing installation, pulls updates, and</w:t>
+      </w:r>
+      <w:r>
+        <w:t xml:space="preserve"> </w:t>
+      </w:r>
+      <w:r>
+        <w:t xml:space="preserve">preserves all secrets, virtual keys, and data.</w:t>
+      </w:r>
+    </w:p>
+    <w:p>
+      <w:pPr>
+        <w:numPr>
+          <w:ilvl w:val="0"/>
+          <w:numId w:val="1030"/>
+        </w:numPr>
+      </w:pPr>
+      <w:r>
+        <w:t xml:space="preserve">To update only the coding tools (without touching the proxy stack):</w:t>
       </w:r>
     </w:p>
     <w:p>
@@ -12936,38 +12931,74 @@
       </w:pPr>
       <w:r>
         <w:rPr>
+          <w:rStyle w:val="BuiltInTok"/>
+        </w:rPr>
+        <w:t xml:space="preserve">cd</w:t>
+      </w:r>
+      <w:r>
+        <w:rPr>
+          <w:rStyle w:val="NormalTok"/>
+        </w:rPr>
+        <w:t xml:space="preserve"> /home/oh-my-coding-maas-gateway</w:t>
+      </w:r>
+      <w:r>
+        <w:br/>
+      </w:r>
+      <w:r>
+        <w:rPr>
           <w:rStyle w:val="ExtensionTok"/>
         </w:rPr>
-        <w:t xml:space="preserve">tmux</w:t>
-      </w:r>
-      <w:r>
-        <w:rPr>
-          <w:rStyle w:val="NormalTok"/>
-        </w:rPr>
-        <w:t xml:space="preserve"> new </w:t>
-      </w:r>
-      <w:r>
-        <w:rPr>
-          <w:rStyle w:val="AttributeTok"/>
-        </w:rPr>
-        <w:t xml:space="preserve">-s</w:t>
-      </w:r>
-      <w:r>
-        <w:rPr>
-          <w:rStyle w:val="NormalTok"/>
-        </w:rPr>
-        <w:t xml:space="preserve"> opencode</w:t>
+        <w:t xml:space="preserve">./scripts/update.sh</w:t>
+      </w:r>
+    </w:p>
+    <w:p>
+      <w:pPr>
+        <w:pStyle w:val="Heading2"/>
+      </w:pPr>
+      <w:bookmarkStart w:id="131" w:name="updating-the-document-templates"/>
+      <w:r>
+        <w:t xml:space="preserve">7.2</w:t>
+      </w:r>
+      <w:r>
+        <w:t xml:space="preserve"> Updating the Document Templates</w:t>
+      </w:r>
+      <w:bookmarkEnd w:id="131"/>
+    </w:p>
+    <w:p>
+      <w:pPr>
+        <w:pStyle w:val="FirstParagraph"/>
+      </w:pPr>
+      <w:r>
+        <w:t xml:space="preserve">To update the Huawei document templates project:</w:t>
+      </w:r>
+    </w:p>
+    <w:p>
+      <w:pPr>
+        <w:pStyle w:val="BodyText"/>
+      </w:pPr>
+      <w:r>
+        <w:rPr>
+          <w:bCs/>
+          <w:b/>
+        </w:rPr>
+        <w:t xml:space="preserve">Step by step:</w:t>
       </w:r>
     </w:p>
     <w:p>
       <w:pPr>
         <w:numPr>
           <w:ilvl w:val="0"/>
-          <w:numId w:val="1030"/>
+          <w:numId w:val="1031"/>
         </w:numPr>
       </w:pPr>
       <w:r>
-        <w:t xml:space="preserve">Inside the tmux session, start opencode as usual:</w:t>
+        <w:t xml:space="preserve">Re-run the one-liner — it detects the existing installation and</w:t>
+      </w:r>
+      <w:r>
+        <w:t xml:space="preserve"> </w:t>
+      </w:r>
+      <w:r>
+        <w:t xml:space="preserve">prompts to update:</w:t>
       </w:r>
     </w:p>
     <w:p>
@@ -12982,24 +13013,119 @@
         <w:rPr>
           <w:rStyle w:val="ExtensionTok"/>
         </w:rPr>
-        <w:t xml:space="preserve">opencode</w:t>
+        <w:t xml:space="preserve">curl</w:t>
+      </w:r>
+      <w:r>
+        <w:rPr>
+          <w:rStyle w:val="NormalTok"/>
+        </w:rPr>
+        <w:t xml:space="preserve"> </w:t>
+      </w:r>
+      <w:r>
+        <w:rPr>
+          <w:rStyle w:val="AttributeTok"/>
+        </w:rPr>
+        <w:t xml:space="preserve">-fsSL</w:t>
+      </w:r>
+      <w:r>
+        <w:rPr>
+          <w:rStyle w:val="NormalTok"/>
+        </w:rPr>
+        <w:t xml:space="preserve"> https://raw.githubusercontent.com/wallacelw/huawei-doc-templates/main/scripts/install.sh </w:t>
+      </w:r>
+      <w:r>
+        <w:rPr>
+          <w:rStyle w:val="KeywordTok"/>
+        </w:rPr>
+        <w:t xml:space="preserve">|</w:t>
+      </w:r>
+      <w:r>
+        <w:rPr>
+          <w:rStyle w:val="NormalTok"/>
+        </w:rPr>
+        <w:t xml:space="preserve"> </w:t>
+      </w:r>
+      <w:r>
+        <w:rPr>
+          <w:rStyle w:val="FunctionTok"/>
+        </w:rPr>
+        <w:t xml:space="preserve">bash</w:t>
       </w:r>
     </w:p>
     <w:p>
       <w:pPr>
         <w:numPr>
           <w:ilvl w:val="0"/>
-          <w:numId w:val="1030"/>
+          <w:numId w:val="1031"/>
         </w:numPr>
       </w:pPr>
       <w:r>
-        <w:t xml:space="preserve">If SSH disconnects, the opencode session keeps running. Reconnect</w:t>
-      </w:r>
-      <w:r>
-        <w:t xml:space="preserve"> </w:t>
-      </w:r>
-      <w:r>
-        <w:t xml:space="preserve">to the server and reattach:</w:t>
+        <w:t xml:space="preserve">The script pulls the latest version, shows the version change</w:t>
+      </w:r>
+      <w:r>
+        <w:t xml:space="preserve"> </w:t>
+      </w:r>
+      <w:r>
+        <w:t xml:space="preserve">(</w:t>
+      </w:r>
+      <w:r>
+        <w:rPr>
+          <w:rStyle w:val="VerbatimChar"/>
+        </w:rPr>
+        <w:t xml:space="preserve">v3.3.6 → v3.3.7</w:t>
+      </w:r>
+      <w:r>
+        <w:t xml:space="preserve">), and re-runs the installer. New</w:t>
+      </w:r>
+      <w:r>
+        <w:t xml:space="preserve"> </w:t>
+      </w:r>
+      <w:r>
+        <w:t xml:space="preserve">templates, commands, or modules are installed automatically.</w:t>
+      </w:r>
+    </w:p>
+    <w:p>
+      <w:pPr>
+        <w:pStyle w:val="Heading2"/>
+      </w:pPr>
+      <w:bookmarkStart w:id="132" w:name="uninstalling-the-maas-gateway"/>
+      <w:r>
+        <w:t xml:space="preserve">7.3</w:t>
+      </w:r>
+      <w:r>
+        <w:t xml:space="preserve"> Uninstalling the MaaS Gateway</w:t>
+      </w:r>
+      <w:bookmarkEnd w:id="132"/>
+    </w:p>
+    <w:p>
+      <w:pPr>
+        <w:pStyle w:val="FirstParagraph"/>
+      </w:pPr>
+      <w:r>
+        <w:t xml:space="preserve">To remove the oh-my-coding-maas-gateway:</w:t>
+      </w:r>
+    </w:p>
+    <w:p>
+      <w:pPr>
+        <w:pStyle w:val="BodyText"/>
+      </w:pPr>
+      <w:r>
+        <w:rPr>
+          <w:bCs/>
+          <w:b/>
+        </w:rPr>
+        <w:t xml:space="preserve">Step by step:</w:t>
+      </w:r>
+    </w:p>
+    <w:p>
+      <w:pPr>
+        <w:numPr>
+          <w:ilvl w:val="0"/>
+          <w:numId w:val="1032"/>
+        </w:numPr>
+      </w:pPr>
+      <w:r>
+        <w:t xml:space="preserve">Run the uninstall script:</w:t>
       </w:r>
     </w:p>
     <w:p>
@@ -13012,38 +13138,82 @@
       </w:pPr>
       <w:r>
         <w:rPr>
+          <w:rStyle w:val="BuiltInTok"/>
+        </w:rPr>
+        <w:t xml:space="preserve">cd</w:t>
+      </w:r>
+      <w:r>
+        <w:rPr>
+          <w:rStyle w:val="NormalTok"/>
+        </w:rPr>
+        <w:t xml:space="preserve"> /home/oh-my-coding-maas-gateway</w:t>
+      </w:r>
+      <w:r>
+        <w:br/>
+      </w:r>
+      <w:r>
+        <w:rPr>
           <w:rStyle w:val="ExtensionTok"/>
         </w:rPr>
-        <w:t xml:space="preserve">tmux</w:t>
+        <w:t xml:space="preserve">./scripts/uninstall.sh</w:t>
       </w:r>
       <w:r>
         <w:rPr>
           <w:rStyle w:val="NormalTok"/>
         </w:rPr>
-        <w:t xml:space="preserve"> attach </w:t>
+        <w:t xml:space="preserve"> </w:t>
       </w:r>
       <w:r>
         <w:rPr>
           <w:rStyle w:val="AttributeTok"/>
         </w:rPr>
-        <w:t xml:space="preserve">-t</w:t>
+        <w:t xml:space="preserve">--all</w:t>
       </w:r>
       <w:r>
         <w:rPr>
           <w:rStyle w:val="NormalTok"/>
         </w:rPr>
-        <w:t xml:space="preserve"> opencode</w:t>
+        <w:t xml:space="preserve"> </w:t>
+      </w:r>
+      <w:r>
+        <w:rPr>
+          <w:rStyle w:val="AttributeTok"/>
+        </w:rPr>
+        <w:t xml:space="preserve">--yes</w:t>
       </w:r>
     </w:p>
     <w:p>
       <w:pPr>
         <w:numPr>
           <w:ilvl w:val="0"/>
-          <w:numId w:val="1030"/>
+          <w:numId w:val="1032"/>
         </w:numPr>
       </w:pPr>
       <w:r>
-        <w:t xml:space="preserve">To list existing sessions:</w:t>
+        <w:t xml:space="preserve">This stops and removes Docker containers, volumes, and images, removes</w:t>
+      </w:r>
+      <w:r>
+        <w:t xml:space="preserve"> </w:t>
+      </w:r>
+      <w:r>
+        <w:t xml:space="preserve">coding tool configs (opencode, Codex, Claude, Pi), and deletes the</w:t>
+      </w:r>
+      <w:r>
+        <w:t xml:space="preserve"> </w:t>
+      </w:r>
+      <w:r>
+        <w:t xml:space="preserve">repository.</w:t>
+      </w:r>
+    </w:p>
+    <w:p>
+      <w:pPr>
+        <w:numPr>
+          <w:ilvl w:val="0"/>
+          <w:numId w:val="1032"/>
+        </w:numPr>
+      </w:pPr>
+      <w:r>
+        <w:t xml:space="preserve">To remove only specific components:</w:t>
       </w:r>
     </w:p>
     <w:p>
@@ -13058,13 +13228,384 @@
         <w:rPr>
           <w:rStyle w:val="ExtensionTok"/>
         </w:rPr>
-        <w:t xml:space="preserve">tmux</w:t>
+        <w:t xml:space="preserve">./scripts/uninstall.sh</w:t>
       </w:r>
       <w:r>
         <w:rPr>
           <w:rStyle w:val="NormalTok"/>
         </w:rPr>
-        <w:t xml:space="preserve"> ls</w:t>
+        <w:t xml:space="preserve"> </w:t>
+      </w:r>
+      <w:r>
+        <w:rPr>
+          <w:rStyle w:val="AttributeTok"/>
+        </w:rPr>
+        <w:t xml:space="preserve">--tool</w:t>
+      </w:r>
+      <w:r>
+        <w:rPr>
+          <w:rStyle w:val="OperatorTok"/>
+        </w:rPr>
+        <w:t xml:space="preserve">=</w:t>
+      </w:r>
+      <w:r>
+        <w:rPr>
+          <w:rStyle w:val="NormalTok"/>
+        </w:rPr>
+        <w:t xml:space="preserve">opencode    </w:t>
+      </w:r>
+      <w:r>
+        <w:rPr>
+          <w:rStyle w:val="CommentTok"/>
+        </w:rPr>
+        <w:t xml:space="preserve"># remove one tool</w:t>
+      </w:r>
+      <w:r>
+        <w:br/>
+      </w:r>
+      <w:r>
+        <w:rPr>
+          <w:rStyle w:val="ExtensionTok"/>
+        </w:rPr>
+        <w:t xml:space="preserve">./scripts/uninstall.sh</w:t>
+      </w:r>
+      <w:r>
+        <w:rPr>
+          <w:rStyle w:val="NormalTok"/>
+        </w:rPr>
+        <w:t xml:space="preserve"> </w:t>
+      </w:r>
+      <w:r>
+        <w:rPr>
+          <w:rStyle w:val="AttributeTok"/>
+        </w:rPr>
+        <w:t xml:space="preserve">--docker</w:t>
+      </w:r>
+      <w:r>
+        <w:rPr>
+          <w:rStyle w:val="NormalTok"/>
+        </w:rPr>
+        <w:t xml:space="preserve">           </w:t>
+      </w:r>
+      <w:r>
+        <w:rPr>
+          <w:rStyle w:val="CommentTok"/>
+        </w:rPr>
+        <w:t xml:space="preserve"># remove Docker stack only</w:t>
+      </w:r>
+    </w:p>
+    <w:p>
+      <w:pPr>
+        <w:pStyle w:val="Heading2"/>
+      </w:pPr>
+      <w:bookmarkStart w:id="133" w:name="uninstalling-the-document-templates"/>
+      <w:r>
+        <w:t xml:space="preserve">7.4</w:t>
+      </w:r>
+      <w:r>
+        <w:t xml:space="preserve"> Uninstalling the Document Templates</w:t>
+      </w:r>
+      <w:bookmarkEnd w:id="133"/>
+    </w:p>
+    <w:p>
+      <w:pPr>
+        <w:pStyle w:val="FirstParagraph"/>
+      </w:pPr>
+      <w:r>
+        <w:t xml:space="preserve">To remove the Huawei document templates installation:</w:t>
+      </w:r>
+    </w:p>
+    <w:p>
+      <w:pPr>
+        <w:pStyle w:val="BodyText"/>
+      </w:pPr>
+      <w:r>
+        <w:rPr>
+          <w:bCs/>
+          <w:b/>
+        </w:rPr>
+        <w:t xml:space="preserve">Step by step:</w:t>
+      </w:r>
+    </w:p>
+    <w:p>
+      <w:pPr>
+        <w:numPr>
+          <w:ilvl w:val="0"/>
+          <w:numId w:val="1033"/>
+        </w:numPr>
+      </w:pPr>
+      <w:r>
+        <w:t xml:space="preserve">Run the uninstall script (interactive menu with 5 options):</w:t>
+      </w:r>
+    </w:p>
+    <w:p>
+      <w:pPr>
+        <w:numPr>
+          <w:ilvl w:val="0"/>
+          <w:numId w:val="1000"/>
+        </w:numPr>
+        <w:pStyle w:val="SourceCode"/>
+      </w:pPr>
+      <w:r>
+        <w:rPr>
+          <w:rStyle w:val="BuiltInTok"/>
+        </w:rPr>
+        <w:t xml:space="preserve">cd</w:t>
+      </w:r>
+      <w:r>
+        <w:rPr>
+          <w:rStyle w:val="NormalTok"/>
+        </w:rPr>
+        <w:t xml:space="preserve"> /home/huawei-doc-templates</w:t>
+      </w:r>
+      <w:r>
+        <w:br/>
+      </w:r>
+      <w:r>
+        <w:rPr>
+          <w:rStyle w:val="ExtensionTok"/>
+        </w:rPr>
+        <w:t xml:space="preserve">./scripts/uninstall.sh</w:t>
+      </w:r>
+    </w:p>
+    <w:p>
+      <w:pPr>
+        <w:numPr>
+          <w:ilvl w:val="0"/>
+          <w:numId w:val="1033"/>
+        </w:numPr>
+      </w:pPr>
+      <w:r>
+        <w:t xml:space="preserve">Or use the one-liner:</w:t>
+      </w:r>
+    </w:p>
+    <w:p>
+      <w:pPr>
+        <w:numPr>
+          <w:ilvl w:val="0"/>
+          <w:numId w:val="1000"/>
+        </w:numPr>
+        <w:pStyle w:val="SourceCode"/>
+      </w:pPr>
+      <w:r>
+        <w:rPr>
+          <w:rStyle w:val="ExtensionTok"/>
+        </w:rPr>
+        <w:t xml:space="preserve">curl</w:t>
+      </w:r>
+      <w:r>
+        <w:rPr>
+          <w:rStyle w:val="NormalTok"/>
+        </w:rPr>
+        <w:t xml:space="preserve"> </w:t>
+      </w:r>
+      <w:r>
+        <w:rPr>
+          <w:rStyle w:val="AttributeTok"/>
+        </w:rPr>
+        <w:t xml:space="preserve">-fsSL</w:t>
+      </w:r>
+      <w:r>
+        <w:rPr>
+          <w:rStyle w:val="NormalTok"/>
+        </w:rPr>
+        <w:t xml:space="preserve"> https://raw.githubusercontent.com/wallacelw/huawei-doc-templates/main/scripts/uninstall.sh </w:t>
+      </w:r>
+      <w:r>
+        <w:rPr>
+          <w:rStyle w:val="KeywordTok"/>
+        </w:rPr>
+        <w:t xml:space="preserve">|</w:t>
+      </w:r>
+      <w:r>
+        <w:rPr>
+          <w:rStyle w:val="NormalTok"/>
+        </w:rPr>
+        <w:t xml:space="preserve"> </w:t>
+      </w:r>
+      <w:r>
+        <w:rPr>
+          <w:rStyle w:val="FunctionTok"/>
+        </w:rPr>
+        <w:t xml:space="preserve">bash</w:t>
+      </w:r>
+    </w:p>
+    <w:p>
+      <w:pPr>
+        <w:numPr>
+          <w:ilvl w:val="0"/>
+          <w:numId w:val="1033"/>
+        </w:numPr>
+      </w:pPr>
+      <w:r>
+        <w:t xml:space="preserve">The interactive menu offers:</w:t>
+      </w:r>
+    </w:p>
+    <w:p>
+      <w:pPr>
+        <w:numPr>
+          <w:ilvl w:val="1"/>
+          <w:numId w:val="1034"/>
+        </w:numPr>
+      </w:pPr>
+      <w:r>
+        <w:t xml:space="preserve">Option 1: All installed components (skills, modules, font, VS Code)</w:t>
+      </w:r>
+    </w:p>
+    <w:p>
+      <w:pPr>
+        <w:numPr>
+          <w:ilvl w:val="1"/>
+          <w:numId w:val="1034"/>
+        </w:numPr>
+      </w:pPr>
+      <w:r>
+        <w:t xml:space="preserve">Option 2: Everything + apt packages (WARNING: breaks other TeX)</w:t>
+      </w:r>
+    </w:p>
+    <w:p>
+      <w:pPr>
+        <w:numPr>
+          <w:ilvl w:val="1"/>
+          <w:numId w:val="1034"/>
+        </w:numPr>
+      </w:pPr>
+      <w:r>
+        <w:t xml:space="preserve">Option 3: Delete repository directory (all files, guides, documents)</w:t>
+      </w:r>
+    </w:p>
+    <w:p>
+      <w:pPr>
+        <w:numPr>
+          <w:ilvl w:val="1"/>
+          <w:numId w:val="1034"/>
+        </w:numPr>
+      </w:pPr>
+      <w:r>
+        <w:t xml:space="preserve">Option 4: Remove 100% — everything + apt + repo (nuclear option)</w:t>
+      </w:r>
+    </w:p>
+    <w:p>
+      <w:pPr>
+        <w:numPr>
+          <w:ilvl w:val="1"/>
+          <w:numId w:val="1034"/>
+        </w:numPr>
+      </w:pPr>
+      <w:r>
+        <w:t xml:space="preserve">Option 5: Choose specific components individually</w:t>
+      </w:r>
+    </w:p>
+    <w:p>
+      <w:pPr>
+        <w:numPr>
+          <w:ilvl w:val="0"/>
+          <w:numId w:val="1033"/>
+        </w:numPr>
+      </w:pPr>
+      <w:r>
+        <w:t xml:space="preserve">To preview what would be removed before running:</w:t>
+      </w:r>
+    </w:p>
+    <w:p>
+      <w:pPr>
+        <w:numPr>
+          <w:ilvl w:val="0"/>
+          <w:numId w:val="1000"/>
+        </w:numPr>
+        <w:pStyle w:val="SourceCode"/>
+      </w:pPr>
+      <w:r>
+        <w:rPr>
+          <w:rStyle w:val="ExtensionTok"/>
+        </w:rPr>
+        <w:t xml:space="preserve">./scripts/uninstall.sh</w:t>
+      </w:r>
+      <w:r>
+        <w:rPr>
+          <w:rStyle w:val="NormalTok"/>
+        </w:rPr>
+        <w:t xml:space="preserve"> </w:t>
+      </w:r>
+      <w:r>
+        <w:rPr>
+          <w:rStyle w:val="AttributeTok"/>
+        </w:rPr>
+        <w:t xml:space="preserve">--all</w:t>
+      </w:r>
+      <w:r>
+        <w:rPr>
+          <w:rStyle w:val="NormalTok"/>
+        </w:rPr>
+        <w:t xml:space="preserve"> </w:t>
+      </w:r>
+      <w:r>
+        <w:rPr>
+          <w:rStyle w:val="AttributeTok"/>
+        </w:rPr>
+        <w:t xml:space="preserve">--dry-run</w:t>
+      </w:r>
+    </w:p>
+    <w:p>
+      <w:pPr>
+        <w:numPr>
+          <w:ilvl w:val="0"/>
+          <w:numId w:val="1033"/>
+        </w:numPr>
+      </w:pPr>
+      <w:r>
+        <w:t xml:space="preserve">To also remove apt packages (texlive, latexmk, fonts, pandoc):</w:t>
+      </w:r>
+    </w:p>
+    <w:p>
+      <w:pPr>
+        <w:numPr>
+          <w:ilvl w:val="0"/>
+          <w:numId w:val="1000"/>
+        </w:numPr>
+        <w:pStyle w:val="SourceCode"/>
+      </w:pPr>
+      <w:r>
+        <w:rPr>
+          <w:rStyle w:val="ExtensionTok"/>
+        </w:rPr>
+        <w:t xml:space="preserve">./scripts/uninstall.sh</w:t>
+      </w:r>
+      <w:r>
+        <w:rPr>
+          <w:rStyle w:val="NormalTok"/>
+        </w:rPr>
+        <w:t xml:space="preserve"> </w:t>
+      </w:r>
+      <w:r>
+        <w:rPr>
+          <w:rStyle w:val="AttributeTok"/>
+        </w:rPr>
+        <w:t xml:space="preserve">--all</w:t>
+      </w:r>
+      <w:r>
+        <w:rPr>
+          <w:rStyle w:val="NormalTok"/>
+        </w:rPr>
+        <w:t xml:space="preserve"> </w:t>
+      </w:r>
+      <w:r>
+        <w:rPr>
+          <w:rStyle w:val="AttributeTok"/>
+        </w:rPr>
+        <w:t xml:space="preserve">--packages</w:t>
+      </w:r>
+      <w:r>
+        <w:rPr>
+          <w:rStyle w:val="NormalTok"/>
+        </w:rPr>
+        <w:t xml:space="preserve"> </w:t>
+      </w:r>
+      <w:r>
+        <w:rPr>
+          <w:rStyle w:val="AttributeTok"/>
+        </w:rPr>
+        <w:t xml:space="preserve">--yes</w:t>
       </w:r>
     </w:p>
     <w:tbl>
@@ -13073,7 +13614,7 @@
         <w:tblLayout w:type="fixed"/>
         <w:tblBorders>
           <w:top w:val="none" w:sz="0" w:space="0" w:color="auto"/>
-          <w:left w:val="single" w:sz="24" w:space="0" w:color="2E7D32"/>
+          <w:left w:val="single" w:sz="24" w:space="0" w:color="F57C00"/>
           <w:bottom w:val="none" w:sz="0" w:space="0" w:color="auto"/>
           <w:right w:val="none" w:sz="0" w:space="0" w:color="auto"/>
         </w:tblBorders>
@@ -13088,38 +13629,50 @@
         <w:tc>
           <w:tcPr>
             <w:tcW w:w="9638" w:type="dxa"/>
-            <w:shd w:val="clear" w:color="auto" w:fill="E8F5E9"/>
+            <w:shd w:val="clear" w:color="auto" w:fill="FFF8E1"/>
           </w:tcPr>
           <w:p>
             <w:r>
               <w:rPr>
                 <w:rFonts w:ascii="HarmonyOS Sans" w:hAnsi="HarmonyOS Sans"/>
                 <w:b/>
-                <w:color w:val="2E7D32"/>
+                <w:color w:val="C7000B"/>
                 <w:sz w:val="21"/>
                 <w:szCs w:val="21"/>
               </w:rPr>
-              <w:t>Tip</w:t>
-            </w:r>
-          </w:p>
-          <w:p>
-            <w:pPr>
-              <w:pStyle w:val="FirstParagraph"/>
-            </w:pPr>
-            <w:r>
-              <w:t xml:space="preserve">Always start your opencode session inside tmux. If you forget and start</w:t>
+              <w:t>Important</w:t>
+            </w:r>
+          </w:p>
+          <w:p>
+            <w:pPr>
+              <w:numPr>
+                <w:ilvl w:val="0"/>
+                <w:numId w:val="1000"/>
+              </w:numPr>
+            </w:pPr>
+            <w:r>
+              <w:t xml:space="preserve">Removing apt packages will break any other LaTeX documents on the instance.</w:t>
             </w:r>
             <w:r>
               <w:t xml:space="preserve"> </w:t>
             </w:r>
             <w:r>
-              <w:t xml:space="preserve">opencode directly, you can’t retroactively attach it to tmux — you’d</w:t>
+              <w:t xml:space="preserve">Only use</w:t>
             </w:r>
             <w:r>
               <w:t xml:space="preserve"> </w:t>
             </w:r>
             <w:r>
-              <w:t xml:space="preserve">need to restart opencode inside a new tmux session.</w:t>
+              <w:rPr>
+                <w:rStyle w:val="VerbatimChar"/>
+              </w:rPr>
+              <w:t xml:space="preserve">–packages</w:t>
+            </w:r>
+            <w:r>
+              <w:t xml:space="preserve"> </w:t>
+            </w:r>
+            <w:r>
+              <w:t xml:space="preserve">if you are decommissioning the instance.</w:t>
             </w:r>
           </w:p>
         </w:tc>
@@ -13132,16 +13685,312 @@
     </w:p>
     <w:p>
       <w:pPr>
-        <w:pStyle w:val="Heading3"/>
-      </w:pPr>
-      <w:bookmarkStart w:id="131" w:name="essential-tmux-commands"/>
-      <w:r>
-        <w:t xml:space="preserve">7.1.1</w:t>
-      </w:r>
-      <w:r>
-        <w:t xml:space="preserve"> Essential tmux commands</w:t>
-      </w:r>
-      <w:bookmarkEnd w:id="131"/>
+        <w:pStyle w:val="Heading2"/>
+      </w:pPr>
+      <w:bookmarkStart w:id="134" w:name="deleting-cloud-resources-optional"/>
+      <w:r>
+        <w:t xml:space="preserve">7.5</w:t>
+      </w:r>
+      <w:r>
+        <w:t xml:space="preserve"> Deleting cloud resources (optional)</w:t>
+      </w:r>
+      <w:bookmarkEnd w:id="134"/>
+    </w:p>
+    <w:p>
+      <w:pPr>
+        <w:pStyle w:val="FirstParagraph"/>
+      </w:pPr>
+      <w:r>
+        <w:t xml:space="preserve">If you no longer need the Flexus X instance, delete it to stop incurring</w:t>
+      </w:r>
+      <w:r>
+        <w:t xml:space="preserve"> </w:t>
+      </w:r>
+      <w:r>
+        <w:t xml:space="preserve">charges:</w:t>
+      </w:r>
+    </w:p>
+    <w:p>
+      <w:pPr>
+        <w:pStyle w:val="BodyText"/>
+      </w:pPr>
+      <w:r>
+        <w:rPr>
+          <w:bCs/>
+          <w:b/>
+        </w:rPr>
+        <w:t xml:space="preserve">Step by step:</w:t>
+      </w:r>
+    </w:p>
+    <w:p>
+      <w:pPr>
+        <w:numPr>
+          <w:ilvl w:val="0"/>
+          <w:numId w:val="1035"/>
+        </w:numPr>
+      </w:pPr>
+      <w:r>
+        <w:t xml:space="preserve">In the Console, navigate to</w:t>
+      </w:r>
+      <w:r>
+        <w:t xml:space="preserve"> </w:t>
+      </w:r>
+      <w:r>
+        <w:rPr>
+          <w:bCs/>
+          <w:b/>
+        </w:rPr>
+        <w:t xml:space="preserve">Flexus X</w:t>
+      </w:r>
+      <w:r>
+        <w:t xml:space="preserve">.</w:t>
+      </w:r>
+    </w:p>
+    <w:p>
+      <w:pPr>
+        <w:numPr>
+          <w:ilvl w:val="0"/>
+          <w:numId w:val="1035"/>
+        </w:numPr>
+      </w:pPr>
+      <w:r>
+        <w:t xml:space="preserve">Select the instance</w:t>
+      </w:r>
+      <w:r>
+        <w:t xml:space="preserve"> </w:t>
+      </w:r>
+      <w:r>
+        <w:rPr>
+          <w:rStyle w:val="VerbatimChar"/>
+        </w:rPr>
+        <w:t xml:space="preserve">flexusx-dev</w:t>
+      </w:r>
+      <w:r>
+        <w:t xml:space="preserve">, click</w:t>
+      </w:r>
+      <w:r>
+        <w:t xml:space="preserve"> </w:t>
+      </w:r>
+      <w:r>
+        <w:rPr>
+          <w:bCs/>
+          <w:b/>
+        </w:rPr>
+        <w:t xml:space="preserve">More</w:t>
+      </w:r>
+      <w:r>
+        <w:t xml:space="preserve"> </w:t>
+      </w:r>
+      <w:r>
+        <w:t xml:space="preserve">and</w:t>
+      </w:r>
+      <w:r>
+        <w:t xml:space="preserve"> </w:t>
+      </w:r>
+      <w:r>
+        <w:t xml:space="preserve">choose</w:t>
+      </w:r>
+      <w:r>
+        <w:t xml:space="preserve"> </w:t>
+      </w:r>
+      <w:r>
+        <w:rPr>
+          <w:bCs/>
+          <w:b/>
+        </w:rPr>
+        <w:t xml:space="preserve">Delete</w:t>
+      </w:r>
+      <w:r>
+        <w:t xml:space="preserve">.</w:t>
+      </w:r>
+    </w:p>
+    <w:p>
+      <w:pPr>
+        <w:numPr>
+          <w:ilvl w:val="0"/>
+          <w:numId w:val="1035"/>
+        </w:numPr>
+      </w:pPr>
+      <w:r>
+        <w:t xml:space="preserve">Confirm deletion. The EIP is released automatically (configured in</w:t>
+      </w:r>
+      <w:r>
+        <w:t xml:space="preserve"> </w:t>
+      </w:r>
+      <w:r>
+        <w:t xml:space="preserve">Chapter 1 to release on instance deletion).</w:t>
+      </w:r>
+    </w:p>
+    <w:p>
+      <w:pPr>
+        <w:numPr>
+          <w:ilvl w:val="0"/>
+          <w:numId w:val="1035"/>
+        </w:numPr>
+      </w:pPr>
+      <w:r>
+        <w:t xml:space="preserve">Navigate to</w:t>
+      </w:r>
+      <w:r>
+        <w:t xml:space="preserve"> </w:t>
+      </w:r>
+      <w:r>
+        <w:rPr>
+          <w:bCs/>
+          <w:b/>
+        </w:rPr>
+        <w:t xml:space="preserve">VPC</w:t>
+      </w:r>
+      <w:r>
+        <w:t xml:space="preserve"> → </w:t>
+      </w:r>
+      <w:r>
+        <w:rPr>
+          <w:bCs/>
+          <w:b/>
+        </w:rPr>
+        <w:t xml:space="preserve">Security Groups</w:t>
+      </w:r>
+      <w:r>
+        <w:t xml:space="preserve">,</w:t>
+      </w:r>
+      <w:r>
+        <w:t xml:space="preserve"> </w:t>
+      </w:r>
+      <w:r>
+        <w:t xml:space="preserve">select</w:t>
+      </w:r>
+      <w:r>
+        <w:t xml:space="preserve"> </w:t>
+      </w:r>
+      <w:r>
+        <w:rPr>
+          <w:rStyle w:val="VerbatimChar"/>
+        </w:rPr>
+        <w:t xml:space="preserve">sg-xgate</w:t>
+      </w:r>
+      <w:r>
+        <w:t xml:space="preserve">, and delete it.</w:t>
+      </w:r>
+    </w:p>
+    <w:p>
+      <w:pPr>
+        <w:numPr>
+          <w:ilvl w:val="0"/>
+          <w:numId w:val="1035"/>
+        </w:numPr>
+      </w:pPr>
+      <w:r>
+        <w:t xml:space="preserve">Remove the SSH config entry for</w:t>
+      </w:r>
+      <w:r>
+        <w:t xml:space="preserve"> </w:t>
+      </w:r>
+      <w:r>
+        <w:rPr>
+          <w:rStyle w:val="VerbatimChar"/>
+        </w:rPr>
+        <w:t xml:space="preserve">flexusx-dev</w:t>
+      </w:r>
+      <w:r>
+        <w:t xml:space="preserve"> </w:t>
+      </w:r>
+      <w:r>
+        <w:t xml:space="preserve">from your</w:t>
+      </w:r>
+      <w:r>
+        <w:t xml:space="preserve"> </w:t>
+      </w:r>
+      <w:r>
+        <w:t xml:space="preserve">Windows SSH config file</w:t>
+      </w:r>
+      <w:r>
+        <w:t xml:space="preserve"> </w:t>
+      </w:r>
+      <w:r>
+        <w:t xml:space="preserve">(</w:t>
+      </w:r>
+      <w:r>
+        <w:rPr>
+          <w:rStyle w:val="VerbatimChar"/>
+        </w:rPr>
+        <w:t xml:space="preserve">C:\textbackslash Users\textbackslash &lt;user&gt;\textbackslash .ssh\textbackslash config</w:t>
+      </w:r>
+      <w:r>
+        <w:t xml:space="preserve">).</w:t>
+      </w:r>
+    </w:p>
+    <w:tbl>
+      <w:tblPr>
+        <w:tblW w:w="9638" w:type="dxa"/>
+        <w:tblLayout w:type="fixed"/>
+        <w:tblBorders>
+          <w:top w:val="none" w:sz="0" w:space="0" w:color="auto"/>
+          <w:left w:val="single" w:sz="24" w:space="0" w:color="F57C00"/>
+          <w:bottom w:val="none" w:sz="0" w:space="0" w:color="auto"/>
+          <w:right w:val="none" w:sz="0" w:space="0" w:color="auto"/>
+        </w:tblBorders>
+        <w:tblCellMar>
+          <w:top w:w="120" w:type="dxa"/>
+          <w:left w:w="160" w:type="dxa"/>
+          <w:bottom w:w="120" w:type="dxa"/>
+          <w:right w:w="160" w:type="dxa"/>
+        </w:tblCellMar>
+      </w:tblPr>
+      <w:tr>
+        <w:tc>
+          <w:tcPr>
+            <w:tcW w:w="9638" w:type="dxa"/>
+            <w:shd w:val="clear" w:color="auto" w:fill="FFF8E1"/>
+          </w:tcPr>
+          <w:p>
+            <w:r>
+              <w:rPr>
+                <w:rFonts w:ascii="HarmonyOS Sans" w:hAnsi="HarmonyOS Sans"/>
+                <w:b/>
+                <w:color w:val="C7000B"/>
+                <w:sz w:val="21"/>
+                <w:szCs w:val="21"/>
+              </w:rPr>
+              <w:t>Important</w:t>
+            </w:r>
+          </w:p>
+          <w:p>
+            <w:pPr>
+              <w:pStyle w:val="FirstParagraph"/>
+            </w:pPr>
+            <w:r>
+              <w:t xml:space="preserve">If you used Terraform to provision the infrastructure, run</w:t>
+            </w:r>
+            <w:r>
+              <w:t xml:space="preserve"> </w:t>
+            </w:r>
+            <w:r>
+              <w:rPr>
+                <w:rStyle w:val="VerbatimChar"/>
+              </w:rPr>
+              <w:t xml:space="preserve">terraform destroy</w:t>
+            </w:r>
+            <w:r>
+              <w:t xml:space="preserve"> </w:t>
+            </w:r>
+            <w:r>
+              <w:t xml:space="preserve">instead to remove all resources declared in the</w:t>
+            </w:r>
+            <w:r>
+              <w:t xml:space="preserve"> </w:t>
+            </w:r>
+            <w:r>
+              <w:t xml:space="preserve">configuration.</w:t>
+            </w:r>
+          </w:p>
+        </w:tc>
+      </w:tr>
+    </w:tbl>
+    <w:p>
+      <w:pPr>
+        <w:spacing w:before="120" w:after="0"/>
+      </w:pPr>
     </w:p>
     <w:tbl>
       <w:tblPr>
@@ -13180,7 +14029,7 @@
                 <w:sz w:val="18"/>
                 <w:szCs w:val="18"/>
               </w:rPr>
-              <w:t>Command</w:t>
+              <w:t>Step</w:t>
             </w:r>
           </w:p>
         </w:tc>
@@ -13200,7 +14049,27 @@
                 <w:sz w:val="18"/>
                 <w:szCs w:val="18"/>
               </w:rPr>
-              <w:t>Purpose</w:t>
+              <w:t>What to check</w:t>
+            </w:r>
+          </w:p>
+        </w:tc>
+        <w:tc>
+          <w:tcPr>
+            <w:shd w:val="clear" w:color="auto" w:fill="C7000B"/>
+          </w:tcPr>
+          <w:p>
+            <w:pPr>
+              <w:jc w:val="center"/>
+            </w:pPr>
+            <w:r>
+              <w:rPr>
+                <w:rFonts w:ascii="HarmonyOS Sans" w:hAnsi="HarmonyOS Sans"/>
+                <w:b/>
+                <w:color w:val="FFFFFF"/>
+                <w:sz w:val="18"/>
+                <w:szCs w:val="18"/>
+              </w:rPr>
+              <w:t>Expected result</w:t>
             </w:r>
           </w:p>
         </w:tc>
@@ -13220,7 +14089,7 @@
                 <w:sz w:val="18"/>
                 <w:szCs w:val="18"/>
               </w:rPr>
-              <w:t>`tmux new -s &lt;name&gt;`</w:t>
+              <w:t>Gateway update</w:t>
             </w:r>
           </w:p>
         </w:tc>
@@ -13238,7 +14107,25 @@
                 <w:sz w:val="18"/>
                 <w:szCs w:val="18"/>
               </w:rPr>
-              <w:t>Start a new named session</w:t>
+              <w:t>Re-run bootstrap</w:t>
+            </w:r>
+          </w:p>
+        </w:tc>
+        <w:tc>
+          <w:tcPr>
+            <w:shd w:val="clear" w:color="auto" w:fill="FFFFFF"/>
+          </w:tcPr>
+          <w:p>
+            <w:pPr>
+              <w:jc w:val="center"/>
+            </w:pPr>
+            <w:r>
+              <w:rPr>
+                <w:rFonts w:ascii="HarmonyOS Sans" w:hAnsi="HarmonyOS Sans"/>
+                <w:sz w:val="18"/>
+                <w:szCs w:val="18"/>
+              </w:rPr>
+              <w:t>New version running</w:t>
             </w:r>
           </w:p>
         </w:tc>
@@ -13258,7 +14145,7 @@
                 <w:sz w:val="18"/>
                 <w:szCs w:val="18"/>
               </w:rPr>
-              <w:t>`tmux attach -t &lt;name&gt;`</w:t>
+              <w:t>Templates update</w:t>
             </w:r>
           </w:p>
         </w:tc>
@@ -13276,7 +14163,25 @@
                 <w:sz w:val="18"/>
                 <w:szCs w:val="18"/>
               </w:rPr>
-              <w:t>Reattach to an existing session</w:t>
+              <w:t>`git pull &amp;&amp; ./scripts/install.sh`</w:t>
+            </w:r>
+          </w:p>
+        </w:tc>
+        <w:tc>
+          <w:tcPr>
+            <w:shd w:val="clear" w:color="auto" w:fill="F6F8FA"/>
+          </w:tcPr>
+          <w:p>
+            <w:pPr>
+              <w:jc w:val="center"/>
+            </w:pPr>
+            <w:r>
+              <w:rPr>
+                <w:rFonts w:ascii="HarmonyOS Sans" w:hAnsi="HarmonyOS Sans"/>
+                <w:sz w:val="18"/>
+                <w:szCs w:val="18"/>
+              </w:rPr>
+              <w:t>New templates available</w:t>
             </w:r>
           </w:p>
         </w:tc>
@@ -13296,7 +14201,7 @@
                 <w:sz w:val="18"/>
                 <w:szCs w:val="18"/>
               </w:rPr>
-              <w:t>`tmux ls`</w:t>
+              <w:t>Gateway uninstall</w:t>
             </w:r>
           </w:p>
         </w:tc>
@@ -13314,7 +14219,25 @@
                 <w:sz w:val="18"/>
                 <w:szCs w:val="18"/>
               </w:rPr>
-              <w:t>List all sessions</w:t>
+              <w:t>`./scripts/uninstall.sh –all`</w:t>
+            </w:r>
+          </w:p>
+        </w:tc>
+        <w:tc>
+          <w:tcPr>
+            <w:shd w:val="clear" w:color="auto" w:fill="FFFFFF"/>
+          </w:tcPr>
+          <w:p>
+            <w:pPr>
+              <w:jc w:val="center"/>
+            </w:pPr>
+            <w:r>
+              <w:rPr>
+                <w:rFonts w:ascii="HarmonyOS Sans" w:hAnsi="HarmonyOS Sans"/>
+                <w:sz w:val="18"/>
+                <w:szCs w:val="18"/>
+              </w:rPr>
+              <w:t>Docker stack removed</w:t>
             </w:r>
           </w:p>
         </w:tc>
@@ -13334,7 +14257,7 @@
                 <w:sz w:val="18"/>
                 <w:szCs w:val="18"/>
               </w:rPr>
-              <w:t>`tmux kill-session -t &lt;name&gt;`</w:t>
+              <w:t>Templates uninstall</w:t>
             </w:r>
           </w:p>
         </w:tc>
@@ -13352,7 +14275,25 @@
                 <w:sz w:val="18"/>
                 <w:szCs w:val="18"/>
               </w:rPr>
-              <w:t>Kill a specific session</w:t>
+              <w:t>`./scripts/uninstall.sh –all`</w:t>
+            </w:r>
+          </w:p>
+        </w:tc>
+        <w:tc>
+          <w:tcPr>
+            <w:shd w:val="clear" w:color="auto" w:fill="F6F8FA"/>
+          </w:tcPr>
+          <w:p>
+            <w:pPr>
+              <w:jc w:val="center"/>
+            </w:pPr>
+            <w:r>
+              <w:rPr>
+                <w:rFonts w:ascii="HarmonyOS Sans" w:hAnsi="HarmonyOS Sans"/>
+                <w:sz w:val="18"/>
+                <w:szCs w:val="18"/>
+              </w:rPr>
+              <w:t>Skills + modules removed</w:t>
             </w:r>
           </w:p>
         </w:tc>
@@ -13372,7 +14313,7 @@
                 <w:sz w:val="18"/>
                 <w:szCs w:val="18"/>
               </w:rPr>
-              <w:t>`Ctrl-b d`</w:t>
+              <w:t>Cloud cleanup</w:t>
             </w:r>
           </w:p>
         </w:tc>
@@ -13390,7 +14331,25 @@
                 <w:sz w:val="18"/>
                 <w:szCs w:val="18"/>
               </w:rPr>
-              <w:t>Detach from session (keeps it running)</w:t>
+              <w:t>`flexusx-dev` deleted</w:t>
+            </w:r>
+          </w:p>
+        </w:tc>
+        <w:tc>
+          <w:tcPr>
+            <w:shd w:val="clear" w:color="auto" w:fill="FFFFFF"/>
+          </w:tcPr>
+          <w:p>
+            <w:pPr>
+              <w:jc w:val="center"/>
+            </w:pPr>
+            <w:r>
+              <w:rPr>
+                <w:rFonts w:ascii="HarmonyOS Sans" w:hAnsi="HarmonyOS Sans"/>
+                <w:sz w:val="18"/>
+                <w:szCs w:val="18"/>
+              </w:rPr>
+              <w:t>No running instance</w:t>
             </w:r>
           </w:p>
         </w:tc>
@@ -13410,7 +14369,7 @@
                 <w:sz w:val="18"/>
                 <w:szCs w:val="18"/>
               </w:rPr>
-              <w:t>`Ctrl-b c`</w:t>
+              <w:t>EIP</w:t>
             </w:r>
           </w:p>
         </w:tc>
@@ -13428,7 +14387,25 @@
                 <w:sz w:val="18"/>
                 <w:szCs w:val="18"/>
               </w:rPr>
-              <w:t>Create a new window</w:t>
+              <w:t>Released</w:t>
+            </w:r>
+          </w:p>
+        </w:tc>
+        <w:tc>
+          <w:tcPr>
+            <w:shd w:val="clear" w:color="auto" w:fill="F6F8FA"/>
+          </w:tcPr>
+          <w:p>
+            <w:pPr>
+              <w:jc w:val="center"/>
+            </w:pPr>
+            <w:r>
+              <w:rPr>
+                <w:rFonts w:ascii="HarmonyOS Sans" w:hAnsi="HarmonyOS Sans"/>
+                <w:sz w:val="18"/>
+                <w:szCs w:val="18"/>
+              </w:rPr>
+              <w:t>No public IP charges</w:t>
             </w:r>
           </w:p>
         </w:tc>
@@ -13448,7 +14425,7 @@
                 <w:sz w:val="18"/>
                 <w:szCs w:val="18"/>
               </w:rPr>
-              <w:t>`Ctrl-b %`</w:t>
+              <w:t>Security group</w:t>
             </w:r>
           </w:p>
         </w:tc>
@@ -13466,7 +14443,25 @@
                 <w:sz w:val="18"/>
                 <w:szCs w:val="18"/>
               </w:rPr>
-              <w:t>Split pane vertically</w:t>
+              <w:t>`sg-xgate` deleted</w:t>
+            </w:r>
+          </w:p>
+        </w:tc>
+        <w:tc>
+          <w:tcPr>
+            <w:shd w:val="clear" w:color="auto" w:fill="FFFFFF"/>
+          </w:tcPr>
+          <w:p>
+            <w:pPr>
+              <w:jc w:val="center"/>
+            </w:pPr>
+            <w:r>
+              <w:rPr>
+                <w:rFonts w:ascii="HarmonyOS Sans" w:hAnsi="HarmonyOS Sans"/>
+                <w:sz w:val="18"/>
+                <w:szCs w:val="18"/>
+              </w:rPr>
+              <w:t>No SG charges</w:t>
             </w:r>
           </w:p>
         </w:tc>
@@ -13486,7 +14481,7 @@
                 <w:sz w:val="18"/>
                 <w:szCs w:val="18"/>
               </w:rPr>
-              <w:t>`Ctrl-b "`</w:t>
+              <w:t>SSH config</w:t>
             </w:r>
           </w:p>
         </w:tc>
@@ -13504,15 +14499,13 @@
                 <w:sz w:val="18"/>
                 <w:szCs w:val="18"/>
               </w:rPr>
-              <w:t>Split pane horizontally</w:t>
-            </w:r>
-          </w:p>
-        </w:tc>
-      </w:tr>
-      <w:tr>
-        <w:tc>
-          <w:tcPr>
-            <w:shd w:val="clear" w:color="auto" w:fill="FFFFFF"/>
+              <w:t>Host entry removed</w:t>
+            </w:r>
+          </w:p>
+        </w:tc>
+        <w:tc>
+          <w:tcPr>
+            <w:shd w:val="clear" w:color="auto" w:fill="F6F8FA"/>
           </w:tcPr>
           <w:p>
             <w:pPr>
@@ -13524,101 +14517,7 @@
                 <w:sz w:val="18"/>
                 <w:szCs w:val="18"/>
               </w:rPr>
-              <w:t>`Ctrl-b n`</w:t>
-            </w:r>
-          </w:p>
-        </w:tc>
-        <w:tc>
-          <w:tcPr>
-            <w:shd w:val="clear" w:color="auto" w:fill="FFFFFF"/>
-          </w:tcPr>
-          <w:p>
-            <w:pPr>
-              <w:jc w:val="center"/>
-            </w:pPr>
-            <w:r>
-              <w:rPr>
-                <w:rFonts w:ascii="HarmonyOS Sans" w:hAnsi="HarmonyOS Sans"/>
-                <w:sz w:val="18"/>
-                <w:szCs w:val="18"/>
-              </w:rPr>
-              <w:t>Next window</w:t>
-            </w:r>
-          </w:p>
-        </w:tc>
-      </w:tr>
-      <w:tr>
-        <w:tc>
-          <w:tcPr>
-            <w:shd w:val="clear" w:color="auto" w:fill="F6F8FA"/>
-          </w:tcPr>
-          <w:p>
-            <w:pPr>
-              <w:jc w:val="center"/>
-            </w:pPr>
-            <w:r>
-              <w:rPr>
-                <w:rFonts w:ascii="HarmonyOS Sans" w:hAnsi="HarmonyOS Sans"/>
-                <w:sz w:val="18"/>
-                <w:szCs w:val="18"/>
-              </w:rPr>
-              <w:t>`Ctrl-b p`</w:t>
-            </w:r>
-          </w:p>
-        </w:tc>
-        <w:tc>
-          <w:tcPr>
-            <w:shd w:val="clear" w:color="auto" w:fill="F6F8FA"/>
-          </w:tcPr>
-          <w:p>
-            <w:pPr>
-              <w:jc w:val="center"/>
-            </w:pPr>
-            <w:r>
-              <w:rPr>
-                <w:rFonts w:ascii="HarmonyOS Sans" w:hAnsi="HarmonyOS Sans"/>
-                <w:sz w:val="18"/>
-                <w:szCs w:val="18"/>
-              </w:rPr>
-              <w:t>Previous window</w:t>
-            </w:r>
-          </w:p>
-        </w:tc>
-      </w:tr>
-      <w:tr>
-        <w:tc>
-          <w:tcPr>
-            <w:shd w:val="clear" w:color="auto" w:fill="FFFFFF"/>
-          </w:tcPr>
-          <w:p>
-            <w:pPr>
-              <w:jc w:val="center"/>
-            </w:pPr>
-            <w:r>
-              <w:rPr>
-                <w:rFonts w:ascii="HarmonyOS Sans" w:hAnsi="HarmonyOS Sans"/>
-                <w:sz w:val="18"/>
-                <w:szCs w:val="18"/>
-              </w:rPr>
-              <w:t>`Ctrl-b [`</w:t>
-            </w:r>
-          </w:p>
-        </w:tc>
-        <w:tc>
-          <w:tcPr>
-            <w:shd w:val="clear" w:color="auto" w:fill="FFFFFF"/>
-          </w:tcPr>
-          <w:p>
-            <w:pPr>
-              <w:jc w:val="center"/>
-            </w:pPr>
-            <w:r>
-              <w:rPr>
-                <w:rFonts w:ascii="HarmonyOS Sans" w:hAnsi="HarmonyOS Sans"/>
-                <w:sz w:val="18"/>
-                <w:szCs w:val="18"/>
-              </w:rPr>
-              <w:t>Enter scroll/copy mode</w:t>
+              <w:t>Clean config</w:t>
             </w:r>
           </w:p>
         </w:tc>
@@ -13626,936 +14525,87 @@
     </w:tbl>
     <w:p>
       <w:pPr>
-        <w:pStyle w:val="Heading3"/>
-      </w:pPr>
-      <w:bookmarkStart w:id="132" w:name="tmux-configuration-for-opencode"/>
-      <w:r>
-        <w:t xml:space="preserve">7.1.2</w:t>
-      </w:r>
-      <w:r>
-        <w:t xml:space="preserve"> tmux configuration for opencode</w:t>
-      </w:r>
-      <w:bookmarkEnd w:id="132"/>
-    </w:p>
-    <w:p>
-      <w:pPr>
         <w:pStyle w:val="BodyText"/>
       </w:pPr>
       <w:r>
-        <w:t xml:space="preserve">Create or edit</w:t>
-      </w:r>
-      <w:r>
-        <w:t xml:space="preserve"> </w:t>
-      </w:r>
-      <w:r>
-        <w:rPr>
-          <w:rStyle w:val="VerbatimChar"/>
-        </w:rPr>
-        <w:t xml:space="preserve">\textasciitilde/.tmux.conf</w:t>
-      </w:r>
-      <w:r>
-        <w:t xml:space="preserve"> </w:t>
-      </w:r>
-      <w:r>
-        <w:t xml:space="preserve">with the following</w:t>
-      </w:r>
-      <w:r>
-        <w:t xml:space="preserve"> </w:t>
-      </w:r>
-      <w:r>
-        <w:t xml:space="preserve">settings to optimize tmux for use with opencode:</w:t>
-      </w:r>
-    </w:p>
-    <w:p>
-      <w:pPr>
-        <w:pStyle w:val="SourceCode"/>
-      </w:pPr>
-      <w:r>
-        <w:rPr>
-          <w:rStyle w:val="CommentTok"/>
-        </w:rPr>
-        <w:t xml:space="preserve"># Reduce escape key delay — critical for opencode (default is 500ms)</w:t>
-      </w:r>
-      <w:r>
-        <w:br/>
-      </w:r>
-      <w:r>
-        <w:rPr>
-          <w:rStyle w:val="BuiltInTok"/>
-        </w:rPr>
-        <w:t xml:space="preserve">set</w:t>
-      </w:r>
-      <w:r>
-        <w:rPr>
-          <w:rStyle w:val="NormalTok"/>
-        </w:rPr>
-        <w:t xml:space="preserve"> </w:t>
-      </w:r>
-      <w:r>
-        <w:rPr>
-          <w:rStyle w:val="AttributeTok"/>
-        </w:rPr>
-        <w:t xml:space="preserve">-g</w:t>
-      </w:r>
-      <w:r>
-        <w:rPr>
-          <w:rStyle w:val="NormalTok"/>
-        </w:rPr>
-        <w:t xml:space="preserve"> escape-time 10</w:t>
-      </w:r>
-      <w:r>
-        <w:br/>
-      </w:r>
-      <w:r>
-        <w:br/>
-      </w:r>
-      <w:r>
-        <w:rPr>
-          <w:rStyle w:val="CommentTok"/>
-        </w:rPr>
-        <w:t xml:space="preserve"># Enable mouse support (scroll, select panes, resize)</w:t>
-      </w:r>
-      <w:r>
-        <w:br/>
-      </w:r>
-      <w:r>
-        <w:rPr>
-          <w:rStyle w:val="BuiltInTok"/>
-        </w:rPr>
-        <w:t xml:space="preserve">set</w:t>
-      </w:r>
-      <w:r>
-        <w:rPr>
-          <w:rStyle w:val="NormalTok"/>
-        </w:rPr>
-        <w:t xml:space="preserve"> </w:t>
-      </w:r>
-      <w:r>
-        <w:rPr>
-          <w:rStyle w:val="AttributeTok"/>
-        </w:rPr>
-        <w:t xml:space="preserve">-g</w:t>
-      </w:r>
-      <w:r>
-        <w:rPr>
-          <w:rStyle w:val="NormalTok"/>
-        </w:rPr>
-        <w:t xml:space="preserve"> mouse on</w:t>
-      </w:r>
-      <w:r>
-        <w:br/>
-      </w:r>
-      <w:r>
-        <w:br/>
-      </w:r>
-      <w:r>
-        <w:rPr>
-          <w:rStyle w:val="CommentTok"/>
-        </w:rPr>
-        <w:t xml:space="preserve"># Enable clipboard integration (tmux 2.9+)</w:t>
-      </w:r>
-      <w:r>
-        <w:br/>
-      </w:r>
-      <w:r>
-        <w:rPr>
-          <w:rStyle w:val="BuiltInTok"/>
-        </w:rPr>
-        <w:t xml:space="preserve">set</w:t>
-      </w:r>
-      <w:r>
-        <w:rPr>
-          <w:rStyle w:val="NormalTok"/>
-        </w:rPr>
-        <w:t xml:space="preserve"> </w:t>
-      </w:r>
-      <w:r>
-        <w:rPr>
-          <w:rStyle w:val="AttributeTok"/>
-        </w:rPr>
-        <w:t xml:space="preserve">-g</w:t>
-      </w:r>
-      <w:r>
-        <w:rPr>
-          <w:rStyle w:val="NormalTok"/>
-        </w:rPr>
-        <w:t xml:space="preserve"> set-clipboard on</w:t>
-      </w:r>
-      <w:r>
-        <w:br/>
-      </w:r>
-      <w:r>
-        <w:br/>
-      </w:r>
-      <w:r>
-        <w:rPr>
-          <w:rStyle w:val="CommentTok"/>
-        </w:rPr>
-        <w:t xml:space="preserve"># Allow nested apps to access system clipboard (WSL2 with WSLg)</w:t>
-      </w:r>
-      <w:r>
-        <w:br/>
-      </w:r>
-      <w:r>
-        <w:rPr>
-          <w:rStyle w:val="BuiltInTok"/>
-        </w:rPr>
-        <w:t xml:space="preserve">set</w:t>
-      </w:r>
-      <w:r>
-        <w:rPr>
-          <w:rStyle w:val="NormalTok"/>
-        </w:rPr>
-        <w:t xml:space="preserve"> </w:t>
-      </w:r>
-      <w:r>
-        <w:rPr>
-          <w:rStyle w:val="AttributeTok"/>
-        </w:rPr>
-        <w:t xml:space="preserve">-g</w:t>
-      </w:r>
-      <w:r>
-        <w:rPr>
-          <w:rStyle w:val="NormalTok"/>
-        </w:rPr>
-        <w:t xml:space="preserve"> allow-passthrough on</w:t>
-      </w:r>
-      <w:r>
-        <w:br/>
-      </w:r>
-      <w:r>
-        <w:br/>
-      </w:r>
-      <w:r>
-        <w:rPr>
-          <w:rStyle w:val="CommentTok"/>
-        </w:rPr>
-        <w:t xml:space="preserve"># Enable extended keys so Shift+Enter works in opencode</w:t>
-      </w:r>
-      <w:r>
-        <w:br/>
-      </w:r>
-      <w:r>
-        <w:rPr>
-          <w:rStyle w:val="BuiltInTok"/>
-        </w:rPr>
-        <w:t xml:space="preserve">set</w:t>
-      </w:r>
-      <w:r>
-        <w:rPr>
-          <w:rStyle w:val="NormalTok"/>
-        </w:rPr>
-        <w:t xml:space="preserve"> </w:t>
-      </w:r>
-      <w:r>
-        <w:rPr>
-          <w:rStyle w:val="AttributeTok"/>
-        </w:rPr>
-        <w:t xml:space="preserve">-s</w:t>
-      </w:r>
-      <w:r>
-        <w:rPr>
-          <w:rStyle w:val="NormalTok"/>
-        </w:rPr>
-        <w:t xml:space="preserve"> extended-keys on</w:t>
-      </w:r>
-      <w:r>
-        <w:br/>
-      </w:r>
-      <w:r>
-        <w:rPr>
-          <w:rStyle w:val="BuiltInTok"/>
-        </w:rPr>
-        <w:t xml:space="preserve">set</w:t>
-      </w:r>
-      <w:r>
-        <w:rPr>
-          <w:rStyle w:val="NormalTok"/>
-        </w:rPr>
-        <w:t xml:space="preserve"> </w:t>
-      </w:r>
-      <w:r>
-        <w:rPr>
-          <w:rStyle w:val="AttributeTok"/>
-        </w:rPr>
-        <w:t xml:space="preserve">-as</w:t>
-      </w:r>
-      <w:r>
-        <w:rPr>
-          <w:rStyle w:val="NormalTok"/>
-        </w:rPr>
-        <w:t xml:space="preserve"> terminal-features </w:t>
-      </w:r>
-      <w:r>
-        <w:rPr>
-          <w:rStyle w:val="StringTok"/>
-        </w:rPr>
-        <w:t xml:space="preserve">'xterm*:extkeys'</w:t>
-      </w:r>
-      <w:r>
-        <w:br/>
-      </w:r>
-      <w:r>
-        <w:br/>
-      </w:r>
-      <w:r>
-        <w:rPr>
-          <w:rStyle w:val="CommentTok"/>
-        </w:rPr>
-        <w:t xml:space="preserve"># Use CSI-u encoding format (requires tmux 3.5+)</w:t>
-      </w:r>
-      <w:r>
-        <w:br/>
-      </w:r>
-      <w:r>
-        <w:rPr>
-          <w:rStyle w:val="BuiltInTok"/>
-        </w:rPr>
-        <w:t xml:space="preserve">set</w:t>
-      </w:r>
-      <w:r>
-        <w:rPr>
-          <w:rStyle w:val="NormalTok"/>
-        </w:rPr>
-        <w:t xml:space="preserve"> </w:t>
-      </w:r>
-      <w:r>
-        <w:rPr>
-          <w:rStyle w:val="AttributeTok"/>
-        </w:rPr>
-        <w:t xml:space="preserve">-s</w:t>
-      </w:r>
-      <w:r>
-        <w:rPr>
-          <w:rStyle w:val="NormalTok"/>
-        </w:rPr>
-        <w:t xml:space="preserve"> extended-keys-format csi-u</w:t>
-      </w:r>
-    </w:p>
-    <w:p>
-      <w:pPr>
-        <w:pStyle w:val="FirstParagraph"/>
-      </w:pPr>
-      <w:r>
-        <w:t xml:space="preserve">After editing the config, reload it without restarting tmux:</w:t>
-      </w:r>
-    </w:p>
-    <w:p>
-      <w:pPr>
-        <w:pStyle w:val="SourceCode"/>
-      </w:pPr>
-      <w:r>
-        <w:rPr>
-          <w:rStyle w:val="ExtensionTok"/>
-        </w:rPr>
-        <w:t xml:space="preserve">tmux</w:t>
-      </w:r>
-      <w:r>
-        <w:rPr>
-          <w:rStyle w:val="NormalTok"/>
-        </w:rPr>
-        <w:t xml:space="preserve"> source-file ~/.tmux.conf</w:t>
-      </w:r>
-    </w:p>
-    <w:tbl>
-      <w:tblPr>
-        <w:tblW w:w="9638" w:type="dxa"/>
-        <w:tblLayout w:type="fixed"/>
-        <w:tblBorders>
-          <w:top w:val="none" w:sz="0" w:space="0" w:color="auto"/>
-          <w:left w:val="single" w:sz="24" w:space="0" w:color="F57C00"/>
-          <w:bottom w:val="none" w:sz="0" w:space="0" w:color="auto"/>
-          <w:right w:val="none" w:sz="0" w:space="0" w:color="auto"/>
-        </w:tblBorders>
-        <w:tblCellMar>
-          <w:top w:w="120" w:type="dxa"/>
-          <w:left w:w="160" w:type="dxa"/>
-          <w:bottom w:w="120" w:type="dxa"/>
-          <w:right w:w="160" w:type="dxa"/>
-        </w:tblCellMar>
-      </w:tblPr>
-      <w:tr>
-        <w:tc>
-          <w:tcPr>
-            <w:tcW w:w="9638" w:type="dxa"/>
-            <w:shd w:val="clear" w:color="auto" w:fill="FFF8E1"/>
-          </w:tcPr>
-          <w:p>
-            <w:r>
-              <w:rPr>
-                <w:rFonts w:ascii="HarmonyOS Sans" w:hAnsi="HarmonyOS Sans"/>
-                <w:b/>
-                <w:color w:val="C7000B"/>
-                <w:sz w:val="21"/>
-                <w:szCs w:val="21"/>
-              </w:rPr>
-              <w:t>Important</w:t>
-            </w:r>
-          </w:p>
-          <w:p>
-            <w:pPr>
-              <w:pStyle w:val="FirstParagraph"/>
-            </w:pPr>
-            <w:r>
-              <w:t xml:space="preserve">The</w:t>
-            </w:r>
-            <w:r>
-              <w:t xml:space="preserve"> </w:t>
-            </w:r>
-            <w:r>
-              <w:rPr>
-                <w:rStyle w:val="VerbatimChar"/>
-              </w:rPr>
-              <w:t xml:space="preserve">escape-time</w:t>
-            </w:r>
-            <w:r>
-              <w:t xml:space="preserve"> </w:t>
-            </w:r>
-            <w:r>
-              <w:t xml:space="preserve">setting is critical. The default 500ms delay</w:t>
-            </w:r>
-            <w:r>
-              <w:t xml:space="preserve"> </w:t>
-            </w:r>
-            <w:r>
-              <w:t xml:space="preserve">causes opencode to receive Escape key presses late, which breaks modal</w:t>
-            </w:r>
-            <w:r>
-              <w:t xml:space="preserve"> </w:t>
-            </w:r>
-            <w:r>
-              <w:t xml:space="preserve">editing and menu navigation. Always set it to</w:t>
-            </w:r>
-            <w:r>
-              <w:t xml:space="preserve"> </w:t>
-            </w:r>
-            <w:r>
-              <w:rPr>
-                <w:rStyle w:val="VerbatimChar"/>
-              </w:rPr>
-              <w:t xml:space="preserve">10</w:t>
-            </w:r>
-            <w:r>
-              <w:t xml:space="preserve"> </w:t>
-            </w:r>
-            <w:r>
-              <w:t xml:space="preserve">or lower.</w:t>
-            </w:r>
-          </w:p>
-        </w:tc>
-      </w:tr>
-    </w:tbl>
-    <w:p>
-      <w:pPr>
-        <w:spacing w:before="120" w:after="0"/>
-      </w:pPr>
-    </w:p>
-    <w:tbl>
-      <w:tblPr>
-        <w:tblW w:w="9638" w:type="dxa"/>
-        <w:tblLayout w:type="fixed"/>
-        <w:tblBorders>
-          <w:top w:val="none" w:sz="0" w:space="0" w:color="auto"/>
-          <w:left w:val="single" w:sz="24" w:space="0" w:color="F57C00"/>
-          <w:bottom w:val="none" w:sz="0" w:space="0" w:color="auto"/>
-          <w:right w:val="none" w:sz="0" w:space="0" w:color="auto"/>
-        </w:tblBorders>
-        <w:tblCellMar>
-          <w:top w:w="120" w:type="dxa"/>
-          <w:left w:w="160" w:type="dxa"/>
-          <w:bottom w:w="120" w:type="dxa"/>
-          <w:right w:w="160" w:type="dxa"/>
-        </w:tblCellMar>
-      </w:tblPr>
-      <w:tr>
-        <w:tc>
-          <w:tcPr>
-            <w:tcW w:w="9638" w:type="dxa"/>
-            <w:shd w:val="clear" w:color="auto" w:fill="FFF8E1"/>
-          </w:tcPr>
-          <w:p>
-            <w:r>
-              <w:rPr>
-                <w:rFonts w:ascii="HarmonyOS Sans" w:hAnsi="HarmonyOS Sans"/>
-                <w:b/>
-                <w:color w:val="C7000B"/>
-                <w:sz w:val="21"/>
-                <w:szCs w:val="21"/>
-              </w:rPr>
-              <w:t>Important</w:t>
-            </w:r>
-          </w:p>
-          <w:p>
-            <w:pPr>
-              <w:pStyle w:val="BodyText"/>
-            </w:pPr>
-            <w:r>
-              <w:t xml:space="preserve">The</w:t>
-            </w:r>
-            <w:r>
-              <w:t xml:space="preserve"> </w:t>
-            </w:r>
-            <w:r>
-              <w:rPr>
-                <w:rStyle w:val="VerbatimChar"/>
-              </w:rPr>
-              <w:t xml:space="preserve">extended-keys-format csi-u</w:t>
-            </w:r>
-            <w:r>
-              <w:t xml:space="preserve"> </w:t>
-            </w:r>
-            <w:r>
-              <w:t xml:space="preserve">setting requires</w:t>
-            </w:r>
-            <w:r>
-              <w:t xml:space="preserve"> </w:t>
-            </w:r>
-            <w:r>
-              <w:rPr>
-                <w:bCs/>
-                <w:b/>
-              </w:rPr>
-              <w:t xml:space="preserve">tmux 3.5</w:t>
-            </w:r>
-            <w:r>
-              <w:rPr>
-                <w:bCs/>
-                <w:b/>
-              </w:rPr>
-              <w:t xml:space="preserve"> </w:t>
-            </w:r>
-            <w:r>
-              <w:rPr>
-                <w:bCs/>
-                <w:b/>
-              </w:rPr>
-              <w:t xml:space="preserve">or later</w:t>
-            </w:r>
-            <w:r>
-              <w:t xml:space="preserve">. If you get an</w:t>
-            </w:r>
-            <w:r>
-              <w:t xml:space="preserve"> </w:t>
-            </w:r>
-            <w:r>
-              <w:rPr>
-                <w:rStyle w:val="VerbatimChar"/>
-              </w:rPr>
-              <w:t xml:space="preserve">invalid option: extended-keys-format</w:t>
-            </w:r>
-            <w:r>
-              <w:t xml:space="preserve"> </w:t>
-            </w:r>
-            <w:r>
-              <w:t xml:space="preserve">error, your tmux is too old. Check with</w:t>
-            </w:r>
-            <w:r>
-              <w:t xml:space="preserve"> </w:t>
-            </w:r>
-            <w:r>
-              <w:rPr>
-                <w:rStyle w:val="VerbatimChar"/>
-              </w:rPr>
-              <w:t xml:space="preserve">tmux -V</w:t>
-            </w:r>
-            <w:r>
-              <w:t xml:space="preserve">. To upgrade</w:t>
-            </w:r>
-            <w:r>
-              <w:t xml:space="preserve"> </w:t>
-            </w:r>
-            <w:r>
-              <w:t xml:space="preserve">tmux to 3.5+ from source:</w:t>
-            </w:r>
-          </w:p>
-          <w:p>
-            <w:pPr>
-              <w:pStyle w:val="SourceCode"/>
-            </w:pPr>
-            <w:r>
-              <w:rPr>
-                <w:rStyle w:val="FunctionTok"/>
-              </w:rPr>
-              <w:t xml:space="preserve">sudo</w:t>
-            </w:r>
-            <w:r>
-              <w:rPr>
-                <w:rStyle w:val="NormalTok"/>
-              </w:rPr>
-              <w:t xml:space="preserve"> apt install build-essential autotools-dev libevent-dev libncurses-dev</w:t>
-            </w:r>
-            <w:r>
-              <w:br/>
-            </w:r>
-            <w:r>
-              <w:rPr>
-                <w:rStyle w:val="BuiltInTok"/>
-              </w:rPr>
-              <w:t xml:space="preserve">cd</w:t>
-            </w:r>
-            <w:r>
-              <w:rPr>
-                <w:rStyle w:val="NormalTok"/>
-              </w:rPr>
-              <w:t xml:space="preserve"> /tmp </w:t>
-            </w:r>
-            <w:r>
-              <w:rPr>
-                <w:rStyle w:val="KeywordTok"/>
-              </w:rPr>
-              <w:t xml:space="preserve">&amp;&amp;</w:t>
-            </w:r>
-            <w:r>
-              <w:rPr>
-                <w:rStyle w:val="NormalTok"/>
-              </w:rPr>
-              <w:t xml:space="preserve"> </w:t>
-            </w:r>
-            <w:r>
-              <w:rPr>
-                <w:rStyle w:val="FunctionTok"/>
-              </w:rPr>
-              <w:t xml:space="preserve">git</w:t>
-            </w:r>
-            <w:r>
-              <w:rPr>
-                <w:rStyle w:val="NormalTok"/>
-              </w:rPr>
-              <w:t xml:space="preserve"> clone https://github.com/tmux/tmux.git </w:t>
-            </w:r>
-            <w:r>
-              <w:rPr>
-                <w:rStyle w:val="KeywordTok"/>
-              </w:rPr>
-              <w:t xml:space="preserve">&amp;&amp;</w:t>
-            </w:r>
-            <w:r>
-              <w:rPr>
-                <w:rStyle w:val="NormalTok"/>
-              </w:rPr>
-              <w:t xml:space="preserve"> </w:t>
-            </w:r>
-            <w:r>
-              <w:rPr>
-                <w:rStyle w:val="BuiltInTok"/>
-              </w:rPr>
-              <w:t xml:space="preserve">cd</w:t>
-            </w:r>
-            <w:r>
-              <w:rPr>
-                <w:rStyle w:val="NormalTok"/>
-              </w:rPr>
-              <w:t xml:space="preserve"> tmux</w:t>
-            </w:r>
-            <w:r>
-              <w:br/>
-            </w:r>
-            <w:r>
-              <w:rPr>
-                <w:rStyle w:val="FunctionTok"/>
-              </w:rPr>
-              <w:t xml:space="preserve">sh</w:t>
-            </w:r>
-            <w:r>
-              <w:rPr>
-                <w:rStyle w:val="NormalTok"/>
-              </w:rPr>
-              <w:t xml:space="preserve"> autogen.sh </w:t>
-            </w:r>
-            <w:r>
-              <w:rPr>
-                <w:rStyle w:val="KeywordTok"/>
-              </w:rPr>
-              <w:t xml:space="preserve">&amp;&amp;</w:t>
-            </w:r>
-            <w:r>
-              <w:rPr>
-                <w:rStyle w:val="NormalTok"/>
-              </w:rPr>
-              <w:t xml:space="preserve"> </w:t>
-            </w:r>
-            <w:r>
-              <w:rPr>
-                <w:rStyle w:val="ExtensionTok"/>
-              </w:rPr>
-              <w:t xml:space="preserve">./configure</w:t>
-            </w:r>
-            <w:r>
-              <w:rPr>
-                <w:rStyle w:val="NormalTok"/>
-              </w:rPr>
-              <w:t xml:space="preserve"> </w:t>
-            </w:r>
-            <w:r>
-              <w:rPr>
-                <w:rStyle w:val="KeywordTok"/>
-              </w:rPr>
-              <w:t xml:space="preserve">&amp;&amp;</w:t>
-            </w:r>
-            <w:r>
-              <w:rPr>
-                <w:rStyle w:val="NormalTok"/>
-              </w:rPr>
-              <w:t xml:space="preserve"> </w:t>
-            </w:r>
-            <w:r>
-              <w:rPr>
-                <w:rStyle w:val="FunctionTok"/>
-              </w:rPr>
-              <w:t xml:space="preserve">make</w:t>
-            </w:r>
-            <w:r>
-              <w:rPr>
-                <w:rStyle w:val="NormalTok"/>
-              </w:rPr>
-              <w:t xml:space="preserve"> </w:t>
-            </w:r>
-            <w:r>
-              <w:rPr>
-                <w:rStyle w:val="KeywordTok"/>
-              </w:rPr>
-              <w:t xml:space="preserve">&amp;&amp;</w:t>
-            </w:r>
-            <w:r>
-              <w:rPr>
-                <w:rStyle w:val="NormalTok"/>
-              </w:rPr>
-              <w:t xml:space="preserve"> </w:t>
-            </w:r>
-            <w:r>
-              <w:rPr>
-                <w:rStyle w:val="FunctionTok"/>
-              </w:rPr>
-              <w:t xml:space="preserve">sudo</w:t>
-            </w:r>
-            <w:r>
-              <w:rPr>
-                <w:rStyle w:val="NormalTok"/>
-              </w:rPr>
-              <w:t xml:space="preserve"> make install</w:t>
-            </w:r>
-          </w:p>
-          <w:p>
-            <w:pPr>
-              <w:pStyle w:val="FirstParagraph"/>
-            </w:pPr>
-            <w:r>
-              <w:t xml:space="preserve">After upgrading, remove the old binary from</w:t>
-            </w:r>
-            <w:r>
-              <w:t xml:space="preserve"> </w:t>
-            </w:r>
-            <w:r>
-              <w:rPr>
-                <w:rStyle w:val="VerbatimChar"/>
-              </w:rPr>
-              <w:t xml:space="preserve">/usr/bin/tmux</w:t>
-            </w:r>
-            <w:r>
-              <w:t xml:space="preserve"> </w:t>
-            </w:r>
-            <w:r>
-              <w:t xml:space="preserve">if</w:t>
-            </w:r>
-            <w:r>
-              <w:t xml:space="preserve"> </w:t>
-            </w:r>
-            <w:r>
-              <w:t xml:space="preserve">needed (</w:t>
-            </w:r>
-            <w:r>
-              <w:rPr>
-                <w:rStyle w:val="VerbatimChar"/>
-              </w:rPr>
-              <w:t xml:space="preserve">which tmux</w:t>
-            </w:r>
-            <w:r>
-              <w:t xml:space="preserve"> </w:t>
-            </w:r>
-            <w:r>
-              <w:t xml:space="preserve">should point to</w:t>
-            </w:r>
-            <w:r>
-              <w:t xml:space="preserve"> </w:t>
-            </w:r>
-            <w:r>
-              <w:rPr>
-                <w:rStyle w:val="VerbatimChar"/>
-              </w:rPr>
-              <w:t xml:space="preserve">/usr/local/bin/tmux</w:t>
-            </w:r>
-            <w:r>
-              <w:t xml:space="preserve">).</w:t>
-            </w:r>
-            <w:r>
-              <w:t xml:space="preserve"> </w:t>
-            </w:r>
-            <w:r>
-              <w:t xml:space="preserve">Then reload the config:</w:t>
-            </w:r>
-            <w:r>
-              <w:t xml:space="preserve"> </w:t>
-            </w:r>
-            <w:r>
-              <w:rPr>
-                <w:rStyle w:val="VerbatimChar"/>
-              </w:rPr>
-              <w:t xml:space="preserve">tmux source-file  /.tmux.conf</w:t>
-            </w:r>
-            <w:r>
-              <w:t xml:space="preserve">.</w:t>
-            </w:r>
-          </w:p>
-        </w:tc>
-      </w:tr>
-    </w:tbl>
-    <w:p>
-      <w:pPr>
-        <w:spacing w:before="120" w:after="0"/>
-      </w:pPr>
-    </w:p>
-    <w:tbl>
-      <w:tblPr>
-        <w:tblW w:w="9638" w:type="dxa"/>
-        <w:tblLayout w:type="fixed"/>
-        <w:tblBorders>
-          <w:top w:val="none" w:sz="0" w:space="0" w:color="auto"/>
-          <w:left w:val="single" w:sz="24" w:space="0" w:color="2E7D32"/>
-          <w:bottom w:val="none" w:sz="0" w:space="0" w:color="auto"/>
-          <w:right w:val="none" w:sz="0" w:space="0" w:color="auto"/>
-        </w:tblBorders>
-        <w:tblCellMar>
-          <w:top w:w="120" w:type="dxa"/>
-          <w:left w:w="160" w:type="dxa"/>
-          <w:bottom w:w="120" w:type="dxa"/>
-          <w:right w:w="160" w:type="dxa"/>
-        </w:tblCellMar>
-      </w:tblPr>
-      <w:tr>
-        <w:tc>
-          <w:tcPr>
-            <w:tcW w:w="9638" w:type="dxa"/>
-            <w:shd w:val="clear" w:color="auto" w:fill="E8F5E9"/>
-          </w:tcPr>
-          <w:p>
-            <w:r>
-              <w:rPr>
-                <w:rFonts w:ascii="HarmonyOS Sans" w:hAnsi="HarmonyOS Sans"/>
-                <w:b/>
-                <w:color w:val="2E7D32"/>
-                <w:sz w:val="21"/>
-                <w:szCs w:val="21"/>
-              </w:rPr>
-              <w:t>Tip</w:t>
-            </w:r>
-          </w:p>
-          <w:p>
-            <w:pPr>
-              <w:pStyle w:val="BodyText"/>
-            </w:pPr>
-            <w:r>
-              <w:t xml:space="preserve">If you cannot upgrade tmux, use</w:t>
-            </w:r>
-            <w:r>
-              <w:t xml:space="preserve"> </w:t>
-            </w:r>
-            <w:r>
-              <w:rPr>
-                <w:rStyle w:val="VerbatimChar"/>
-              </w:rPr>
-              <w:t xml:space="preserve">Ctrl+J</w:t>
-            </w:r>
-            <w:r>
-              <w:t xml:space="preserve"> </w:t>
-            </w:r>
-            <w:r>
-              <w:t xml:space="preserve">to insert a newline</w:t>
-            </w:r>
-            <w:r>
-              <w:t xml:space="preserve"> </w:t>
-            </w:r>
-            <w:r>
-              <w:t xml:space="preserve">in opencode — it works with zero configuration on any tmux version.</w:t>
-            </w:r>
-          </w:p>
-        </w:tc>
-      </w:tr>
-    </w:tbl>
-    <w:p>
-      <w:pPr>
-        <w:spacing w:before="120" w:after="0"/>
-      </w:pPr>
-    </w:p>
-    <w:tbl>
-      <w:tblPr>
-        <w:tblW w:w="9638" w:type="dxa"/>
-        <w:tblLayout w:type="fixed"/>
-        <w:tblBorders>
-          <w:top w:val="none" w:sz="0" w:space="0" w:color="auto"/>
-          <w:left w:val="single" w:sz="24" w:space="0" w:color="1565C0"/>
-          <w:bottom w:val="none" w:sz="0" w:space="0" w:color="auto"/>
-          <w:right w:val="none" w:sz="0" w:space="0" w:color="auto"/>
-        </w:tblBorders>
-        <w:tblCellMar>
-          <w:top w:w="120" w:type="dxa"/>
-          <w:left w:w="160" w:type="dxa"/>
-          <w:bottom w:w="120" w:type="dxa"/>
-          <w:right w:w="160" w:type="dxa"/>
-        </w:tblCellMar>
-      </w:tblPr>
-      <w:tr>
-        <w:tc>
-          <w:tcPr>
-            <w:tcW w:w="9638" w:type="dxa"/>
-            <w:shd w:val="clear" w:color="auto" w:fill="E3F2FD"/>
-          </w:tcPr>
-          <w:p>
-            <w:r>
-              <w:rPr>
-                <w:rFonts w:ascii="HarmonyOS Sans" w:hAnsi="HarmonyOS Sans"/>
-                <w:b/>
-                <w:color w:val="1565C0"/>
-                <w:sz w:val="21"/>
-                <w:szCs w:val="21"/>
-              </w:rPr>
-              <w:t>Info</w:t>
-            </w:r>
-          </w:p>
-          <w:p>
-            <w:pPr>
-              <w:pStyle w:val="BodyText"/>
-            </w:pPr>
-            <w:r>
-              <w:t xml:space="preserve">For more tips on using tmux with opencode, including WSL2 clipboard</w:t>
-            </w:r>
-            <w:r>
-              <w:t xml:space="preserve"> </w:t>
-            </w:r>
-            <w:r>
-              <w:t xml:space="preserve">integration and keybinding workflows, see</w:t>
-            </w:r>
-            <w:r>
-              <w:t xml:space="preserve"> </w:t>
-            </w:r>
-            <w:hyperlink r:id="rId42">
-              <w:r>
-                <w:rPr>
-                  <w:rStyle w:val="Hyperlink"/>
-                </w:rPr>
-                <w:t xml:space="preserve">Luke Manning’s blog post</w:t>
-              </w:r>
-            </w:hyperlink>
-            <w:r>
-              <w:t xml:space="preserve">.</w:t>
-            </w:r>
-          </w:p>
-        </w:tc>
-      </w:tr>
-    </w:tbl>
-    <w:p>
-      <w:pPr>
-        <w:spacing w:before="120" w:after="0"/>
-      </w:pPr>
+        <w:rPr>
+          <w:iCs/>
+          <w:i/>
+        </w:rPr>
+        <w:t xml:space="preserve">This guide was generated using the</w:t>
+      </w:r>
+      <w:r>
+        <w:rPr>
+          <w:iCs/>
+          <w:i/>
+        </w:rPr>
+        <w:t xml:space="preserve"> </w:t>
+      </w:r>
+      <w:r>
+        <w:rPr>
+          <w:rStyle w:val="VerbatimChar"/>
+          <w:iCs/>
+          <w:i/>
+        </w:rPr>
+        <w:t xml:space="preserve">guide.cls</w:t>
+      </w:r>
+      <w:r>
+        <w:rPr>
+          <w:iCs/>
+          <w:i/>
+        </w:rPr>
+        <w:t xml:space="preserve"> </w:t>
+      </w:r>
+      <w:r>
+        <w:rPr>
+          <w:iCs/>
+          <w:i/>
+        </w:rPr>
+        <w:t xml:space="preserve">template. For the</w:t>
+      </w:r>
+      <w:r>
+        <w:rPr>
+          <w:iCs/>
+          <w:i/>
+        </w:rPr>
+        <w:t xml:space="preserve"> </w:t>
+      </w:r>
+      <w:r>
+        <w:rPr>
+          <w:iCs/>
+          <w:i/>
+        </w:rPr>
+        <w:t xml:space="preserve">full command reference, see the template’s README.md or run</w:t>
+      </w:r>
+      <w:r>
+        <w:rPr>
+          <w:iCs/>
+          <w:i/>
+        </w:rPr>
+        <w:t xml:space="preserve"> </w:t>
+      </w:r>
+      <w:r>
+        <w:rPr>
+          <w:rStyle w:val="VerbatimChar"/>
+          <w:iCs/>
+          <w:i/>
+        </w:rPr>
+        <w:t xml:space="preserve">/skill huawei-template-guide</w:t>
+      </w:r>
+      <w:r>
+        <w:rPr>
+          <w:iCs/>
+          <w:i/>
+        </w:rPr>
+        <w:t xml:space="preserve"> </w:t>
+      </w:r>
+      <w:r>
+        <w:rPr>
+          <w:iCs/>
+          <w:i/>
+        </w:rPr>
+        <w:t xml:space="preserve">in your coding agent.</w:t>
+      </w:r>
     </w:p>
     <w:p>
       <w:r>
@@ -14572,7 +14622,7 @@
           <w:tab w:val="right" w:pos="9638"/>
         </w:tabs>
       </w:pPr>
-      <w:bookmarkStart w:id="133" w:name="operations-and-maintenance"/>
+      <w:bookmarkStart w:id="135" w:name="sec-changelog"/>
       <w:r>
         <w:rPr>
           <w:sz w:val="112"/>
@@ -14584,1881 +14634,9 @@
         <w:tab/>
       </w:r>
       <w:r>
-        <w:t xml:space="preserve">Operations and Maintenance</w:t>
-      </w:r>
-      <w:bookmarkEnd w:id="133"/>
-    </w:p>
-    <w:p>
-      <w:pPr>
-        <w:pStyle w:val="BodyText"/>
-      </w:pPr>
-      <w:r>
-        <w:rPr>
-          <w:bCs/>
-          <w:b/>
-        </w:rPr>
-        <w:t xml:space="preserve">General Objective:</w:t>
-      </w:r>
-      <w:r>
-        <w:t xml:space="preserve"> </w:t>
-      </w:r>
-      <w:r>
-        <w:t xml:space="preserve">Update, uninstall, or clean up the software and cloud</w:t>
-      </w:r>
-      <w:r>
-        <w:t xml:space="preserve"> </w:t>
-      </w:r>
-      <w:r>
-        <w:t xml:space="preserve">resources created in this guide. All operations in this chapter are optional.</w:t>
-      </w:r>
-    </w:p>
-    <w:p>
-      <w:pPr>
-        <w:pStyle w:val="ObjectivesRule"/>
-      </w:pPr>
-      <w:r>
-        <w:t xml:space="preserve">​</w:t>
-      </w:r>
-    </w:p>
-    <w:p>
-      <w:pPr>
-        <w:pStyle w:val="Heading2"/>
-      </w:pPr>
-      <w:bookmarkStart w:id="134" w:name="updating-the-maas-gateway"/>
-      <w:r>
-        <w:t xml:space="preserve">8.1</w:t>
-      </w:r>
-      <w:r>
-        <w:t xml:space="preserve"> Updating the MaaS Gateway</w:t>
-      </w:r>
-      <w:bookmarkEnd w:id="134"/>
-    </w:p>
-    <w:p>
-      <w:pPr>
-        <w:pStyle w:val="BodyText"/>
-      </w:pPr>
-      <w:r>
-        <w:t xml:space="preserve">To update the oh-my-coding-maas-gateway to a newer version:</w:t>
-      </w:r>
-    </w:p>
-    <w:p>
-      <w:pPr>
-        <w:pStyle w:val="BodyText"/>
-      </w:pPr>
-      <w:r>
-        <w:rPr>
-          <w:bCs/>
-          <w:b/>
-        </w:rPr>
-        <w:t xml:space="preserve">Step by step:</w:t>
-      </w:r>
-    </w:p>
-    <w:p>
-      <w:pPr>
-        <w:numPr>
-          <w:ilvl w:val="0"/>
-          <w:numId w:val="1031"/>
-        </w:numPr>
-      </w:pPr>
-      <w:r>
-        <w:t xml:space="preserve">Re-run the bootstrap script in the VS Code remote terminal:</w:t>
-      </w:r>
-    </w:p>
-    <w:p>
-      <w:pPr>
-        <w:numPr>
-          <w:ilvl w:val="0"/>
-          <w:numId w:val="1000"/>
-        </w:numPr>
-        <w:pStyle w:val="SourceCode"/>
-      </w:pPr>
-      <w:r>
-        <w:rPr>
-          <w:rStyle w:val="ExtensionTok"/>
-        </w:rPr>
-        <w:t xml:space="preserve">curl</w:t>
-      </w:r>
-      <w:r>
-        <w:rPr>
-          <w:rStyle w:val="NormalTok"/>
-        </w:rPr>
-        <w:t xml:space="preserve"> </w:t>
-      </w:r>
-      <w:r>
-        <w:rPr>
-          <w:rStyle w:val="AttributeTok"/>
-        </w:rPr>
-        <w:t xml:space="preserve">-fsSL</w:t>
-      </w:r>
-      <w:r>
-        <w:rPr>
-          <w:rStyle w:val="NormalTok"/>
-        </w:rPr>
-        <w:t xml:space="preserve"> https://raw.githubusercontent.com/wallacelw/oh-my-coding-maas-gateway/main/scripts/bootstrap.sh </w:t>
-      </w:r>
-      <w:r>
-        <w:rPr>
-          <w:rStyle w:val="KeywordTok"/>
-        </w:rPr>
-        <w:t xml:space="preserve">|</w:t>
-      </w:r>
-      <w:r>
-        <w:rPr>
-          <w:rStyle w:val="NormalTok"/>
-        </w:rPr>
-        <w:t xml:space="preserve"> </w:t>
-      </w:r>
-      <w:r>
-        <w:rPr>
-          <w:rStyle w:val="FunctionTok"/>
-        </w:rPr>
-        <w:t xml:space="preserve">bash</w:t>
-      </w:r>
-    </w:p>
-    <w:p>
-      <w:pPr>
-        <w:numPr>
-          <w:ilvl w:val="0"/>
-          <w:numId w:val="1031"/>
-        </w:numPr>
-      </w:pPr>
-      <w:r>
-        <w:t xml:space="preserve">The installer detects the existing installation, pulls updates, and</w:t>
-      </w:r>
-      <w:r>
-        <w:t xml:space="preserve"> </w:t>
-      </w:r>
-      <w:r>
-        <w:t xml:space="preserve">preserves all secrets, virtual keys, and data.</w:t>
-      </w:r>
-    </w:p>
-    <w:p>
-      <w:pPr>
-        <w:numPr>
-          <w:ilvl w:val="0"/>
-          <w:numId w:val="1031"/>
-        </w:numPr>
-      </w:pPr>
-      <w:r>
-        <w:t xml:space="preserve">To update only the coding tools (without touching the proxy stack):</w:t>
-      </w:r>
-    </w:p>
-    <w:p>
-      <w:pPr>
-        <w:numPr>
-          <w:ilvl w:val="0"/>
-          <w:numId w:val="1000"/>
-        </w:numPr>
-        <w:pStyle w:val="SourceCode"/>
-      </w:pPr>
-      <w:r>
-        <w:rPr>
-          <w:rStyle w:val="BuiltInTok"/>
-        </w:rPr>
-        <w:t xml:space="preserve">cd</w:t>
-      </w:r>
-      <w:r>
-        <w:rPr>
-          <w:rStyle w:val="NormalTok"/>
-        </w:rPr>
-        <w:t xml:space="preserve"> /home/oh-my-coding-maas-gateway</w:t>
-      </w:r>
-      <w:r>
-        <w:br/>
-      </w:r>
-      <w:r>
-        <w:rPr>
-          <w:rStyle w:val="ExtensionTok"/>
-        </w:rPr>
-        <w:t xml:space="preserve">./scripts/update.sh</w:t>
-      </w:r>
-    </w:p>
-    <w:p>
-      <w:pPr>
-        <w:pStyle w:val="Heading2"/>
-      </w:pPr>
-      <w:bookmarkStart w:id="135" w:name="updating-the-document-templates"/>
-      <w:r>
-        <w:t xml:space="preserve">8.2</w:t>
-      </w:r>
-      <w:r>
-        <w:t xml:space="preserve"> Updating the Document Templates</w:t>
+        <w:t xml:space="preserve">Changelog</w:t>
       </w:r>
       <w:bookmarkEnd w:id="135"/>
-    </w:p>
-    <w:p>
-      <w:pPr>
-        <w:pStyle w:val="FirstParagraph"/>
-      </w:pPr>
-      <w:r>
-        <w:t xml:space="preserve">To update the Huawei document templates project:</w:t>
-      </w:r>
-    </w:p>
-    <w:p>
-      <w:pPr>
-        <w:pStyle w:val="BodyText"/>
-      </w:pPr>
-      <w:r>
-        <w:rPr>
-          <w:bCs/>
-          <w:b/>
-        </w:rPr>
-        <w:t xml:space="preserve">Step by step:</w:t>
-      </w:r>
-    </w:p>
-    <w:p>
-      <w:pPr>
-        <w:numPr>
-          <w:ilvl w:val="0"/>
-          <w:numId w:val="1032"/>
-        </w:numPr>
-      </w:pPr>
-      <w:r>
-        <w:t xml:space="preserve">Re-run the one-liner — it detects the existing installation and</w:t>
-      </w:r>
-      <w:r>
-        <w:t xml:space="preserve"> </w:t>
-      </w:r>
-      <w:r>
-        <w:t xml:space="preserve">prompts to update:</w:t>
-      </w:r>
-    </w:p>
-    <w:p>
-      <w:pPr>
-        <w:numPr>
-          <w:ilvl w:val="0"/>
-          <w:numId w:val="1000"/>
-        </w:numPr>
-        <w:pStyle w:val="SourceCode"/>
-      </w:pPr>
-      <w:r>
-        <w:rPr>
-          <w:rStyle w:val="ExtensionTok"/>
-        </w:rPr>
-        <w:t xml:space="preserve">curl</w:t>
-      </w:r>
-      <w:r>
-        <w:rPr>
-          <w:rStyle w:val="NormalTok"/>
-        </w:rPr>
-        <w:t xml:space="preserve"> </w:t>
-      </w:r>
-      <w:r>
-        <w:rPr>
-          <w:rStyle w:val="AttributeTok"/>
-        </w:rPr>
-        <w:t xml:space="preserve">-fsSL</w:t>
-      </w:r>
-      <w:r>
-        <w:rPr>
-          <w:rStyle w:val="NormalTok"/>
-        </w:rPr>
-        <w:t xml:space="preserve"> https://raw.githubusercontent.com/wallacelw/huawei-doc-templates/main/scripts/install.sh </w:t>
-      </w:r>
-      <w:r>
-        <w:rPr>
-          <w:rStyle w:val="KeywordTok"/>
-        </w:rPr>
-        <w:t xml:space="preserve">|</w:t>
-      </w:r>
-      <w:r>
-        <w:rPr>
-          <w:rStyle w:val="NormalTok"/>
-        </w:rPr>
-        <w:t xml:space="preserve"> </w:t>
-      </w:r>
-      <w:r>
-        <w:rPr>
-          <w:rStyle w:val="FunctionTok"/>
-        </w:rPr>
-        <w:t xml:space="preserve">bash</w:t>
-      </w:r>
-    </w:p>
-    <w:p>
-      <w:pPr>
-        <w:numPr>
-          <w:ilvl w:val="0"/>
-          <w:numId w:val="1032"/>
-        </w:numPr>
-      </w:pPr>
-      <w:r>
-        <w:t xml:space="preserve">The script pulls the latest version, shows the version change</w:t>
-      </w:r>
-      <w:r>
-        <w:t xml:space="preserve"> </w:t>
-      </w:r>
-      <w:r>
-        <w:t xml:space="preserve">(</w:t>
-      </w:r>
-      <w:r>
-        <w:rPr>
-          <w:rStyle w:val="VerbatimChar"/>
-        </w:rPr>
-        <w:t xml:space="preserve">v3.3.6 → v3.3.7</w:t>
-      </w:r>
-      <w:r>
-        <w:t xml:space="preserve">), and re-runs the installer. New</w:t>
-      </w:r>
-      <w:r>
-        <w:t xml:space="preserve"> </w:t>
-      </w:r>
-      <w:r>
-        <w:t xml:space="preserve">templates, commands, or modules are installed automatically.</w:t>
-      </w:r>
-    </w:p>
-    <w:p>
-      <w:pPr>
-        <w:pStyle w:val="Heading2"/>
-      </w:pPr>
-      <w:bookmarkStart w:id="136" w:name="uninstalling-the-maas-gateway"/>
-      <w:r>
-        <w:t xml:space="preserve">8.3</w:t>
-      </w:r>
-      <w:r>
-        <w:t xml:space="preserve"> Uninstalling the MaaS Gateway</w:t>
-      </w:r>
-      <w:bookmarkEnd w:id="136"/>
-    </w:p>
-    <w:p>
-      <w:pPr>
-        <w:pStyle w:val="FirstParagraph"/>
-      </w:pPr>
-      <w:r>
-        <w:t xml:space="preserve">To remove the oh-my-coding-maas-gateway:</w:t>
-      </w:r>
-    </w:p>
-    <w:p>
-      <w:pPr>
-        <w:pStyle w:val="BodyText"/>
-      </w:pPr>
-      <w:r>
-        <w:rPr>
-          <w:bCs/>
-          <w:b/>
-        </w:rPr>
-        <w:t xml:space="preserve">Step by step:</w:t>
-      </w:r>
-    </w:p>
-    <w:p>
-      <w:pPr>
-        <w:numPr>
-          <w:ilvl w:val="0"/>
-          <w:numId w:val="1033"/>
-        </w:numPr>
-      </w:pPr>
-      <w:r>
-        <w:t xml:space="preserve">Run the uninstall script:</w:t>
-      </w:r>
-    </w:p>
-    <w:p>
-      <w:pPr>
-        <w:numPr>
-          <w:ilvl w:val="0"/>
-          <w:numId w:val="1000"/>
-        </w:numPr>
-        <w:pStyle w:val="SourceCode"/>
-      </w:pPr>
-      <w:r>
-        <w:rPr>
-          <w:rStyle w:val="BuiltInTok"/>
-        </w:rPr>
-        <w:t xml:space="preserve">cd</w:t>
-      </w:r>
-      <w:r>
-        <w:rPr>
-          <w:rStyle w:val="NormalTok"/>
-        </w:rPr>
-        <w:t xml:space="preserve"> /home/oh-my-coding-maas-gateway</w:t>
-      </w:r>
-      <w:r>
-        <w:br/>
-      </w:r>
-      <w:r>
-        <w:rPr>
-          <w:rStyle w:val="ExtensionTok"/>
-        </w:rPr>
-        <w:t xml:space="preserve">./scripts/uninstall.sh</w:t>
-      </w:r>
-      <w:r>
-        <w:rPr>
-          <w:rStyle w:val="NormalTok"/>
-        </w:rPr>
-        <w:t xml:space="preserve"> </w:t>
-      </w:r>
-      <w:r>
-        <w:rPr>
-          <w:rStyle w:val="AttributeTok"/>
-        </w:rPr>
-        <w:t xml:space="preserve">--all</w:t>
-      </w:r>
-      <w:r>
-        <w:rPr>
-          <w:rStyle w:val="NormalTok"/>
-        </w:rPr>
-        <w:t xml:space="preserve"> </w:t>
-      </w:r>
-      <w:r>
-        <w:rPr>
-          <w:rStyle w:val="AttributeTok"/>
-        </w:rPr>
-        <w:t xml:space="preserve">--yes</w:t>
-      </w:r>
-    </w:p>
-    <w:p>
-      <w:pPr>
-        <w:numPr>
-          <w:ilvl w:val="0"/>
-          <w:numId w:val="1033"/>
-        </w:numPr>
-      </w:pPr>
-      <w:r>
-        <w:t xml:space="preserve">This stops and removes Docker containers, volumes, and images, removes</w:t>
-      </w:r>
-      <w:r>
-        <w:t xml:space="preserve"> </w:t>
-      </w:r>
-      <w:r>
-        <w:t xml:space="preserve">coding tool configs (opencode, Codex, Claude, Pi), and deletes the</w:t>
-      </w:r>
-      <w:r>
-        <w:t xml:space="preserve"> </w:t>
-      </w:r>
-      <w:r>
-        <w:t xml:space="preserve">repository.</w:t>
-      </w:r>
-    </w:p>
-    <w:p>
-      <w:pPr>
-        <w:numPr>
-          <w:ilvl w:val="0"/>
-          <w:numId w:val="1033"/>
-        </w:numPr>
-      </w:pPr>
-      <w:r>
-        <w:t xml:space="preserve">To remove only specific components:</w:t>
-      </w:r>
-    </w:p>
-    <w:p>
-      <w:pPr>
-        <w:numPr>
-          <w:ilvl w:val="0"/>
-          <w:numId w:val="1000"/>
-        </w:numPr>
-        <w:pStyle w:val="SourceCode"/>
-      </w:pPr>
-      <w:r>
-        <w:rPr>
-          <w:rStyle w:val="ExtensionTok"/>
-        </w:rPr>
-        <w:t xml:space="preserve">./scripts/uninstall.sh</w:t>
-      </w:r>
-      <w:r>
-        <w:rPr>
-          <w:rStyle w:val="NormalTok"/>
-        </w:rPr>
-        <w:t xml:space="preserve"> </w:t>
-      </w:r>
-      <w:r>
-        <w:rPr>
-          <w:rStyle w:val="AttributeTok"/>
-        </w:rPr>
-        <w:t xml:space="preserve">--tool</w:t>
-      </w:r>
-      <w:r>
-        <w:rPr>
-          <w:rStyle w:val="OperatorTok"/>
-        </w:rPr>
-        <w:t xml:space="preserve">=</w:t>
-      </w:r>
-      <w:r>
-        <w:rPr>
-          <w:rStyle w:val="NormalTok"/>
-        </w:rPr>
-        <w:t xml:space="preserve">opencode    </w:t>
-      </w:r>
-      <w:r>
-        <w:rPr>
-          <w:rStyle w:val="CommentTok"/>
-        </w:rPr>
-        <w:t xml:space="preserve"># remove one tool</w:t>
-      </w:r>
-      <w:r>
-        <w:br/>
-      </w:r>
-      <w:r>
-        <w:rPr>
-          <w:rStyle w:val="ExtensionTok"/>
-        </w:rPr>
-        <w:t xml:space="preserve">./scripts/uninstall.sh</w:t>
-      </w:r>
-      <w:r>
-        <w:rPr>
-          <w:rStyle w:val="NormalTok"/>
-        </w:rPr>
-        <w:t xml:space="preserve"> </w:t>
-      </w:r>
-      <w:r>
-        <w:rPr>
-          <w:rStyle w:val="AttributeTok"/>
-        </w:rPr>
-        <w:t xml:space="preserve">--docker</w:t>
-      </w:r>
-      <w:r>
-        <w:rPr>
-          <w:rStyle w:val="NormalTok"/>
-        </w:rPr>
-        <w:t xml:space="preserve">           </w:t>
-      </w:r>
-      <w:r>
-        <w:rPr>
-          <w:rStyle w:val="CommentTok"/>
-        </w:rPr>
-        <w:t xml:space="preserve"># remove Docker stack only</w:t>
-      </w:r>
-    </w:p>
-    <w:p>
-      <w:pPr>
-        <w:pStyle w:val="Heading2"/>
-      </w:pPr>
-      <w:bookmarkStart w:id="137" w:name="uninstalling-the-document-templates"/>
-      <w:r>
-        <w:t xml:space="preserve">8.4</w:t>
-      </w:r>
-      <w:r>
-        <w:t xml:space="preserve"> Uninstalling the Document Templates</w:t>
-      </w:r>
-      <w:bookmarkEnd w:id="137"/>
-    </w:p>
-    <w:p>
-      <w:pPr>
-        <w:pStyle w:val="FirstParagraph"/>
-      </w:pPr>
-      <w:r>
-        <w:t xml:space="preserve">To remove the Huawei document templates installation:</w:t>
-      </w:r>
-    </w:p>
-    <w:p>
-      <w:pPr>
-        <w:pStyle w:val="BodyText"/>
-      </w:pPr>
-      <w:r>
-        <w:rPr>
-          <w:bCs/>
-          <w:b/>
-        </w:rPr>
-        <w:t xml:space="preserve">Step by step:</w:t>
-      </w:r>
-    </w:p>
-    <w:p>
-      <w:pPr>
-        <w:numPr>
-          <w:ilvl w:val="0"/>
-          <w:numId w:val="1034"/>
-        </w:numPr>
-      </w:pPr>
-      <w:r>
-        <w:t xml:space="preserve">Run the uninstall script (interactive menu with 5 options):</w:t>
-      </w:r>
-    </w:p>
-    <w:p>
-      <w:pPr>
-        <w:numPr>
-          <w:ilvl w:val="0"/>
-          <w:numId w:val="1000"/>
-        </w:numPr>
-        <w:pStyle w:val="SourceCode"/>
-      </w:pPr>
-      <w:r>
-        <w:rPr>
-          <w:rStyle w:val="BuiltInTok"/>
-        </w:rPr>
-        <w:t xml:space="preserve">cd</w:t>
-      </w:r>
-      <w:r>
-        <w:rPr>
-          <w:rStyle w:val="NormalTok"/>
-        </w:rPr>
-        <w:t xml:space="preserve"> /home/huawei-doc-templates</w:t>
-      </w:r>
-      <w:r>
-        <w:br/>
-      </w:r>
-      <w:r>
-        <w:rPr>
-          <w:rStyle w:val="ExtensionTok"/>
-        </w:rPr>
-        <w:t xml:space="preserve">./scripts/uninstall.sh</w:t>
-      </w:r>
-    </w:p>
-    <w:p>
-      <w:pPr>
-        <w:numPr>
-          <w:ilvl w:val="0"/>
-          <w:numId w:val="1034"/>
-        </w:numPr>
-      </w:pPr>
-      <w:r>
-        <w:t xml:space="preserve">Or use the one-liner:</w:t>
-      </w:r>
-    </w:p>
-    <w:p>
-      <w:pPr>
-        <w:numPr>
-          <w:ilvl w:val="0"/>
-          <w:numId w:val="1000"/>
-        </w:numPr>
-        <w:pStyle w:val="SourceCode"/>
-      </w:pPr>
-      <w:r>
-        <w:rPr>
-          <w:rStyle w:val="ExtensionTok"/>
-        </w:rPr>
-        <w:t xml:space="preserve">curl</w:t>
-      </w:r>
-      <w:r>
-        <w:rPr>
-          <w:rStyle w:val="NormalTok"/>
-        </w:rPr>
-        <w:t xml:space="preserve"> </w:t>
-      </w:r>
-      <w:r>
-        <w:rPr>
-          <w:rStyle w:val="AttributeTok"/>
-        </w:rPr>
-        <w:t xml:space="preserve">-fsSL</w:t>
-      </w:r>
-      <w:r>
-        <w:rPr>
-          <w:rStyle w:val="NormalTok"/>
-        </w:rPr>
-        <w:t xml:space="preserve"> https://raw.githubusercontent.com/wallacelw/huawei-doc-templates/main/scripts/uninstall.sh </w:t>
-      </w:r>
-      <w:r>
-        <w:rPr>
-          <w:rStyle w:val="KeywordTok"/>
-        </w:rPr>
-        <w:t xml:space="preserve">|</w:t>
-      </w:r>
-      <w:r>
-        <w:rPr>
-          <w:rStyle w:val="NormalTok"/>
-        </w:rPr>
-        <w:t xml:space="preserve"> </w:t>
-      </w:r>
-      <w:r>
-        <w:rPr>
-          <w:rStyle w:val="FunctionTok"/>
-        </w:rPr>
-        <w:t xml:space="preserve">bash</w:t>
-      </w:r>
-    </w:p>
-    <w:p>
-      <w:pPr>
-        <w:numPr>
-          <w:ilvl w:val="0"/>
-          <w:numId w:val="1034"/>
-        </w:numPr>
-      </w:pPr>
-      <w:r>
-        <w:t xml:space="preserve">The interactive menu offers:</w:t>
-      </w:r>
-    </w:p>
-    <w:p>
-      <w:pPr>
-        <w:numPr>
-          <w:ilvl w:val="1"/>
-          <w:numId w:val="1035"/>
-        </w:numPr>
-      </w:pPr>
-      <w:r>
-        <w:t xml:space="preserve">Option 1: All installed components (skills, modules, font, VS Code)</w:t>
-      </w:r>
-    </w:p>
-    <w:p>
-      <w:pPr>
-        <w:numPr>
-          <w:ilvl w:val="1"/>
-          <w:numId w:val="1035"/>
-        </w:numPr>
-      </w:pPr>
-      <w:r>
-        <w:t xml:space="preserve">Option 2: Everything + apt packages (WARNING: breaks other TeX)</w:t>
-      </w:r>
-    </w:p>
-    <w:p>
-      <w:pPr>
-        <w:numPr>
-          <w:ilvl w:val="1"/>
-          <w:numId w:val="1035"/>
-        </w:numPr>
-      </w:pPr>
-      <w:r>
-        <w:t xml:space="preserve">Option 3: Delete repository directory (all files, guides, documents)</w:t>
-      </w:r>
-    </w:p>
-    <w:p>
-      <w:pPr>
-        <w:numPr>
-          <w:ilvl w:val="1"/>
-          <w:numId w:val="1035"/>
-        </w:numPr>
-      </w:pPr>
-      <w:r>
-        <w:t xml:space="preserve">Option 4: Remove 100% — everything + apt + repo (nuclear option)</w:t>
-      </w:r>
-    </w:p>
-    <w:p>
-      <w:pPr>
-        <w:numPr>
-          <w:ilvl w:val="1"/>
-          <w:numId w:val="1035"/>
-        </w:numPr>
-      </w:pPr>
-      <w:r>
-        <w:t xml:space="preserve">Option 5: Choose specific components individually</w:t>
-      </w:r>
-    </w:p>
-    <w:p>
-      <w:pPr>
-        <w:numPr>
-          <w:ilvl w:val="0"/>
-          <w:numId w:val="1034"/>
-        </w:numPr>
-      </w:pPr>
-      <w:r>
-        <w:t xml:space="preserve">To preview what would be removed before running:</w:t>
-      </w:r>
-    </w:p>
-    <w:p>
-      <w:pPr>
-        <w:numPr>
-          <w:ilvl w:val="0"/>
-          <w:numId w:val="1000"/>
-        </w:numPr>
-        <w:pStyle w:val="SourceCode"/>
-      </w:pPr>
-      <w:r>
-        <w:rPr>
-          <w:rStyle w:val="ExtensionTok"/>
-        </w:rPr>
-        <w:t xml:space="preserve">./scripts/uninstall.sh</w:t>
-      </w:r>
-      <w:r>
-        <w:rPr>
-          <w:rStyle w:val="NormalTok"/>
-        </w:rPr>
-        <w:t xml:space="preserve"> </w:t>
-      </w:r>
-      <w:r>
-        <w:rPr>
-          <w:rStyle w:val="AttributeTok"/>
-        </w:rPr>
-        <w:t xml:space="preserve">--all</w:t>
-      </w:r>
-      <w:r>
-        <w:rPr>
-          <w:rStyle w:val="NormalTok"/>
-        </w:rPr>
-        <w:t xml:space="preserve"> </w:t>
-      </w:r>
-      <w:r>
-        <w:rPr>
-          <w:rStyle w:val="AttributeTok"/>
-        </w:rPr>
-        <w:t xml:space="preserve">--dry-run</w:t>
-      </w:r>
-    </w:p>
-    <w:p>
-      <w:pPr>
-        <w:numPr>
-          <w:ilvl w:val="0"/>
-          <w:numId w:val="1034"/>
-        </w:numPr>
-      </w:pPr>
-      <w:r>
-        <w:t xml:space="preserve">To also remove apt packages (texlive, latexmk, fonts, pandoc):</w:t>
-      </w:r>
-    </w:p>
-    <w:p>
-      <w:pPr>
-        <w:numPr>
-          <w:ilvl w:val="0"/>
-          <w:numId w:val="1000"/>
-        </w:numPr>
-        <w:pStyle w:val="SourceCode"/>
-      </w:pPr>
-      <w:r>
-        <w:rPr>
-          <w:rStyle w:val="ExtensionTok"/>
-        </w:rPr>
-        <w:t xml:space="preserve">./scripts/uninstall.sh</w:t>
-      </w:r>
-      <w:r>
-        <w:rPr>
-          <w:rStyle w:val="NormalTok"/>
-        </w:rPr>
-        <w:t xml:space="preserve"> </w:t>
-      </w:r>
-      <w:r>
-        <w:rPr>
-          <w:rStyle w:val="AttributeTok"/>
-        </w:rPr>
-        <w:t xml:space="preserve">--all</w:t>
-      </w:r>
-      <w:r>
-        <w:rPr>
-          <w:rStyle w:val="NormalTok"/>
-        </w:rPr>
-        <w:t xml:space="preserve"> </w:t>
-      </w:r>
-      <w:r>
-        <w:rPr>
-          <w:rStyle w:val="AttributeTok"/>
-        </w:rPr>
-        <w:t xml:space="preserve">--packages</w:t>
-      </w:r>
-      <w:r>
-        <w:rPr>
-          <w:rStyle w:val="NormalTok"/>
-        </w:rPr>
-        <w:t xml:space="preserve"> </w:t>
-      </w:r>
-      <w:r>
-        <w:rPr>
-          <w:rStyle w:val="AttributeTok"/>
-        </w:rPr>
-        <w:t xml:space="preserve">--yes</w:t>
-      </w:r>
-    </w:p>
-    <w:tbl>
-      <w:tblPr>
-        <w:tblW w:w="9638" w:type="dxa"/>
-        <w:tblLayout w:type="fixed"/>
-        <w:tblBorders>
-          <w:top w:val="none" w:sz="0" w:space="0" w:color="auto"/>
-          <w:left w:val="single" w:sz="24" w:space="0" w:color="F57C00"/>
-          <w:bottom w:val="none" w:sz="0" w:space="0" w:color="auto"/>
-          <w:right w:val="none" w:sz="0" w:space="0" w:color="auto"/>
-        </w:tblBorders>
-        <w:tblCellMar>
-          <w:top w:w="120" w:type="dxa"/>
-          <w:left w:w="160" w:type="dxa"/>
-          <w:bottom w:w="120" w:type="dxa"/>
-          <w:right w:w="160" w:type="dxa"/>
-        </w:tblCellMar>
-      </w:tblPr>
-      <w:tr>
-        <w:tc>
-          <w:tcPr>
-            <w:tcW w:w="9638" w:type="dxa"/>
-            <w:shd w:val="clear" w:color="auto" w:fill="FFF8E1"/>
-          </w:tcPr>
-          <w:p>
-            <w:r>
-              <w:rPr>
-                <w:rFonts w:ascii="HarmonyOS Sans" w:hAnsi="HarmonyOS Sans"/>
-                <w:b/>
-                <w:color w:val="C7000B"/>
-                <w:sz w:val="21"/>
-                <w:szCs w:val="21"/>
-              </w:rPr>
-              <w:t>Important</w:t>
-            </w:r>
-          </w:p>
-          <w:p>
-            <w:pPr>
-              <w:numPr>
-                <w:ilvl w:val="0"/>
-                <w:numId w:val="1000"/>
-              </w:numPr>
-            </w:pPr>
-            <w:r>
-              <w:t xml:space="preserve">Removing apt packages will break any other LaTeX documents on the instance.</w:t>
-            </w:r>
-            <w:r>
-              <w:t xml:space="preserve"> </w:t>
-            </w:r>
-            <w:r>
-              <w:t xml:space="preserve">Only use</w:t>
-            </w:r>
-            <w:r>
-              <w:t xml:space="preserve"> </w:t>
-            </w:r>
-            <w:r>
-              <w:rPr>
-                <w:rStyle w:val="VerbatimChar"/>
-              </w:rPr>
-              <w:t xml:space="preserve">–packages</w:t>
-            </w:r>
-            <w:r>
-              <w:t xml:space="preserve"> </w:t>
-            </w:r>
-            <w:r>
-              <w:t xml:space="preserve">if you are decommissioning the instance.</w:t>
-            </w:r>
-          </w:p>
-        </w:tc>
-      </w:tr>
-    </w:tbl>
-    <w:p>
-      <w:pPr>
-        <w:spacing w:before="120" w:after="0"/>
-      </w:pPr>
-    </w:p>
-    <w:p>
-      <w:pPr>
-        <w:pStyle w:val="Heading2"/>
-      </w:pPr>
-      <w:bookmarkStart w:id="138" w:name="deleting-cloud-resources-optional"/>
-      <w:r>
-        <w:t xml:space="preserve">8.5</w:t>
-      </w:r>
-      <w:r>
-        <w:t xml:space="preserve"> Deleting cloud resources (optional)</w:t>
-      </w:r>
-      <w:bookmarkEnd w:id="138"/>
-    </w:p>
-    <w:p>
-      <w:pPr>
-        <w:pStyle w:val="FirstParagraph"/>
-      </w:pPr>
-      <w:r>
-        <w:t xml:space="preserve">If you no longer need the Flexus X instance, delete it to stop incurring</w:t>
-      </w:r>
-      <w:r>
-        <w:t xml:space="preserve"> </w:t>
-      </w:r>
-      <w:r>
-        <w:t xml:space="preserve">charges:</w:t>
-      </w:r>
-    </w:p>
-    <w:p>
-      <w:pPr>
-        <w:pStyle w:val="BodyText"/>
-      </w:pPr>
-      <w:r>
-        <w:rPr>
-          <w:bCs/>
-          <w:b/>
-        </w:rPr>
-        <w:t xml:space="preserve">Step by step:</w:t>
-      </w:r>
-    </w:p>
-    <w:p>
-      <w:pPr>
-        <w:numPr>
-          <w:ilvl w:val="0"/>
-          <w:numId w:val="1036"/>
-        </w:numPr>
-      </w:pPr>
-      <w:r>
-        <w:t xml:space="preserve">In the Console, navigate to</w:t>
-      </w:r>
-      <w:r>
-        <w:t xml:space="preserve"> </w:t>
-      </w:r>
-      <w:r>
-        <w:rPr>
-          <w:bCs/>
-          <w:b/>
-        </w:rPr>
-        <w:t xml:space="preserve">Flexus X</w:t>
-      </w:r>
-      <w:r>
-        <w:t xml:space="preserve">.</w:t>
-      </w:r>
-    </w:p>
-    <w:p>
-      <w:pPr>
-        <w:numPr>
-          <w:ilvl w:val="0"/>
-          <w:numId w:val="1036"/>
-        </w:numPr>
-      </w:pPr>
-      <w:r>
-        <w:t xml:space="preserve">Select the instance</w:t>
-      </w:r>
-      <w:r>
-        <w:t xml:space="preserve"> </w:t>
-      </w:r>
-      <w:r>
-        <w:rPr>
-          <w:rStyle w:val="VerbatimChar"/>
-        </w:rPr>
-        <w:t xml:space="preserve">flexusx-dev</w:t>
-      </w:r>
-      <w:r>
-        <w:t xml:space="preserve">, click</w:t>
-      </w:r>
-      <w:r>
-        <w:t xml:space="preserve"> </w:t>
-      </w:r>
-      <w:r>
-        <w:rPr>
-          <w:bCs/>
-          <w:b/>
-        </w:rPr>
-        <w:t xml:space="preserve">More</w:t>
-      </w:r>
-      <w:r>
-        <w:t xml:space="preserve"> </w:t>
-      </w:r>
-      <w:r>
-        <w:t xml:space="preserve">and</w:t>
-      </w:r>
-      <w:r>
-        <w:t xml:space="preserve"> </w:t>
-      </w:r>
-      <w:r>
-        <w:t xml:space="preserve">choose</w:t>
-      </w:r>
-      <w:r>
-        <w:t xml:space="preserve"> </w:t>
-      </w:r>
-      <w:r>
-        <w:rPr>
-          <w:bCs/>
-          <w:b/>
-        </w:rPr>
-        <w:t xml:space="preserve">Delete</w:t>
-      </w:r>
-      <w:r>
-        <w:t xml:space="preserve">.</w:t>
-      </w:r>
-    </w:p>
-    <w:p>
-      <w:pPr>
-        <w:numPr>
-          <w:ilvl w:val="0"/>
-          <w:numId w:val="1036"/>
-        </w:numPr>
-      </w:pPr>
-      <w:r>
-        <w:t xml:space="preserve">Confirm deletion. The EIP is released automatically (configured in</w:t>
-      </w:r>
-      <w:r>
-        <w:t xml:space="preserve"> </w:t>
-      </w:r>
-      <w:r>
-        <w:t xml:space="preserve">Chapter 1 to release on instance deletion).</w:t>
-      </w:r>
-    </w:p>
-    <w:p>
-      <w:pPr>
-        <w:numPr>
-          <w:ilvl w:val="0"/>
-          <w:numId w:val="1036"/>
-        </w:numPr>
-      </w:pPr>
-      <w:r>
-        <w:t xml:space="preserve">Navigate to</w:t>
-      </w:r>
-      <w:r>
-        <w:t xml:space="preserve"> </w:t>
-      </w:r>
-      <w:r>
-        <w:rPr>
-          <w:bCs/>
-          <w:b/>
-        </w:rPr>
-        <w:t xml:space="preserve">VPC</w:t>
-      </w:r>
-      <w:r>
-        <w:t xml:space="preserve"> → </w:t>
-      </w:r>
-      <w:r>
-        <w:rPr>
-          <w:bCs/>
-          <w:b/>
-        </w:rPr>
-        <w:t xml:space="preserve">Security Groups</w:t>
-      </w:r>
-      <w:r>
-        <w:t xml:space="preserve">,</w:t>
-      </w:r>
-      <w:r>
-        <w:t xml:space="preserve"> </w:t>
-      </w:r>
-      <w:r>
-        <w:t xml:space="preserve">select</w:t>
-      </w:r>
-      <w:r>
-        <w:t xml:space="preserve"> </w:t>
-      </w:r>
-      <w:r>
-        <w:rPr>
-          <w:rStyle w:val="VerbatimChar"/>
-        </w:rPr>
-        <w:t xml:space="preserve">sg-xgate</w:t>
-      </w:r>
-      <w:r>
-        <w:t xml:space="preserve">, and delete it.</w:t>
-      </w:r>
-    </w:p>
-    <w:p>
-      <w:pPr>
-        <w:numPr>
-          <w:ilvl w:val="0"/>
-          <w:numId w:val="1036"/>
-        </w:numPr>
-      </w:pPr>
-      <w:r>
-        <w:t xml:space="preserve">Remove the SSH config entry for</w:t>
-      </w:r>
-      <w:r>
-        <w:t xml:space="preserve"> </w:t>
-      </w:r>
-      <w:r>
-        <w:rPr>
-          <w:rStyle w:val="VerbatimChar"/>
-        </w:rPr>
-        <w:t xml:space="preserve">flexusx-dev</w:t>
-      </w:r>
-      <w:r>
-        <w:t xml:space="preserve"> </w:t>
-      </w:r>
-      <w:r>
-        <w:t xml:space="preserve">from your</w:t>
-      </w:r>
-      <w:r>
-        <w:t xml:space="preserve"> </w:t>
-      </w:r>
-      <w:r>
-        <w:t xml:space="preserve">Windows SSH config file</w:t>
-      </w:r>
-      <w:r>
-        <w:t xml:space="preserve"> </w:t>
-      </w:r>
-      <w:r>
-        <w:t xml:space="preserve">(</w:t>
-      </w:r>
-      <w:r>
-        <w:rPr>
-          <w:rStyle w:val="VerbatimChar"/>
-        </w:rPr>
-        <w:t xml:space="preserve">C:\textbackslash Users\textbackslash &lt;user&gt;\textbackslash .ssh\textbackslash config</w:t>
-      </w:r>
-      <w:r>
-        <w:t xml:space="preserve">).</w:t>
-      </w:r>
-    </w:p>
-    <w:tbl>
-      <w:tblPr>
-        <w:tblW w:w="9638" w:type="dxa"/>
-        <w:tblLayout w:type="fixed"/>
-        <w:tblBorders>
-          <w:top w:val="none" w:sz="0" w:space="0" w:color="auto"/>
-          <w:left w:val="single" w:sz="24" w:space="0" w:color="F57C00"/>
-          <w:bottom w:val="none" w:sz="0" w:space="0" w:color="auto"/>
-          <w:right w:val="none" w:sz="0" w:space="0" w:color="auto"/>
-        </w:tblBorders>
-        <w:tblCellMar>
-          <w:top w:w="120" w:type="dxa"/>
-          <w:left w:w="160" w:type="dxa"/>
-          <w:bottom w:w="120" w:type="dxa"/>
-          <w:right w:w="160" w:type="dxa"/>
-        </w:tblCellMar>
-      </w:tblPr>
-      <w:tr>
-        <w:tc>
-          <w:tcPr>
-            <w:tcW w:w="9638" w:type="dxa"/>
-            <w:shd w:val="clear" w:color="auto" w:fill="FFF8E1"/>
-          </w:tcPr>
-          <w:p>
-            <w:r>
-              <w:rPr>
-                <w:rFonts w:ascii="HarmonyOS Sans" w:hAnsi="HarmonyOS Sans"/>
-                <w:b/>
-                <w:color w:val="C7000B"/>
-                <w:sz w:val="21"/>
-                <w:szCs w:val="21"/>
-              </w:rPr>
-              <w:t>Important</w:t>
-            </w:r>
-          </w:p>
-          <w:p>
-            <w:pPr>
-              <w:pStyle w:val="FirstParagraph"/>
-            </w:pPr>
-            <w:r>
-              <w:t xml:space="preserve">If you used Terraform to provision the infrastructure, run</w:t>
-            </w:r>
-            <w:r>
-              <w:t xml:space="preserve"> </w:t>
-            </w:r>
-            <w:r>
-              <w:rPr>
-                <w:rStyle w:val="VerbatimChar"/>
-              </w:rPr>
-              <w:t xml:space="preserve">terraform destroy</w:t>
-            </w:r>
-            <w:r>
-              <w:t xml:space="preserve"> </w:t>
-            </w:r>
-            <w:r>
-              <w:t xml:space="preserve">instead to remove all resources declared in the</w:t>
-            </w:r>
-            <w:r>
-              <w:t xml:space="preserve"> </w:t>
-            </w:r>
-            <w:r>
-              <w:t xml:space="preserve">configuration.</w:t>
-            </w:r>
-          </w:p>
-        </w:tc>
-      </w:tr>
-    </w:tbl>
-    <w:p>
-      <w:pPr>
-        <w:spacing w:before="120" w:after="0"/>
-      </w:pPr>
-    </w:p>
-    <w:tbl>
-      <w:tblPr>
-        <w:tblW w:w="9638" w:type="dxa"/>
-        <w:tblLayout w:type="fixed"/>
-        <w:tblBorders>
-          <w:top w:val="single" w:sz="4" w:space="0" w:color="C7000B"/>
-          <w:left w:val="single" w:sz="4" w:space="0" w:color="C7000B"/>
-          <w:bottom w:val="single" w:sz="4" w:space="0" w:color="C7000B"/>
-          <w:right w:val="single" w:sz="4" w:space="0" w:color="C7000B"/>
-          <w:insideH w:val="single" w:sz="4" w:space="0" w:color="C7000B"/>
-          <w:insideV w:val="single" w:sz="4" w:space="0" w:color="C7000B"/>
-        </w:tblBorders>
-        <w:tblCellMar>
-          <w:left w:w="100" w:type="dxa"/>
-          <w:right w:w="100" w:type="dxa"/>
-        </w:tblCellMar>
-      </w:tblPr>
-      <w:tr>
-        <w:trPr>
-          <w:tblHeader/>
-        </w:trPr>
-        <w:tc>
-          <w:tcPr>
-            <w:shd w:val="clear" w:color="auto" w:fill="C7000B"/>
-          </w:tcPr>
-          <w:p>
-            <w:pPr>
-              <w:jc w:val="center"/>
-            </w:pPr>
-            <w:r>
-              <w:rPr>
-                <w:rFonts w:ascii="HarmonyOS Sans" w:hAnsi="HarmonyOS Sans"/>
-                <w:b/>
-                <w:color w:val="FFFFFF"/>
-                <w:sz w:val="18"/>
-                <w:szCs w:val="18"/>
-              </w:rPr>
-              <w:t>Step</w:t>
-            </w:r>
-          </w:p>
-        </w:tc>
-        <w:tc>
-          <w:tcPr>
-            <w:shd w:val="clear" w:color="auto" w:fill="C7000B"/>
-          </w:tcPr>
-          <w:p>
-            <w:pPr>
-              <w:jc w:val="center"/>
-            </w:pPr>
-            <w:r>
-              <w:rPr>
-                <w:rFonts w:ascii="HarmonyOS Sans" w:hAnsi="HarmonyOS Sans"/>
-                <w:b/>
-                <w:color w:val="FFFFFF"/>
-                <w:sz w:val="18"/>
-                <w:szCs w:val="18"/>
-              </w:rPr>
-              <w:t>What to check</w:t>
-            </w:r>
-          </w:p>
-        </w:tc>
-        <w:tc>
-          <w:tcPr>
-            <w:shd w:val="clear" w:color="auto" w:fill="C7000B"/>
-          </w:tcPr>
-          <w:p>
-            <w:pPr>
-              <w:jc w:val="center"/>
-            </w:pPr>
-            <w:r>
-              <w:rPr>
-                <w:rFonts w:ascii="HarmonyOS Sans" w:hAnsi="HarmonyOS Sans"/>
-                <w:b/>
-                <w:color w:val="FFFFFF"/>
-                <w:sz w:val="18"/>
-                <w:szCs w:val="18"/>
-              </w:rPr>
-              <w:t>Expected result</w:t>
-            </w:r>
-          </w:p>
-        </w:tc>
-      </w:tr>
-      <w:tr>
-        <w:tc>
-          <w:tcPr>
-            <w:shd w:val="clear" w:color="auto" w:fill="FFFFFF"/>
-          </w:tcPr>
-          <w:p>
-            <w:pPr>
-              <w:jc w:val="center"/>
-            </w:pPr>
-            <w:r>
-              <w:rPr>
-                <w:rFonts w:ascii="HarmonyOS Sans" w:hAnsi="HarmonyOS Sans"/>
-                <w:sz w:val="18"/>
-                <w:szCs w:val="18"/>
-              </w:rPr>
-              <w:t>Gateway update</w:t>
-            </w:r>
-          </w:p>
-        </w:tc>
-        <w:tc>
-          <w:tcPr>
-            <w:shd w:val="clear" w:color="auto" w:fill="FFFFFF"/>
-          </w:tcPr>
-          <w:p>
-            <w:pPr>
-              <w:jc w:val="center"/>
-            </w:pPr>
-            <w:r>
-              <w:rPr>
-                <w:rFonts w:ascii="HarmonyOS Sans" w:hAnsi="HarmonyOS Sans"/>
-                <w:sz w:val="18"/>
-                <w:szCs w:val="18"/>
-              </w:rPr>
-              <w:t>Re-run bootstrap</w:t>
-            </w:r>
-          </w:p>
-        </w:tc>
-        <w:tc>
-          <w:tcPr>
-            <w:shd w:val="clear" w:color="auto" w:fill="FFFFFF"/>
-          </w:tcPr>
-          <w:p>
-            <w:pPr>
-              <w:jc w:val="center"/>
-            </w:pPr>
-            <w:r>
-              <w:rPr>
-                <w:rFonts w:ascii="HarmonyOS Sans" w:hAnsi="HarmonyOS Sans"/>
-                <w:sz w:val="18"/>
-                <w:szCs w:val="18"/>
-              </w:rPr>
-              <w:t>New version running</w:t>
-            </w:r>
-          </w:p>
-        </w:tc>
-      </w:tr>
-      <w:tr>
-        <w:tc>
-          <w:tcPr>
-            <w:shd w:val="clear" w:color="auto" w:fill="F6F8FA"/>
-          </w:tcPr>
-          <w:p>
-            <w:pPr>
-              <w:jc w:val="center"/>
-            </w:pPr>
-            <w:r>
-              <w:rPr>
-                <w:rFonts w:ascii="HarmonyOS Sans" w:hAnsi="HarmonyOS Sans"/>
-                <w:sz w:val="18"/>
-                <w:szCs w:val="18"/>
-              </w:rPr>
-              <w:t>Templates update</w:t>
-            </w:r>
-          </w:p>
-        </w:tc>
-        <w:tc>
-          <w:tcPr>
-            <w:shd w:val="clear" w:color="auto" w:fill="F6F8FA"/>
-          </w:tcPr>
-          <w:p>
-            <w:pPr>
-              <w:jc w:val="center"/>
-            </w:pPr>
-            <w:r>
-              <w:rPr>
-                <w:rFonts w:ascii="HarmonyOS Sans" w:hAnsi="HarmonyOS Sans"/>
-                <w:sz w:val="18"/>
-                <w:szCs w:val="18"/>
-              </w:rPr>
-              <w:t>`git pull &amp;&amp; ./scripts/install.sh`</w:t>
-            </w:r>
-          </w:p>
-        </w:tc>
-        <w:tc>
-          <w:tcPr>
-            <w:shd w:val="clear" w:color="auto" w:fill="F6F8FA"/>
-          </w:tcPr>
-          <w:p>
-            <w:pPr>
-              <w:jc w:val="center"/>
-            </w:pPr>
-            <w:r>
-              <w:rPr>
-                <w:rFonts w:ascii="HarmonyOS Sans" w:hAnsi="HarmonyOS Sans"/>
-                <w:sz w:val="18"/>
-                <w:szCs w:val="18"/>
-              </w:rPr>
-              <w:t>New templates available</w:t>
-            </w:r>
-          </w:p>
-        </w:tc>
-      </w:tr>
-      <w:tr>
-        <w:tc>
-          <w:tcPr>
-            <w:shd w:val="clear" w:color="auto" w:fill="FFFFFF"/>
-          </w:tcPr>
-          <w:p>
-            <w:pPr>
-              <w:jc w:val="center"/>
-            </w:pPr>
-            <w:r>
-              <w:rPr>
-                <w:rFonts w:ascii="HarmonyOS Sans" w:hAnsi="HarmonyOS Sans"/>
-                <w:sz w:val="18"/>
-                <w:szCs w:val="18"/>
-              </w:rPr>
-              <w:t>Gateway uninstall</w:t>
-            </w:r>
-          </w:p>
-        </w:tc>
-        <w:tc>
-          <w:tcPr>
-            <w:shd w:val="clear" w:color="auto" w:fill="FFFFFF"/>
-          </w:tcPr>
-          <w:p>
-            <w:pPr>
-              <w:jc w:val="center"/>
-            </w:pPr>
-            <w:r>
-              <w:rPr>
-                <w:rFonts w:ascii="HarmonyOS Sans" w:hAnsi="HarmonyOS Sans"/>
-                <w:sz w:val="18"/>
-                <w:szCs w:val="18"/>
-              </w:rPr>
-              <w:t>`./scripts/uninstall.sh –all`</w:t>
-            </w:r>
-          </w:p>
-        </w:tc>
-        <w:tc>
-          <w:tcPr>
-            <w:shd w:val="clear" w:color="auto" w:fill="FFFFFF"/>
-          </w:tcPr>
-          <w:p>
-            <w:pPr>
-              <w:jc w:val="center"/>
-            </w:pPr>
-            <w:r>
-              <w:rPr>
-                <w:rFonts w:ascii="HarmonyOS Sans" w:hAnsi="HarmonyOS Sans"/>
-                <w:sz w:val="18"/>
-                <w:szCs w:val="18"/>
-              </w:rPr>
-              <w:t>Docker stack removed</w:t>
-            </w:r>
-          </w:p>
-        </w:tc>
-      </w:tr>
-      <w:tr>
-        <w:tc>
-          <w:tcPr>
-            <w:shd w:val="clear" w:color="auto" w:fill="F6F8FA"/>
-          </w:tcPr>
-          <w:p>
-            <w:pPr>
-              <w:jc w:val="center"/>
-            </w:pPr>
-            <w:r>
-              <w:rPr>
-                <w:rFonts w:ascii="HarmonyOS Sans" w:hAnsi="HarmonyOS Sans"/>
-                <w:sz w:val="18"/>
-                <w:szCs w:val="18"/>
-              </w:rPr>
-              <w:t>Templates uninstall</w:t>
-            </w:r>
-          </w:p>
-        </w:tc>
-        <w:tc>
-          <w:tcPr>
-            <w:shd w:val="clear" w:color="auto" w:fill="F6F8FA"/>
-          </w:tcPr>
-          <w:p>
-            <w:pPr>
-              <w:jc w:val="center"/>
-            </w:pPr>
-            <w:r>
-              <w:rPr>
-                <w:rFonts w:ascii="HarmonyOS Sans" w:hAnsi="HarmonyOS Sans"/>
-                <w:sz w:val="18"/>
-                <w:szCs w:val="18"/>
-              </w:rPr>
-              <w:t>`./scripts/uninstall.sh –all`</w:t>
-            </w:r>
-          </w:p>
-        </w:tc>
-        <w:tc>
-          <w:tcPr>
-            <w:shd w:val="clear" w:color="auto" w:fill="F6F8FA"/>
-          </w:tcPr>
-          <w:p>
-            <w:pPr>
-              <w:jc w:val="center"/>
-            </w:pPr>
-            <w:r>
-              <w:rPr>
-                <w:rFonts w:ascii="HarmonyOS Sans" w:hAnsi="HarmonyOS Sans"/>
-                <w:sz w:val="18"/>
-                <w:szCs w:val="18"/>
-              </w:rPr>
-              <w:t>Skills + modules removed</w:t>
-            </w:r>
-          </w:p>
-        </w:tc>
-      </w:tr>
-      <w:tr>
-        <w:tc>
-          <w:tcPr>
-            <w:shd w:val="clear" w:color="auto" w:fill="FFFFFF"/>
-          </w:tcPr>
-          <w:p>
-            <w:pPr>
-              <w:jc w:val="center"/>
-            </w:pPr>
-            <w:r>
-              <w:rPr>
-                <w:rFonts w:ascii="HarmonyOS Sans" w:hAnsi="HarmonyOS Sans"/>
-                <w:sz w:val="18"/>
-                <w:szCs w:val="18"/>
-              </w:rPr>
-              <w:t>Cloud cleanup</w:t>
-            </w:r>
-          </w:p>
-        </w:tc>
-        <w:tc>
-          <w:tcPr>
-            <w:shd w:val="clear" w:color="auto" w:fill="FFFFFF"/>
-          </w:tcPr>
-          <w:p>
-            <w:pPr>
-              <w:jc w:val="center"/>
-            </w:pPr>
-            <w:r>
-              <w:rPr>
-                <w:rFonts w:ascii="HarmonyOS Sans" w:hAnsi="HarmonyOS Sans"/>
-                <w:sz w:val="18"/>
-                <w:szCs w:val="18"/>
-              </w:rPr>
-              <w:t>`flexusx-dev` deleted</w:t>
-            </w:r>
-          </w:p>
-        </w:tc>
-        <w:tc>
-          <w:tcPr>
-            <w:shd w:val="clear" w:color="auto" w:fill="FFFFFF"/>
-          </w:tcPr>
-          <w:p>
-            <w:pPr>
-              <w:jc w:val="center"/>
-            </w:pPr>
-            <w:r>
-              <w:rPr>
-                <w:rFonts w:ascii="HarmonyOS Sans" w:hAnsi="HarmonyOS Sans"/>
-                <w:sz w:val="18"/>
-                <w:szCs w:val="18"/>
-              </w:rPr>
-              <w:t>No running instance</w:t>
-            </w:r>
-          </w:p>
-        </w:tc>
-      </w:tr>
-      <w:tr>
-        <w:tc>
-          <w:tcPr>
-            <w:shd w:val="clear" w:color="auto" w:fill="F6F8FA"/>
-          </w:tcPr>
-          <w:p>
-            <w:pPr>
-              <w:jc w:val="center"/>
-            </w:pPr>
-            <w:r>
-              <w:rPr>
-                <w:rFonts w:ascii="HarmonyOS Sans" w:hAnsi="HarmonyOS Sans"/>
-                <w:sz w:val="18"/>
-                <w:szCs w:val="18"/>
-              </w:rPr>
-              <w:t>EIP</w:t>
-            </w:r>
-          </w:p>
-        </w:tc>
-        <w:tc>
-          <w:tcPr>
-            <w:shd w:val="clear" w:color="auto" w:fill="F6F8FA"/>
-          </w:tcPr>
-          <w:p>
-            <w:pPr>
-              <w:jc w:val="center"/>
-            </w:pPr>
-            <w:r>
-              <w:rPr>
-                <w:rFonts w:ascii="HarmonyOS Sans" w:hAnsi="HarmonyOS Sans"/>
-                <w:sz w:val="18"/>
-                <w:szCs w:val="18"/>
-              </w:rPr>
-              <w:t>Released</w:t>
-            </w:r>
-          </w:p>
-        </w:tc>
-        <w:tc>
-          <w:tcPr>
-            <w:shd w:val="clear" w:color="auto" w:fill="F6F8FA"/>
-          </w:tcPr>
-          <w:p>
-            <w:pPr>
-              <w:jc w:val="center"/>
-            </w:pPr>
-            <w:r>
-              <w:rPr>
-                <w:rFonts w:ascii="HarmonyOS Sans" w:hAnsi="HarmonyOS Sans"/>
-                <w:sz w:val="18"/>
-                <w:szCs w:val="18"/>
-              </w:rPr>
-              <w:t>No public IP charges</w:t>
-            </w:r>
-          </w:p>
-        </w:tc>
-      </w:tr>
-      <w:tr>
-        <w:tc>
-          <w:tcPr>
-            <w:shd w:val="clear" w:color="auto" w:fill="FFFFFF"/>
-          </w:tcPr>
-          <w:p>
-            <w:pPr>
-              <w:jc w:val="center"/>
-            </w:pPr>
-            <w:r>
-              <w:rPr>
-                <w:rFonts w:ascii="HarmonyOS Sans" w:hAnsi="HarmonyOS Sans"/>
-                <w:sz w:val="18"/>
-                <w:szCs w:val="18"/>
-              </w:rPr>
-              <w:t>Security group</w:t>
-            </w:r>
-          </w:p>
-        </w:tc>
-        <w:tc>
-          <w:tcPr>
-            <w:shd w:val="clear" w:color="auto" w:fill="FFFFFF"/>
-          </w:tcPr>
-          <w:p>
-            <w:pPr>
-              <w:jc w:val="center"/>
-            </w:pPr>
-            <w:r>
-              <w:rPr>
-                <w:rFonts w:ascii="HarmonyOS Sans" w:hAnsi="HarmonyOS Sans"/>
-                <w:sz w:val="18"/>
-                <w:szCs w:val="18"/>
-              </w:rPr>
-              <w:t>`sg-xgate` deleted</w:t>
-            </w:r>
-          </w:p>
-        </w:tc>
-        <w:tc>
-          <w:tcPr>
-            <w:shd w:val="clear" w:color="auto" w:fill="FFFFFF"/>
-          </w:tcPr>
-          <w:p>
-            <w:pPr>
-              <w:jc w:val="center"/>
-            </w:pPr>
-            <w:r>
-              <w:rPr>
-                <w:rFonts w:ascii="HarmonyOS Sans" w:hAnsi="HarmonyOS Sans"/>
-                <w:sz w:val="18"/>
-                <w:szCs w:val="18"/>
-              </w:rPr>
-              <w:t>No SG charges</w:t>
-            </w:r>
-          </w:p>
-        </w:tc>
-      </w:tr>
-      <w:tr>
-        <w:tc>
-          <w:tcPr>
-            <w:shd w:val="clear" w:color="auto" w:fill="F6F8FA"/>
-          </w:tcPr>
-          <w:p>
-            <w:pPr>
-              <w:jc w:val="center"/>
-            </w:pPr>
-            <w:r>
-              <w:rPr>
-                <w:rFonts w:ascii="HarmonyOS Sans" w:hAnsi="HarmonyOS Sans"/>
-                <w:sz w:val="18"/>
-                <w:szCs w:val="18"/>
-              </w:rPr>
-              <w:t>SSH config</w:t>
-            </w:r>
-          </w:p>
-        </w:tc>
-        <w:tc>
-          <w:tcPr>
-            <w:shd w:val="clear" w:color="auto" w:fill="F6F8FA"/>
-          </w:tcPr>
-          <w:p>
-            <w:pPr>
-              <w:jc w:val="center"/>
-            </w:pPr>
-            <w:r>
-              <w:rPr>
-                <w:rFonts w:ascii="HarmonyOS Sans" w:hAnsi="HarmonyOS Sans"/>
-                <w:sz w:val="18"/>
-                <w:szCs w:val="18"/>
-              </w:rPr>
-              <w:t>Host entry removed</w:t>
-            </w:r>
-          </w:p>
-        </w:tc>
-        <w:tc>
-          <w:tcPr>
-            <w:shd w:val="clear" w:color="auto" w:fill="F6F8FA"/>
-          </w:tcPr>
-          <w:p>
-            <w:pPr>
-              <w:jc w:val="center"/>
-            </w:pPr>
-            <w:r>
-              <w:rPr>
-                <w:rFonts w:ascii="HarmonyOS Sans" w:hAnsi="HarmonyOS Sans"/>
-                <w:sz w:val="18"/>
-                <w:szCs w:val="18"/>
-              </w:rPr>
-              <w:t>Clean config</w:t>
-            </w:r>
-          </w:p>
-        </w:tc>
-      </w:tr>
-    </w:tbl>
-    <w:p>
-      <w:pPr>
-        <w:pStyle w:val="BodyText"/>
-      </w:pPr>
-      <w:r>
-        <w:rPr>
-          <w:iCs/>
-          <w:i/>
-        </w:rPr>
-        <w:t xml:space="preserve">This guide was generated using the</w:t>
-      </w:r>
-      <w:r>
-        <w:rPr>
-          <w:iCs/>
-          <w:i/>
-        </w:rPr>
-        <w:t xml:space="preserve"> </w:t>
-      </w:r>
-      <w:r>
-        <w:rPr>
-          <w:rStyle w:val="VerbatimChar"/>
-          <w:iCs/>
-          <w:i/>
-        </w:rPr>
-        <w:t xml:space="preserve">guide.cls</w:t>
-      </w:r>
-      <w:r>
-        <w:rPr>
-          <w:iCs/>
-          <w:i/>
-        </w:rPr>
-        <w:t xml:space="preserve"> </w:t>
-      </w:r>
-      <w:r>
-        <w:rPr>
-          <w:iCs/>
-          <w:i/>
-        </w:rPr>
-        <w:t xml:space="preserve">template. For the</w:t>
-      </w:r>
-      <w:r>
-        <w:rPr>
-          <w:iCs/>
-          <w:i/>
-        </w:rPr>
-        <w:t xml:space="preserve"> </w:t>
-      </w:r>
-      <w:r>
-        <w:rPr>
-          <w:iCs/>
-          <w:i/>
-        </w:rPr>
-        <w:t xml:space="preserve">full command reference, see the template’s README.md or run</w:t>
-      </w:r>
-      <w:r>
-        <w:rPr>
-          <w:iCs/>
-          <w:i/>
-        </w:rPr>
-        <w:t xml:space="preserve"> </w:t>
-      </w:r>
-      <w:r>
-        <w:rPr>
-          <w:rStyle w:val="VerbatimChar"/>
-          <w:iCs/>
-          <w:i/>
-        </w:rPr>
-        <w:t xml:space="preserve">/skill huawei-template-guide</w:t>
-      </w:r>
-      <w:r>
-        <w:rPr>
-          <w:iCs/>
-          <w:i/>
-        </w:rPr>
-        <w:t xml:space="preserve"> </w:t>
-      </w:r>
-      <w:r>
-        <w:rPr>
-          <w:iCs/>
-          <w:i/>
-        </w:rPr>
-        <w:t xml:space="preserve">in your coding agent.</w:t>
-      </w:r>
-    </w:p>
-    <w:p>
-      <w:r>
-        <w:br w:type="page"/>
-      </w:r>
-    </w:p>
-    <w:p>
-      <w:pPr>
-        <w:pStyle w:val="Heading1"/>
-        <w:pBdr>
-          <w:bottom w:val="single" w:sz="12" w:space="2" w:color="C7000B"/>
-        </w:pBdr>
-        <w:tabs>
-          <w:tab w:val="right" w:pos="9638"/>
-        </w:tabs>
-      </w:pPr>
-      <w:bookmarkStart w:id="139" w:name="sec-changelog"/>
-      <w:r>
-        <w:rPr>
-          <w:sz w:val="112"/>
-          <w:szCs w:val="112"/>
-        </w:rPr>
-        <w:t xml:space="preserve">9</w:t>
-      </w:r>
-      <w:r>
-        <w:tab/>
-      </w:r>
-      <w:r>
-        <w:t xml:space="preserve">Changelog</w:t>
-      </w:r>
-      <w:bookmarkEnd w:id="139"/>
     </w:p>
     <w:p>
       <w:pPr>
@@ -16495,7 +14673,7 @@
         <w:pStyle w:val="BodyText"/>
       </w:pPr>
       <w:r>
-        <w:t xml:space="preserve">Added Chapter 7: Tips and Tricks with tmux for persistent SSH sessions, essential tmux commands, and tmux configuration for opencode (escape-time, mouse, clipboard, extended-keys for Shift+Enter).</w:t>
+        <w:t xml:space="preserve">Removed Tips and Tricks chapter (tmux configuration) — required VS Code-specific keybindings that don’t generalize across terminal setups.</w:t>
       </w:r>
     </w:p>
     <w:p>
@@ -20264,39 +18442,9 @@
     </w:lvlOverride>
   </w:num>
   <w:num w:numId="1034">
-    <w:abstractNumId w:val="99201"/>
-    <w:lvlOverride w:ilvl="0">
-      <w:startOverride w:val="1"/>
-    </w:lvlOverride>
-    <w:lvlOverride w:ilvl="1">
-      <w:startOverride w:val="1"/>
-    </w:lvlOverride>
-    <w:lvlOverride w:ilvl="2">
-      <w:startOverride w:val="1"/>
-    </w:lvlOverride>
-    <w:lvlOverride w:ilvl="3">
-      <w:startOverride w:val="1"/>
-    </w:lvlOverride>
-    <w:lvlOverride w:ilvl="4">
-      <w:startOverride w:val="1"/>
-    </w:lvlOverride>
-    <w:lvlOverride w:ilvl="5">
-      <w:startOverride w:val="1"/>
-    </w:lvlOverride>
-    <w:lvlOverride w:ilvl="6">
-      <w:startOverride w:val="1"/>
-    </w:lvlOverride>
-    <w:lvlOverride w:ilvl="7">
-      <w:startOverride w:val="1"/>
-    </w:lvlOverride>
-    <w:lvlOverride w:ilvl="8">
-      <w:startOverride w:val="1"/>
-    </w:lvlOverride>
+    <w:abstractNumId w:val="991"/>
   </w:num>
   <w:num w:numId="1035">
-    <w:abstractNumId w:val="991"/>
-  </w:num>
-  <w:num w:numId="1036">
     <w:abstractNumId w:val="99201"/>
     <w:lvlOverride w:ilvl="0">
       <w:startOverride w:val="1"/>

</xml_diff>

<commit_message>
v3.9.0: add testsummary, teststeps, testresultbadge to testbook template
Features:
- testsummary environment: overview table (ID/Title/Status) with Huawei-red header
- teststeps environment: 4-column step table (Step/Action/Expected/Status)
- \testresultbadge command: green Pass / red Fail / orange Blocked / gray Untested
- Fixed testcase layout: full-width tabular with dimexpr, proper text alignment
- Lua filter: handlers for testsummary and teststeps in DOCX/MD/HTML
- Samples: both PT+EN demonstrate all new features
- SKILL.md: documented all new commands with examples
</commit_message>
<xml_diff>
--- a/setup-guide/setup-guide.docx
+++ b/setup-guide/setup-guide.docx
@@ -70,7 +70,7 @@
         <w:pStyle w:val="CoverMeta"/>
       </w:pPr>
       <w:r>
-        <w:t xml:space="preserve">v3.8.0</w:t>
+        <w:t xml:space="preserve">v3.9.0</w:t>
       </w:r>
     </w:p>
     <w:p>
@@ -14656,7 +14656,7 @@
         <w:rPr>
           <w:b/>
         </w:rPr>
-        <w:t xml:space="preserve">3.8.0</w:t>
+        <w:t xml:space="preserve">3.9.0</w:t>
       </w:r>
       <w:r>
         <w:tab/>
@@ -14665,7 +14665,7 @@
         <w:rPr>
           <w:i/>
         </w:rPr>
-        <w:t xml:space="preserve">2026-09-13</w:t>
+        <w:t xml:space="preserve">2026-09-12</w:t>
       </w:r>
     </w:p>
     <w:p>
@@ -14673,7 +14673,22 @@
         <w:pStyle w:val="BodyText"/>
       </w:pPr>
       <w:r>
-        <w:t xml:space="preserve">Removed Tips and Tricks chapter (tmux configuration) — required VS Code-specific keybindings that don’t generalize across terminal setups.</w:t>
+        <w:t xml:space="preserve">Added testsummary environment, teststeps environment, and</w:t>
+      </w:r>
+      <w:r>
+        <w:t xml:space="preserve"> </w:t>
+      </w:r>
+      <w:r>
+        <w:rPr>
+          <w:rStyle w:val="VerbatimChar"/>
+        </w:rPr>
+        <w:t xml:space="preserve">\testresultbadge</w:t>
+      </w:r>
+      <w:r>
+        <w:t xml:space="preserve"> </w:t>
+      </w:r>
+      <w:r>
+        <w:t xml:space="preserve">command to testbook template. Fixed testcase layout (full-width tabular with proper text alignment).</w:t>
       </w:r>
     </w:p>
     <w:p>
@@ -14686,7 +14701,7 @@
         <w:rPr>
           <w:b/>
         </w:rPr>
-        <w:t xml:space="preserve">3.7.0</w:t>
+        <w:t xml:space="preserve">3.8.1</w:t>
       </w:r>
       <w:r>
         <w:tab/>
@@ -14695,7 +14710,7 @@
         <w:rPr>
           <w:i/>
         </w:rPr>
-        <w:t xml:space="preserve">2026-09-13</w:t>
+        <w:t xml:space="preserve">2026-09-12</w:t>
       </w:r>
     </w:p>
     <w:p>
@@ -14703,52 +14718,7 @@
         <w:pStyle w:val="BodyText"/>
       </w:pPr>
       <w:r>
-        <w:t xml:space="preserve">Added</w:t>
-      </w:r>
-      <w:r>
-        <w:t xml:space="preserve"> </w:t>
-      </w:r>
-      <w:r>
-        <w:rPr>
-          <w:rStyle w:val="VerbatimChar"/>
-        </w:rPr>
-        <w:t xml:space="preserve">testbook</w:t>
-      </w:r>
-      <w:r>
-        <w:t xml:space="preserve"> </w:t>
-      </w:r>
-      <w:r>
-        <w:t xml:space="preserve">template for POC/acceptance test case documents with</w:t>
-      </w:r>
-      <w:r>
-        <w:t xml:space="preserve"> </w:t>
-      </w:r>
-      <w:r>
-        <w:rPr>
-          <w:rStyle w:val="VerbatimChar"/>
-        </w:rPr>
-        <w:t xml:space="preserve">testcase</w:t>
-      </w:r>
-      <w:r>
-        <w:t xml:space="preserve"> </w:t>
-      </w:r>
-      <w:r>
-        <w:t xml:space="preserve">environment and</w:t>
-      </w:r>
-      <w:r>
-        <w:t xml:space="preserve"> </w:t>
-      </w:r>
-      <w:r>
-        <w:rPr>
-          <w:rStyle w:val="VerbatimChar"/>
-        </w:rPr>
-        <w:t xml:space="preserve">[noanswers]</w:t>
-      </w:r>
-      <w:r>
-        <w:t xml:space="preserve"> </w:t>
-      </w:r>
-      <w:r>
-        <w:t xml:space="preserve">option.</w:t>
+        <w:t xml:space="preserve">End-to-end quality review: fixed testbook PDF metadata title, removed stray user DOCX from template dir, fixed round-trip.sh variable typo, updated stale references in AGENTS.md and README.md, committed testbook sample PDFs, set TZ for pandoc cover time consistency, widened pandoc version range.</w:t>
       </w:r>
     </w:p>
     <w:p>
@@ -14761,7 +14731,7 @@
         <w:rPr>
           <w:b/>
         </w:rPr>
-        <w:t xml:space="preserve">3.6.0</w:t>
+        <w:t xml:space="preserve">3.8.0</w:t>
       </w:r>
       <w:r>
         <w:tab/>
@@ -14770,7 +14740,7 @@
         <w:rPr>
           <w:i/>
         </w:rPr>
-        <w:t xml:space="preserve">2026-09-13</w:t>
+        <w:t xml:space="preserve">2026-09-12</w:t>
       </w:r>
     </w:p>
     <w:p>
@@ -14778,52 +14748,7 @@
         <w:pStyle w:val="BodyText"/>
       </w:pPr>
       <w:r>
-        <w:t xml:space="preserve">Added</w:t>
-      </w:r>
-      <w:r>
-        <w:t xml:space="preserve"> </w:t>
-      </w:r>
-      <w:r>
-        <w:rPr>
-          <w:rStyle w:val="VerbatimChar"/>
-        </w:rPr>
-        <w:t xml:space="preserve">\setdocauthors</w:t>
-      </w:r>
-      <w:r>
-        <w:t xml:space="preserve"> </w:t>
-      </w:r>
-      <w:r>
-        <w:t xml:space="preserve">command and</w:t>
-      </w:r>
-      <w:r>
-        <w:t xml:space="preserve"> </w:t>
-      </w:r>
-      <w:r>
-        <w:rPr>
-          <w:rStyle w:val="VerbatimChar"/>
-        </w:rPr>
-        <w:t xml:space="preserve">[noauthors]</w:t>
-      </w:r>
-      <w:r>
-        <w:t xml:space="preserve"> </w:t>
-      </w:r>
-      <w:r>
-        <w:t xml:space="preserve">class option to both templates. Authors are displayed on the cover page (optional — hidden if not set or if</w:t>
-      </w:r>
-      <w:r>
-        <w:t xml:space="preserve"> </w:t>
-      </w:r>
-      <w:r>
-        <w:rPr>
-          <w:rStyle w:val="VerbatimChar"/>
-        </w:rPr>
-        <w:t xml:space="preserve">[noauthors]</w:t>
-      </w:r>
-      <w:r>
-        <w:t xml:space="preserve"> </w:t>
-      </w:r>
-      <w:r>
-        <w:t xml:space="preserve">is passed). Demonstrated in all 4 samples.</w:t>
+        <w:t xml:space="preserve">Removed Tips and Tricks chapter (tmux configuration) — required VS Code-specific keybindings that don’t generalize across terminal setups.</w:t>
       </w:r>
     </w:p>
     <w:p>
@@ -14836,7 +14761,7 @@
         <w:rPr>
           <w:b/>
         </w:rPr>
-        <w:t xml:space="preserve">3.5.0</w:t>
+        <w:t xml:space="preserve">3.7.0</w:t>
       </w:r>
       <w:r>
         <w:tab/>
@@ -14845,7 +14770,7 @@
         <w:rPr>
           <w:i/>
         </w:rPr>
-        <w:t xml:space="preserve">2026-09-13</w:t>
+        <w:t xml:space="preserve">2026-09-12</w:t>
       </w:r>
     </w:p>
     <w:p>
@@ -14853,73 +14778,52 @@
         <w:pStyle w:val="BodyText"/>
       </w:pPr>
       <w:r>
-        <w:t xml:space="preserve">Reorganized project structure: moved</w:t>
-      </w:r>
-      <w:r>
-        <w:t xml:space="preserve"> </w:t>
-      </w:r>
-      <w:r>
-        <w:rPr>
-          <w:rStyle w:val="VerbatimChar"/>
-        </w:rPr>
-        <w:t xml:space="preserve">build.sh</w:t>
-      </w:r>
-      <w:r>
-        <w:t xml:space="preserve">,</w:t>
-      </w:r>
-      <w:r>
-        <w:t xml:space="preserve"> </w:t>
-      </w:r>
-      <w:r>
-        <w:rPr>
-          <w:rStyle w:val="VerbatimChar"/>
-        </w:rPr>
-        <w:t xml:space="preserve">install.sh</w:t>
-      </w:r>
-      <w:r>
-        <w:t xml:space="preserve">, and</w:t>
-      </w:r>
-      <w:r>
-        <w:t xml:space="preserve"> </w:t>
-      </w:r>
-      <w:r>
-        <w:rPr>
-          <w:rStyle w:val="VerbatimChar"/>
-        </w:rPr>
-        <w:t xml:space="preserve">uninstall.sh</w:t>
-      </w:r>
-      <w:r>
-        <w:t xml:space="preserve"> </w:t>
-      </w:r>
-      <w:r>
-        <w:t xml:space="preserve">from repo root to</w:t>
-      </w:r>
-      <w:r>
-        <w:t xml:space="preserve"> </w:t>
-      </w:r>
-      <w:r>
-        <w:rPr>
-          <w:rStyle w:val="VerbatimChar"/>
-        </w:rPr>
-        <w:t xml:space="preserve">scripts/</w:t>
-      </w:r>
-      <w:r>
-        <w:t xml:space="preserve"> </w:t>
-      </w:r>
-      <w:r>
-        <w:t xml:space="preserve">directory. Updated all references in Makefile, README, AGENTS.md, SKILL.md, and setup guide. One-liner URLs now use</w:t>
-      </w:r>
-      <w:r>
-        <w:t xml:space="preserve"> </w:t>
-      </w:r>
-      <w:r>
-        <w:rPr>
-          <w:rStyle w:val="VerbatimChar"/>
-        </w:rPr>
-        <w:t xml:space="preserve">main/scripts/install.sh</w:t>
-      </w:r>
-      <w:r>
-        <w:t xml:space="preserve">.</w:t>
+        <w:t xml:space="preserve">Added</w:t>
+      </w:r>
+      <w:r>
+        <w:t xml:space="preserve"> </w:t>
+      </w:r>
+      <w:r>
+        <w:rPr>
+          <w:rStyle w:val="VerbatimChar"/>
+        </w:rPr>
+        <w:t xml:space="preserve">testbook</w:t>
+      </w:r>
+      <w:r>
+        <w:t xml:space="preserve"> </w:t>
+      </w:r>
+      <w:r>
+        <w:t xml:space="preserve">template for POC/acceptance test case documents with</w:t>
+      </w:r>
+      <w:r>
+        <w:t xml:space="preserve"> </w:t>
+      </w:r>
+      <w:r>
+        <w:rPr>
+          <w:rStyle w:val="VerbatimChar"/>
+        </w:rPr>
+        <w:t xml:space="preserve">testcase</w:t>
+      </w:r>
+      <w:r>
+        <w:t xml:space="preserve"> </w:t>
+      </w:r>
+      <w:r>
+        <w:t xml:space="preserve">environment and</w:t>
+      </w:r>
+      <w:r>
+        <w:t xml:space="preserve"> </w:t>
+      </w:r>
+      <w:r>
+        <w:rPr>
+          <w:rStyle w:val="VerbatimChar"/>
+        </w:rPr>
+        <w:t xml:space="preserve">[noanswers]</w:t>
+      </w:r>
+      <w:r>
+        <w:t xml:space="preserve"> </w:t>
+      </w:r>
+      <w:r>
+        <w:t xml:space="preserve">option.</w:t>
       </w:r>
     </w:p>
     <w:p>
@@ -14932,7 +14836,7 @@
         <w:rPr>
           <w:b/>
         </w:rPr>
-        <w:t xml:space="preserve">3.4.0</w:t>
+        <w:t xml:space="preserve">3.6.0</w:t>
       </w:r>
       <w:r>
         <w:tab/>
@@ -14941,7 +14845,7 @@
         <w:rPr>
           <w:i/>
         </w:rPr>
-        <w:t xml:space="preserve">2026-09-13</w:t>
+        <w:t xml:space="preserve">2026-09-12</w:t>
       </w:r>
     </w:p>
     <w:p>
@@ -14949,86 +14853,52 @@
         <w:pStyle w:val="BodyText"/>
       </w:pPr>
       <w:r>
-        <w:rPr>
-          <w:rStyle w:val="VerbatimChar"/>
-        </w:rPr>
-        <w:t xml:space="preserve">install.sh</w:t>
-      </w:r>
-      <w:r>
-        <w:t xml:space="preserve">: opencode skills and VS Code LaTeX Workshop are now optional prompts (default yes). Removed LTeX extension (was failing to install). One-liner detects existing installation and prompts to update with version display (</w:t>
-      </w:r>
-      <w:r>
-        <w:rPr>
-          <w:rStyle w:val="VerbatimChar"/>
-        </w:rPr>
-        <w:t xml:space="preserve">v3.3.6 → v3.3.7</w:t>
-      </w:r>
-      <w:r>
-        <w:t xml:space="preserve">). Uses absolute paths to prevent nested clones.</w:t>
-      </w:r>
-    </w:p>
-    <w:p>
-      <w:pPr>
-        <w:pStyle w:val="BodyText"/>
-      </w:pPr>
-      <w:r>
-        <w:rPr>
-          <w:rStyle w:val="VerbatimChar"/>
-        </w:rPr>
-        <w:t xml:space="preserve">uninstall.sh</w:t>
-      </w:r>
-      <w:r>
-        <w:t xml:space="preserve">: Added one-liner support (</w:t>
-      </w:r>
-      <w:r>
-        <w:rPr>
-          <w:rStyle w:val="VerbatimChar"/>
-        </w:rPr>
-        <w:t xml:space="preserve">curl | bash</w:t>
-      </w:r>
-      <w:r>
-        <w:t xml:space="preserve">). Added</w:t>
-      </w:r>
-      <w:r>
-        <w:t xml:space="preserve"> </w:t>
-      </w:r>
-      <w:r>
-        <w:t xml:space="preserve">“</w:t>
-      </w:r>
-      <w:r>
-        <w:t xml:space="preserve">Remove 100%</w:t>
-      </w:r>
-      <w:r>
-        <w:t xml:space="preserve">”</w:t>
-      </w:r>
-      <w:r>
-        <w:t xml:space="preserve"> </w:t>
-      </w:r>
-      <w:r>
-        <w:t xml:space="preserve">nuclear option (option 4) to interactive menu. Added</w:t>
-      </w:r>
-      <w:r>
-        <w:t xml:space="preserve"> </w:t>
-      </w:r>
-      <w:r>
-        <w:rPr>
-          <w:rStyle w:val="VerbatimChar"/>
-        </w:rPr>
-        <w:t xml:space="preserve">–repo</w:t>
-      </w:r>
-      <w:r>
-        <w:t xml:space="preserve"> </w:t>
-      </w:r>
-      <w:r>
-        <w:t xml:space="preserve">flag.</w:t>
-      </w:r>
-    </w:p>
-    <w:p>
-      <w:pPr>
-        <w:pStyle w:val="BodyText"/>
-      </w:pPr>
-      <w:r>
-        <w:t xml:space="preserve">Updated Chapter 6 with optional component prompts and update detection. Updated Chapter 7 with one-liner update/uninstall and full menu documentation.</w:t>
+        <w:t xml:space="preserve">Added</w:t>
+      </w:r>
+      <w:r>
+        <w:t xml:space="preserve"> </w:t>
+      </w:r>
+      <w:r>
+        <w:rPr>
+          <w:rStyle w:val="VerbatimChar"/>
+        </w:rPr>
+        <w:t xml:space="preserve">\setdocauthors</w:t>
+      </w:r>
+      <w:r>
+        <w:t xml:space="preserve"> </w:t>
+      </w:r>
+      <w:r>
+        <w:t xml:space="preserve">command and</w:t>
+      </w:r>
+      <w:r>
+        <w:t xml:space="preserve"> </w:t>
+      </w:r>
+      <w:r>
+        <w:rPr>
+          <w:rStyle w:val="VerbatimChar"/>
+        </w:rPr>
+        <w:t xml:space="preserve">[noauthors]</w:t>
+      </w:r>
+      <w:r>
+        <w:t xml:space="preserve"> </w:t>
+      </w:r>
+      <w:r>
+        <w:t xml:space="preserve">class option to both templates. Authors are displayed on the cover page (optional — hidden if not set or if</w:t>
+      </w:r>
+      <w:r>
+        <w:t xml:space="preserve"> </w:t>
+      </w:r>
+      <w:r>
+        <w:rPr>
+          <w:rStyle w:val="VerbatimChar"/>
+        </w:rPr>
+        <w:t xml:space="preserve">[noauthors]</w:t>
+      </w:r>
+      <w:r>
+        <w:t xml:space="preserve"> </w:t>
+      </w:r>
+      <w:r>
+        <w:t xml:space="preserve">is passed). Demonstrated in all 4 samples.</w:t>
       </w:r>
     </w:p>
     <w:p>
@@ -15041,7 +14911,7 @@
         <w:rPr>
           <w:b/>
         </w:rPr>
-        <w:t xml:space="preserve">3.3.0</w:t>
+        <w:t xml:space="preserve">3.5.0</w:t>
       </w:r>
       <w:r>
         <w:tab/>
@@ -15050,7 +14920,7 @@
         <w:rPr>
           <w:i/>
         </w:rPr>
-        <w:t xml:space="preserve">2026-09-13</w:t>
+        <w:t xml:space="preserve">2026-09-12</w:t>
       </w:r>
     </w:p>
     <w:p>
@@ -15058,70 +14928,70 @@
         <w:pStyle w:val="BodyText"/>
       </w:pPr>
       <w:r>
-        <w:t xml:space="preserve">Moved pre-compiled setup guide to</w:t>
-      </w:r>
-      <w:r>
-        <w:t xml:space="preserve"> </w:t>
-      </w:r>
-      <w:r>
-        <w:rPr>
-          <w:rStyle w:val="VerbatimChar"/>
-        </w:rPr>
-        <w:t xml:space="preserve">setup-guide/</w:t>
-      </w:r>
-      <w:r>
-        <w:t xml:space="preserve"> </w:t>
-      </w:r>
-      <w:r>
-        <w:t xml:space="preserve">folder in repo root with all four formats (PDF, MD, DOCX, HTML). Users can read these before cloning to understand the installation process.</w:t>
-      </w:r>
-    </w:p>
-    <w:p>
-      <w:pPr>
-        <w:pStyle w:val="BodyText"/>
-      </w:pPr>
-      <w:r>
-        <w:t xml:space="preserve">Updated Makefile</w:t>
-      </w:r>
-      <w:r>
-        <w:t xml:space="preserve"> </w:t>
-      </w:r>
-      <w:r>
-        <w:rPr>
-          <w:rStyle w:val="VerbatimChar"/>
-        </w:rPr>
-        <w:t xml:space="preserve">setup-guide</w:t>
-      </w:r>
-      <w:r>
-        <w:t xml:space="preserve"> </w:t>
-      </w:r>
-      <w:r>
-        <w:t xml:space="preserve">target to generate and copy all four formats.</w:t>
-      </w:r>
-    </w:p>
-    <w:p>
-      <w:pPr>
-        <w:pStyle w:val="BodyText"/>
-      </w:pPr>
-      <w:r>
-        <w:t xml:space="preserve">Updated README with pre-compiled setup guide section and format comparison table.</w:t>
-      </w:r>
-    </w:p>
-    <w:p>
-      <w:pPr>
-        <w:pStyle w:val="BodyText"/>
-      </w:pPr>
-      <w:r>
-        <w:t xml:space="preserve">Updated .gitignore to track all four formats in</w:t>
-      </w:r>
-      <w:r>
-        <w:t xml:space="preserve"> </w:t>
-      </w:r>
-      <w:r>
-        <w:rPr>
-          <w:rStyle w:val="VerbatimChar"/>
-        </w:rPr>
-        <w:t xml:space="preserve">setup-guide/</w:t>
+        <w:t xml:space="preserve">Reorganized project structure: moved</w:t>
+      </w:r>
+      <w:r>
+        <w:t xml:space="preserve"> </w:t>
+      </w:r>
+      <w:r>
+        <w:rPr>
+          <w:rStyle w:val="VerbatimChar"/>
+        </w:rPr>
+        <w:t xml:space="preserve">build.sh</w:t>
+      </w:r>
+      <w:r>
+        <w:t xml:space="preserve">,</w:t>
+      </w:r>
+      <w:r>
+        <w:t xml:space="preserve"> </w:t>
+      </w:r>
+      <w:r>
+        <w:rPr>
+          <w:rStyle w:val="VerbatimChar"/>
+        </w:rPr>
+        <w:t xml:space="preserve">install.sh</w:t>
+      </w:r>
+      <w:r>
+        <w:t xml:space="preserve">, and</w:t>
+      </w:r>
+      <w:r>
+        <w:t xml:space="preserve"> </w:t>
+      </w:r>
+      <w:r>
+        <w:rPr>
+          <w:rStyle w:val="VerbatimChar"/>
+        </w:rPr>
+        <w:t xml:space="preserve">uninstall.sh</w:t>
+      </w:r>
+      <w:r>
+        <w:t xml:space="preserve"> </w:t>
+      </w:r>
+      <w:r>
+        <w:t xml:space="preserve">from repo root to</w:t>
+      </w:r>
+      <w:r>
+        <w:t xml:space="preserve"> </w:t>
+      </w:r>
+      <w:r>
+        <w:rPr>
+          <w:rStyle w:val="VerbatimChar"/>
+        </w:rPr>
+        <w:t xml:space="preserve">scripts/</w:t>
+      </w:r>
+      <w:r>
+        <w:t xml:space="preserve"> </w:t>
+      </w:r>
+      <w:r>
+        <w:t xml:space="preserve">directory. Updated all references in Makefile, README, AGENTS.md, SKILL.md, and setup guide. One-liner URLs now use</w:t>
+      </w:r>
+      <w:r>
+        <w:t xml:space="preserve"> </w:t>
+      </w:r>
+      <w:r>
+        <w:rPr>
+          <w:rStyle w:val="VerbatimChar"/>
+        </w:rPr>
+        <w:t xml:space="preserve">main/scripts/install.sh</w:t>
       </w:r>
       <w:r>
         <w:t xml:space="preserve">.</w:t>
@@ -15137,7 +15007,7 @@
         <w:rPr>
           <w:b/>
         </w:rPr>
-        <w:t xml:space="preserve">3.2.1</w:t>
+        <w:t xml:space="preserve">3.4.0</w:t>
       </w:r>
       <w:r>
         <w:tab/>
@@ -15146,7 +15016,7 @@
         <w:rPr>
           <w:i/>
         </w:rPr>
-        <w:t xml:space="preserve">2026-09-13</w:t>
+        <w:t xml:space="preserve">2026-09-12</w:t>
       </w:r>
     </w:p>
     <w:p>
@@ -15154,7 +15024,45 @@
         <w:pStyle w:val="BodyText"/>
       </w:pPr>
       <w:r>
-        <w:t xml:space="preserve">Renamed Chapter 7 from</w:t>
+        <w:rPr>
+          <w:rStyle w:val="VerbatimChar"/>
+        </w:rPr>
+        <w:t xml:space="preserve">install.sh</w:t>
+      </w:r>
+      <w:r>
+        <w:t xml:space="preserve">: opencode skills and VS Code LaTeX Workshop are now optional prompts (default yes). Removed LTeX extension (was failing to install). One-liner detects existing installation and prompts to update with version display (</w:t>
+      </w:r>
+      <w:r>
+        <w:rPr>
+          <w:rStyle w:val="VerbatimChar"/>
+        </w:rPr>
+        <w:t xml:space="preserve">v3.3.6 → v3.3.7</w:t>
+      </w:r>
+      <w:r>
+        <w:t xml:space="preserve">). Uses absolute paths to prevent nested clones.</w:t>
+      </w:r>
+    </w:p>
+    <w:p>
+      <w:pPr>
+        <w:pStyle w:val="BodyText"/>
+      </w:pPr>
+      <w:r>
+        <w:rPr>
+          <w:rStyle w:val="VerbatimChar"/>
+        </w:rPr>
+        <w:t xml:space="preserve">uninstall.sh</w:t>
+      </w:r>
+      <w:r>
+        <w:t xml:space="preserve">: Added one-liner support (</w:t>
+      </w:r>
+      <w:r>
+        <w:rPr>
+          <w:rStyle w:val="VerbatimChar"/>
+        </w:rPr>
+        <w:t xml:space="preserve">curl | bash</w:t>
+      </w:r>
+      <w:r>
+        <w:t xml:space="preserve">). Added</w:t>
       </w:r>
       <w:r>
         <w:t xml:space="preserve"> </w:t>
@@ -15163,7 +15071,7 @@
         <w:t xml:space="preserve">“</w:t>
       </w:r>
       <w:r>
-        <w:t xml:space="preserve">Clean Up</w:t>
+        <w:t xml:space="preserve">Remove 100%</w:t>
       </w:r>
       <w:r>
         <w:t xml:space="preserve">”</w:t>
@@ -15172,22 +15080,30 @@
         <w:t xml:space="preserve"> </w:t>
       </w:r>
       <w:r>
-        <w:t xml:space="preserve">to</w:t>
-      </w:r>
-      <w:r>
-        <w:t xml:space="preserve"> </w:t>
-      </w:r>
-      <w:r>
-        <w:t xml:space="preserve">“</w:t>
-      </w:r>
-      <w:r>
-        <w:t xml:space="preserve">Operations and Maintenance</w:t>
-      </w:r>
-      <w:r>
-        <w:t xml:space="preserve">”</w:t>
-      </w:r>
-      <w:r>
-        <w:t xml:space="preserve">. Added subsections for updating and uninstalling both the MaaS Gateway and the document templates. Added cloud resource cleanup as an optional subsection.</w:t>
+        <w:t xml:space="preserve">nuclear option (option 4) to interactive menu. Added</w:t>
+      </w:r>
+      <w:r>
+        <w:t xml:space="preserve"> </w:t>
+      </w:r>
+      <w:r>
+        <w:rPr>
+          <w:rStyle w:val="VerbatimChar"/>
+        </w:rPr>
+        <w:t xml:space="preserve">–repo</w:t>
+      </w:r>
+      <w:r>
+        <w:t xml:space="preserve"> </w:t>
+      </w:r>
+      <w:r>
+        <w:t xml:space="preserve">flag.</w:t>
+      </w:r>
+    </w:p>
+    <w:p>
+      <w:pPr>
+        <w:pStyle w:val="BodyText"/>
+      </w:pPr>
+      <w:r>
+        <w:t xml:space="preserve">Updated Chapter 6 with optional component prompts and update detection. Updated Chapter 7 with one-liner update/uninstall and full menu documentation.</w:t>
       </w:r>
     </w:p>
     <w:p>
@@ -15200,7 +15116,7 @@
         <w:rPr>
           <w:b/>
         </w:rPr>
-        <w:t xml:space="preserve">3.2.0</w:t>
+        <w:t xml:space="preserve">3.3.0</w:t>
       </w:r>
       <w:r>
         <w:tab/>
@@ -15209,7 +15125,7 @@
         <w:rPr>
           <w:i/>
         </w:rPr>
-        <w:t xml:space="preserve">2026-09-13</w:t>
+        <w:t xml:space="preserve">2026-09-12</w:t>
       </w:r>
     </w:p>
     <w:p>
@@ -15217,61 +15133,22 @@
         <w:pStyle w:val="BodyText"/>
       </w:pPr>
       <w:r>
-        <w:t xml:space="preserve">Added</w:t>
-      </w:r>
-      <w:r>
-        <w:t xml:space="preserve"> </w:t>
-      </w:r>
-      <w:r>
-        <w:rPr>
-          <w:rStyle w:val="VerbatimChar"/>
-        </w:rPr>
-        <w:t xml:space="preserve">uninstall.sh</w:t>
-      </w:r>
-      <w:r>
-        <w:t xml:space="preserve"> </w:t>
-      </w:r>
-      <w:r>
-        <w:t xml:space="preserve">script with interactive menu,</w:t>
-      </w:r>
-      <w:r>
-        <w:t xml:space="preserve"> </w:t>
-      </w:r>
-      <w:r>
-        <w:rPr>
-          <w:rStyle w:val="VerbatimChar"/>
-        </w:rPr>
-        <w:t xml:space="preserve">–all</w:t>
-      </w:r>
-      <w:r>
-        <w:t xml:space="preserve">,</w:t>
-      </w:r>
-      <w:r>
-        <w:t xml:space="preserve"> </w:t>
-      </w:r>
-      <w:r>
-        <w:rPr>
-          <w:rStyle w:val="VerbatimChar"/>
-        </w:rPr>
-        <w:t xml:space="preserve">–yes</w:t>
-      </w:r>
-      <w:r>
-        <w:t xml:space="preserve">, and</w:t>
-      </w:r>
-      <w:r>
-        <w:t xml:space="preserve"> </w:t>
-      </w:r>
-      <w:r>
-        <w:rPr>
-          <w:rStyle w:val="VerbatimChar"/>
-        </w:rPr>
-        <w:t xml:space="preserve">–dry-run</w:t>
-      </w:r>
-      <w:r>
-        <w:t xml:space="preserve"> </w:t>
-      </w:r>
-      <w:r>
-        <w:t xml:space="preserve">flags. Removes opencode skills, .sty modules, HarmonyOS Sans font, /etc/LatexMk fix, and VS Code settings.</w:t>
+        <w:t xml:space="preserve">Moved pre-compiled setup guide to</w:t>
+      </w:r>
+      <w:r>
+        <w:t xml:space="preserve"> </w:t>
+      </w:r>
+      <w:r>
+        <w:rPr>
+          <w:rStyle w:val="VerbatimChar"/>
+        </w:rPr>
+        <w:t xml:space="preserve">setup-guide/</w:t>
+      </w:r>
+      <w:r>
+        <w:t xml:space="preserve"> </w:t>
+      </w:r>
+      <w:r>
+        <w:t xml:space="preserve">folder in repo root with all four formats (PDF, MD, DOCX, HTML). Users can read these before cloning to understand the installation process.</w:t>
       </w:r>
     </w:p>
     <w:p>
@@ -15279,40 +15156,22 @@
         <w:pStyle w:val="BodyText"/>
       </w:pPr>
       <w:r>
-        <w:t xml:space="preserve">Fixed</w:t>
-      </w:r>
-      <w:r>
-        <w:t xml:space="preserve"> </w:t>
-      </w:r>
-      <w:r>
-        <w:rPr>
-          <w:rStyle w:val="VerbatimChar"/>
-        </w:rPr>
-        <w:t xml:space="preserve">install.sh</w:t>
-      </w:r>
-      <w:r>
-        <w:t xml:space="preserve">: show apt-get output (was hidden), suppress fvextra build noise, fix font detection (</w:t>
-      </w:r>
-      <w:r>
-        <w:rPr>
-          <w:rStyle w:val="VerbatimChar"/>
-        </w:rPr>
-        <w:t xml:space="preserve">fc-list : family</w:t>
-      </w:r>
-      <w:r>
-        <w:t xml:space="preserve">), fix test compilation paths (</w:t>
-      </w:r>
-      <w:r>
-        <w:rPr>
-          <w:rStyle w:val="VerbatimChar"/>
-        </w:rPr>
-        <w:t xml:space="preserve">src/</w:t>
-      </w:r>
-      <w:r>
-        <w:t xml:space="preserve"> </w:t>
-      </w:r>
-      <w:r>
-        <w:t xml:space="preserve">subdirectory), fix LTeX extension success/failure reporting.</w:t>
+        <w:t xml:space="preserve">Updated Makefile</w:t>
+      </w:r>
+      <w:r>
+        <w:t xml:space="preserve"> </w:t>
+      </w:r>
+      <w:r>
+        <w:rPr>
+          <w:rStyle w:val="VerbatimChar"/>
+        </w:rPr>
+        <w:t xml:space="preserve">setup-guide</w:t>
+      </w:r>
+      <w:r>
+        <w:t xml:space="preserve"> </w:t>
+      </w:r>
+      <w:r>
+        <w:t xml:space="preserve">target to generate and copy all four formats.</w:t>
       </w:r>
     </w:p>
     <w:p>
@@ -15320,7 +15179,27 @@
         <w:pStyle w:val="BodyText"/>
       </w:pPr>
       <w:r>
-        <w:t xml:space="preserve">Updated Chapter 7 with uninstall instructions.</w:t>
+        <w:t xml:space="preserve">Updated README with pre-compiled setup guide section and format comparison table.</w:t>
+      </w:r>
+    </w:p>
+    <w:p>
+      <w:pPr>
+        <w:pStyle w:val="BodyText"/>
+      </w:pPr>
+      <w:r>
+        <w:t xml:space="preserve">Updated .gitignore to track all four formats in</w:t>
+      </w:r>
+      <w:r>
+        <w:t xml:space="preserve"> </w:t>
+      </w:r>
+      <w:r>
+        <w:rPr>
+          <w:rStyle w:val="VerbatimChar"/>
+        </w:rPr>
+        <w:t xml:space="preserve">setup-guide/</w:t>
+      </w:r>
+      <w:r>
+        <w:t xml:space="preserve">.</w:t>
       </w:r>
     </w:p>
     <w:p>
@@ -15333,7 +15212,7 @@
         <w:rPr>
           <w:b/>
         </w:rPr>
-        <w:t xml:space="preserve">3.1.2</w:t>
+        <w:t xml:space="preserve">3.2.1</w:t>
       </w:r>
       <w:r>
         <w:tab/>
@@ -15342,7 +15221,7 @@
         <w:rPr>
           <w:i/>
         </w:rPr>
-        <w:t xml:space="preserve">2026-09-13</w:t>
+        <w:t xml:space="preserve">2026-09-12</w:t>
       </w:r>
     </w:p>
     <w:p>
@@ -15350,7 +15229,40 @@
         <w:pStyle w:val="BodyText"/>
       </w:pPr>
       <w:r>
-        <w:t xml:space="preserve">Added output format guide to README.md: comparison table of PDF, Markdown, DOCX, and HTML with purpose, copy-paste quality, and limitations. Recommends Markdown for copy-paste.</w:t>
+        <w:t xml:space="preserve">Renamed Chapter 7 from</w:t>
+      </w:r>
+      <w:r>
+        <w:t xml:space="preserve"> </w:t>
+      </w:r>
+      <w:r>
+        <w:t xml:space="preserve">“</w:t>
+      </w:r>
+      <w:r>
+        <w:t xml:space="preserve">Clean Up</w:t>
+      </w:r>
+      <w:r>
+        <w:t xml:space="preserve">”</w:t>
+      </w:r>
+      <w:r>
+        <w:t xml:space="preserve"> </w:t>
+      </w:r>
+      <w:r>
+        <w:t xml:space="preserve">to</w:t>
+      </w:r>
+      <w:r>
+        <w:t xml:space="preserve"> </w:t>
+      </w:r>
+      <w:r>
+        <w:t xml:space="preserve">“</w:t>
+      </w:r>
+      <w:r>
+        <w:t xml:space="preserve">Operations and Maintenance</w:t>
+      </w:r>
+      <w:r>
+        <w:t xml:space="preserve">”</w:t>
+      </w:r>
+      <w:r>
+        <w:t xml:space="preserve">. Added subsections for updating and uninstalling both the MaaS Gateway and the document templates. Added cloud resource cleanup as an optional subsection.</w:t>
       </w:r>
     </w:p>
     <w:p>
@@ -15363,7 +15275,7 @@
         <w:rPr>
           <w:b/>
         </w:rPr>
-        <w:t xml:space="preserve">3.1.1</w:t>
+        <w:t xml:space="preserve">3.2.0</w:t>
       </w:r>
       <w:r>
         <w:tab/>
@@ -15372,7 +15284,7 @@
         <w:rPr>
           <w:i/>
         </w:rPr>
-        <w:t xml:space="preserve">2026-09-13</w:t>
+        <w:t xml:space="preserve">2026-09-12</w:t>
       </w:r>
     </w:p>
     <w:p>
@@ -15380,16 +15292,61 @@
         <w:pStyle w:val="BodyText"/>
       </w:pPr>
       <w:r>
-        <w:t xml:space="preserve">Updated MaaS Gateway chapter to v1.10.9: non-interactive mode (</w:t>
-      </w:r>
-      <w:r>
-        <w:rPr>
-          <w:rStyle w:val="VerbatimChar"/>
-        </w:rPr>
-        <w:t xml:space="preserve">-y</w:t>
-      </w:r>
-      <w:r>
-        <w:t xml:space="preserve">) now suppresses all prompts (prerequisites, tool selection, skill install).</w:t>
+        <w:t xml:space="preserve">Added</w:t>
+      </w:r>
+      <w:r>
+        <w:t xml:space="preserve"> </w:t>
+      </w:r>
+      <w:r>
+        <w:rPr>
+          <w:rStyle w:val="VerbatimChar"/>
+        </w:rPr>
+        <w:t xml:space="preserve">uninstall.sh</w:t>
+      </w:r>
+      <w:r>
+        <w:t xml:space="preserve"> </w:t>
+      </w:r>
+      <w:r>
+        <w:t xml:space="preserve">script with interactive menu,</w:t>
+      </w:r>
+      <w:r>
+        <w:t xml:space="preserve"> </w:t>
+      </w:r>
+      <w:r>
+        <w:rPr>
+          <w:rStyle w:val="VerbatimChar"/>
+        </w:rPr>
+        <w:t xml:space="preserve">–all</w:t>
+      </w:r>
+      <w:r>
+        <w:t xml:space="preserve">,</w:t>
+      </w:r>
+      <w:r>
+        <w:t xml:space="preserve"> </w:t>
+      </w:r>
+      <w:r>
+        <w:rPr>
+          <w:rStyle w:val="VerbatimChar"/>
+        </w:rPr>
+        <w:t xml:space="preserve">–yes</w:t>
+      </w:r>
+      <w:r>
+        <w:t xml:space="preserve">, and</w:t>
+      </w:r>
+      <w:r>
+        <w:t xml:space="preserve"> </w:t>
+      </w:r>
+      <w:r>
+        <w:rPr>
+          <w:rStyle w:val="VerbatimChar"/>
+        </w:rPr>
+        <w:t xml:space="preserve">–dry-run</w:t>
+      </w:r>
+      <w:r>
+        <w:t xml:space="preserve"> </w:t>
+      </w:r>
+      <w:r>
+        <w:t xml:space="preserve">flags. Removes opencode skills, .sty modules, HarmonyOS Sans font, /etc/LatexMk fix, and VS Code settings.</w:t>
       </w:r>
     </w:p>
     <w:p>
@@ -15397,37 +15354,40 @@
         <w:pStyle w:val="BodyText"/>
       </w:pPr>
       <w:r>
-        <w:t xml:space="preserve">Changed project clone path from</w:t>
-      </w:r>
-      <w:r>
-        <w:t xml:space="preserve"> </w:t>
-      </w:r>
-      <w:r>
-        <w:rPr>
-          <w:rStyle w:val="VerbatimChar"/>
-        </w:rPr>
-        <w:t xml:space="preserve">~</w:t>
-      </w:r>
-      <w:r>
-        <w:t xml:space="preserve"> </w:t>
-      </w:r>
-      <w:r>
-        <w:t xml:space="preserve">(root home) to</w:t>
-      </w:r>
-      <w:r>
-        <w:t xml:space="preserve"> </w:t>
-      </w:r>
-      <w:r>
-        <w:rPr>
-          <w:rStyle w:val="VerbatimChar"/>
-        </w:rPr>
-        <w:t xml:space="preserve">/home</w:t>
-      </w:r>
-      <w:r>
-        <w:t xml:space="preserve"> </w:t>
-      </w:r>
-      <w:r>
-        <w:t xml:space="preserve">as default working directory.</w:t>
+        <w:t xml:space="preserve">Fixed</w:t>
+      </w:r>
+      <w:r>
+        <w:t xml:space="preserve"> </w:t>
+      </w:r>
+      <w:r>
+        <w:rPr>
+          <w:rStyle w:val="VerbatimChar"/>
+        </w:rPr>
+        <w:t xml:space="preserve">install.sh</w:t>
+      </w:r>
+      <w:r>
+        <w:t xml:space="preserve">: show apt-get output (was hidden), suppress fvextra build noise, fix font detection (</w:t>
+      </w:r>
+      <w:r>
+        <w:rPr>
+          <w:rStyle w:val="VerbatimChar"/>
+        </w:rPr>
+        <w:t xml:space="preserve">fc-list : family</w:t>
+      </w:r>
+      <w:r>
+        <w:t xml:space="preserve">), fix test compilation paths (</w:t>
+      </w:r>
+      <w:r>
+        <w:rPr>
+          <w:rStyle w:val="VerbatimChar"/>
+        </w:rPr>
+        <w:t xml:space="preserve">src/</w:t>
+      </w:r>
+      <w:r>
+        <w:t xml:space="preserve"> </w:t>
+      </w:r>
+      <w:r>
+        <w:t xml:space="preserve">subdirectory), fix LTeX extension success/failure reporting.</w:t>
       </w:r>
     </w:p>
     <w:p>
@@ -15435,7 +15395,7 @@
         <w:pStyle w:val="BodyText"/>
       </w:pPr>
       <w:r>
-        <w:t xml:space="preserve">Added project standards to AGENTS.md: workflow, end-to-end validation, code style, git conventions, when unsure.</w:t>
+        <w:t xml:space="preserve">Updated Chapter 7 with uninstall instructions.</w:t>
       </w:r>
     </w:p>
     <w:p>
@@ -15448,7 +15408,7 @@
         <w:rPr>
           <w:b/>
         </w:rPr>
-        <w:t xml:space="preserve">3.1.0</w:t>
+        <w:t xml:space="preserve">3.1.2</w:t>
       </w:r>
       <w:r>
         <w:tab/>
@@ -15457,7 +15417,7 @@
         <w:rPr>
           <w:i/>
         </w:rPr>
-        <w:t xml:space="preserve">2026-09-13</w:t>
+        <w:t xml:space="preserve">2026-09-12</w:t>
       </w:r>
     </w:p>
     <w:p>
@@ -15465,81 +15425,7 @@
         <w:pStyle w:val="BodyText"/>
       </w:pPr>
       <w:r>
-        <w:t xml:space="preserve">Switched from ECS to Flexus X instance (4 vCPU, 16 GB RAM via slider, flavor</w:t>
-      </w:r>
-      <w:r>
-        <w:t xml:space="preserve"> </w:t>
-      </w:r>
-      <w:r>
-        <w:rPr>
-          <w:rStyle w:val="VerbatimChar"/>
-        </w:rPr>
-        <w:t xml:space="preserve">x1.4u.16g</w:t>
-      </w:r>
-      <w:r>
-        <w:t xml:space="preserve">) — more cost-efficient and robust. Updated creation steps to match Flexus X console order: billing mode first, vCPU/RAM slider (no flavor dropdown), Cloud Eye monitoring (recommended), then instance name and key pair login. Replaced screenshots with Flexus X console images.</w:t>
-      </w:r>
-    </w:p>
-    <w:p>
-      <w:pPr>
-        <w:pStyle w:val="BodyText"/>
-      </w:pPr>
-      <w:r>
-        <w:t xml:space="preserve">Rewrote Chapter 3: switched from</w:t>
-      </w:r>
-      <w:r>
-        <w:t xml:space="preserve"> </w:t>
-      </w:r>
-      <w:r>
-        <w:rPr>
-          <w:rStyle w:val="VerbatimChar"/>
-        </w:rPr>
-        <w:t xml:space="preserve">connect.exe</w:t>
-      </w:r>
-      <w:r>
-        <w:t xml:space="preserve"> </w:t>
-      </w:r>
-      <w:r>
-        <w:t xml:space="preserve">to</w:t>
-      </w:r>
-      <w:r>
-        <w:t xml:space="preserve"> </w:t>
-      </w:r>
-      <w:r>
-        <w:rPr>
-          <w:rStyle w:val="VerbatimChar"/>
-        </w:rPr>
-        <w:t xml:space="preserve">ncat</w:t>
-      </w:r>
-      <w:r>
-        <w:t xml:space="preserve"> </w:t>
-      </w:r>
-      <w:r>
-        <w:t xml:space="preserve">(from Nmap) as the SSH ProxyCommand. Added explanation of HTTP CONNECT method, why port 4444 works, why ncat is chosen, ncat installation with antivirus exclusions, flag reference table, and improved keepalive settings.</w:t>
-      </w:r>
-    </w:p>
-    <w:p>
-      <w:pPr>
-        <w:pStyle w:val="BodyText"/>
-      </w:pPr>
-      <w:r>
-        <w:t xml:space="preserve">Restructured chapters: moved SSH config and VS Code connection to new Chapter 4 (Install VS Code and Connect via Remote-SSH). Chapters 5–7 renumbered.</w:t>
-      </w:r>
-    </w:p>
-    <w:p>
-      <w:pPr>
-        <w:pStyle w:val="BodyText"/>
-      </w:pPr>
-      <w:r>
-        <w:t xml:space="preserve">Added verification checklist tables to all 7 chapters.</w:t>
-      </w:r>
-    </w:p>
-    <w:p>
-      <w:pPr>
-        <w:pStyle w:val="BodyText"/>
-      </w:pPr>
-      <w:r>
-        <w:t xml:space="preserve">Added mandatory reboot warning in Chapter 2 (SSH port change). Added troubleshooting subsection in Chapter 4 with common SSH connection issues and ncat debugging commands.</w:t>
+        <w:t xml:space="preserve">Added output format guide to README.md: comparison table of PDF, Markdown, DOCX, and HTML with purpose, copy-paste quality, and limitations. Recommends Markdown for copy-paste.</w:t>
       </w:r>
     </w:p>
     <w:p>
@@ -15552,7 +15438,7 @@
         <w:rPr>
           <w:b/>
         </w:rPr>
-        <w:t xml:space="preserve">3.0.1</w:t>
+        <w:t xml:space="preserve">3.1.1</w:t>
       </w:r>
       <w:r>
         <w:tab/>
@@ -15561,7 +15447,7 @@
         <w:rPr>
           <w:i/>
         </w:rPr>
-        <w:t xml:space="preserve">2026-09-13</w:t>
+        <w:t xml:space="preserve">2026-09-12</w:t>
       </w:r>
     </w:p>
     <w:p>
@@ -15569,7 +15455,62 @@
         <w:pStyle w:val="BodyText"/>
       </w:pPr>
       <w:r>
-        <w:t xml:space="preserve">Minor fixes: test-filter.sh auto-discovery, build.sh help text, Makefile aggregate descriptions, 5-section comment correction, CHANGELOG version gap note, callout-in-code fix, CI font auto-discovery, dofile path comment, test-sync.sh header.</w:t>
+        <w:t xml:space="preserve">Updated MaaS Gateway chapter to v1.10.9: non-interactive mode (</w:t>
+      </w:r>
+      <w:r>
+        <w:rPr>
+          <w:rStyle w:val="VerbatimChar"/>
+        </w:rPr>
+        <w:t xml:space="preserve">-y</w:t>
+      </w:r>
+      <w:r>
+        <w:t xml:space="preserve">) now suppresses all prompts (prerequisites, tool selection, skill install).</w:t>
+      </w:r>
+    </w:p>
+    <w:p>
+      <w:pPr>
+        <w:pStyle w:val="BodyText"/>
+      </w:pPr>
+      <w:r>
+        <w:t xml:space="preserve">Changed project clone path from</w:t>
+      </w:r>
+      <w:r>
+        <w:t xml:space="preserve"> </w:t>
+      </w:r>
+      <w:r>
+        <w:rPr>
+          <w:rStyle w:val="VerbatimChar"/>
+        </w:rPr>
+        <w:t xml:space="preserve">~</w:t>
+      </w:r>
+      <w:r>
+        <w:t xml:space="preserve"> </w:t>
+      </w:r>
+      <w:r>
+        <w:t xml:space="preserve">(root home) to</w:t>
+      </w:r>
+      <w:r>
+        <w:t xml:space="preserve"> </w:t>
+      </w:r>
+      <w:r>
+        <w:rPr>
+          <w:rStyle w:val="VerbatimChar"/>
+        </w:rPr>
+        <w:t xml:space="preserve">/home</w:t>
+      </w:r>
+      <w:r>
+        <w:t xml:space="preserve"> </w:t>
+      </w:r>
+      <w:r>
+        <w:t xml:space="preserve">as default working directory.</w:t>
+      </w:r>
+    </w:p>
+    <w:p>
+      <w:pPr>
+        <w:pStyle w:val="BodyText"/>
+      </w:pPr>
+      <w:r>
+        <w:t xml:space="preserve">Added project standards to AGENTS.md: workflow, end-to-end validation, code style, git conventions, when unsure.</w:t>
       </w:r>
     </w:p>
     <w:p>
@@ -15582,7 +15523,7 @@
         <w:rPr>
           <w:b/>
         </w:rPr>
-        <w:t xml:space="preserve">3.0.0</w:t>
+        <w:t xml:space="preserve">3.1.0</w:t>
       </w:r>
       <w:r>
         <w:tab/>
@@ -15591,7 +15532,7 @@
         <w:rPr>
           <w:i/>
         </w:rPr>
-        <w:t xml:space="preserve">2026-09-13</w:t>
+        <w:t xml:space="preserve">2026-09-12</w:t>
       </w:r>
     </w:p>
     <w:p>
@@ -15599,7 +15540,81 @@
         <w:pStyle w:val="BodyText"/>
       </w:pPr>
       <w:r>
-        <w:t xml:space="preserve">Modular pipeline refactoring: shared Lua filter factory, shared DOCX fix logic, build system auto-discovery, unified format pipeline, GitHub Actions CI.</w:t>
+        <w:t xml:space="preserve">Switched from ECS to Flexus X instance (4 vCPU, 16 GB RAM via slider, flavor</w:t>
+      </w:r>
+      <w:r>
+        <w:t xml:space="preserve"> </w:t>
+      </w:r>
+      <w:r>
+        <w:rPr>
+          <w:rStyle w:val="VerbatimChar"/>
+        </w:rPr>
+        <w:t xml:space="preserve">x1.4u.16g</w:t>
+      </w:r>
+      <w:r>
+        <w:t xml:space="preserve">) — more cost-efficient and robust. Updated creation steps to match Flexus X console order: billing mode first, vCPU/RAM slider (no flavor dropdown), Cloud Eye monitoring (recommended), then instance name and key pair login. Replaced screenshots with Flexus X console images.</w:t>
+      </w:r>
+    </w:p>
+    <w:p>
+      <w:pPr>
+        <w:pStyle w:val="BodyText"/>
+      </w:pPr>
+      <w:r>
+        <w:t xml:space="preserve">Rewrote Chapter 3: switched from</w:t>
+      </w:r>
+      <w:r>
+        <w:t xml:space="preserve"> </w:t>
+      </w:r>
+      <w:r>
+        <w:rPr>
+          <w:rStyle w:val="VerbatimChar"/>
+        </w:rPr>
+        <w:t xml:space="preserve">connect.exe</w:t>
+      </w:r>
+      <w:r>
+        <w:t xml:space="preserve"> </w:t>
+      </w:r>
+      <w:r>
+        <w:t xml:space="preserve">to</w:t>
+      </w:r>
+      <w:r>
+        <w:t xml:space="preserve"> </w:t>
+      </w:r>
+      <w:r>
+        <w:rPr>
+          <w:rStyle w:val="VerbatimChar"/>
+        </w:rPr>
+        <w:t xml:space="preserve">ncat</w:t>
+      </w:r>
+      <w:r>
+        <w:t xml:space="preserve"> </w:t>
+      </w:r>
+      <w:r>
+        <w:t xml:space="preserve">(from Nmap) as the SSH ProxyCommand. Added explanation of HTTP CONNECT method, why port 4444 works, why ncat is chosen, ncat installation with antivirus exclusions, flag reference table, and improved keepalive settings.</w:t>
+      </w:r>
+    </w:p>
+    <w:p>
+      <w:pPr>
+        <w:pStyle w:val="BodyText"/>
+      </w:pPr>
+      <w:r>
+        <w:t xml:space="preserve">Restructured chapters: moved SSH config and VS Code connection to new Chapter 4 (Install VS Code and Connect via Remote-SSH). Chapters 5–7 renumbered.</w:t>
+      </w:r>
+    </w:p>
+    <w:p>
+      <w:pPr>
+        <w:pStyle w:val="BodyText"/>
+      </w:pPr>
+      <w:r>
+        <w:t xml:space="preserve">Added verification checklist tables to all 7 chapters.</w:t>
+      </w:r>
+    </w:p>
+    <w:p>
+      <w:pPr>
+        <w:pStyle w:val="BodyText"/>
+      </w:pPr>
+      <w:r>
+        <w:t xml:space="preserve">Added mandatory reboot warning in Chapter 2 (SSH port change). Added troubleshooting subsection in Chapter 4 with common SSH connection issues and ncat debugging commands.</w:t>
       </w:r>
     </w:p>
     <w:p>
@@ -15612,6 +15627,66 @@
         <w:rPr>
           <w:b/>
         </w:rPr>
+        <w:t xml:space="preserve">3.0.1</w:t>
+      </w:r>
+      <w:r>
+        <w:tab/>
+      </w:r>
+      <w:r>
+        <w:rPr>
+          <w:i/>
+        </w:rPr>
+        <w:t xml:space="preserve">2026-09-12</w:t>
+      </w:r>
+    </w:p>
+    <w:p>
+      <w:pPr>
+        <w:pStyle w:val="BodyText"/>
+      </w:pPr>
+      <w:r>
+        <w:t xml:space="preserve">Minor fixes: test-filter.sh auto-discovery, build.sh help text, Makefile aggregate descriptions, 5-section comment correction, CHANGELOG version gap note, callout-in-code fix, CI font auto-discovery, dofile path comment, test-sync.sh header.</w:t>
+      </w:r>
+    </w:p>
+    <w:p>
+      <w:pPr>
+        <w:tabs>
+          <w:tab w:val="right" w:pos="9638"/>
+        </w:tabs>
+      </w:pPr>
+      <w:r>
+        <w:rPr>
+          <w:b/>
+        </w:rPr>
+        <w:t xml:space="preserve">3.0.0</w:t>
+      </w:r>
+      <w:r>
+        <w:tab/>
+      </w:r>
+      <w:r>
+        <w:rPr>
+          <w:i/>
+        </w:rPr>
+        <w:t xml:space="preserve">2026-09-12</w:t>
+      </w:r>
+    </w:p>
+    <w:p>
+      <w:pPr>
+        <w:pStyle w:val="BodyText"/>
+      </w:pPr>
+      <w:r>
+        <w:t xml:space="preserve">Modular pipeline refactoring: shared Lua filter factory, shared DOCX fix logic, build system auto-discovery, unified format pipeline, GitHub Actions CI.</w:t>
+      </w:r>
+    </w:p>
+    <w:p>
+      <w:pPr>
+        <w:tabs>
+          <w:tab w:val="right" w:pos="9638"/>
+        </w:tabs>
+      </w:pPr>
+      <w:r>
+        <w:rPr>
+          <w:b/>
+        </w:rPr>
         <w:t xml:space="preserve">2.16.0</w:t>
       </w:r>
       <w:r>
@@ -15621,7 +15696,7 @@
         <w:rPr>
           <w:i/>
         </w:rPr>
-        <w:t xml:space="preserve">2026-09-13</w:t>
+        <w:t xml:space="preserve">2026-09-12</w:t>
       </w:r>
     </w:p>
     <w:p>

</xml_diff>

<commit_message>
v4.0.0: redesign testcase as breakable tcolorbox, add longhutable
Breaking change (visual):
- testcase: replaced 2-column tabular with breakable tcolorbox (red
  left-rule, stacked paragraph fields). API unchanged — no .tex changes
  needed. Images, code, callouts, nested tables now render correctly
  and break across pages.
- Lua filter: testcase handler produces definition lists (not tables)
  for DOCX/MD/HTML, matching the PDF stacked layout.

Features:
- longhutable: same style as hutable but uses longtable for page breaking
- hutable: added default arraystretch 1.3 for consistent row spacing
- teststeps/testsummary: fixed textwidth -> linewidth for correct width
  inside tcolorbox

Docs: updated SKILL.md (all templates), testbook README.md, CHANGELOG.md
</commit_message>
<xml_diff>
--- a/setup-guide/setup-guide.docx
+++ b/setup-guide/setup-guide.docx
@@ -70,7 +70,7 @@
         <w:pStyle w:val="CoverMeta"/>
       </w:pPr>
       <w:r>
-        <w:t xml:space="preserve">v3.9.0</w:t>
+        <w:t xml:space="preserve">v4.0.0</w:t>
       </w:r>
     </w:p>
     <w:p>
@@ -14645,6 +14645,66 @@
         </w:pBdr>
         <w:spacing w:after="120"/>
       </w:pPr>
+    </w:p>
+    <w:p>
+      <w:pPr>
+        <w:tabs>
+          <w:tab w:val="right" w:pos="9638"/>
+        </w:tabs>
+      </w:pPr>
+      <w:r>
+        <w:rPr>
+          <w:b/>
+        </w:rPr>
+        <w:t xml:space="preserve">4.0.0</w:t>
+      </w:r>
+      <w:r>
+        <w:tab/>
+      </w:r>
+      <w:r>
+        <w:rPr>
+          <w:i/>
+        </w:rPr>
+        <w:t xml:space="preserve">2026-09-12</w:t>
+      </w:r>
+    </w:p>
+    <w:p>
+      <w:pPr>
+        <w:pStyle w:val="BodyText"/>
+      </w:pPr>
+      <w:r>
+        <w:t xml:space="preserve">Redesigned testbook</w:t>
+      </w:r>
+      <w:r>
+        <w:t xml:space="preserve"> </w:t>
+      </w:r>
+      <w:r>
+        <w:rPr>
+          <w:rStyle w:val="VerbatimChar"/>
+        </w:rPr>
+        <w:t xml:space="preserve">testcase</w:t>
+      </w:r>
+      <w:r>
+        <w:t xml:space="preserve"> </w:t>
+      </w:r>
+      <w:r>
+        <w:t xml:space="preserve">environment: replaced 2-column tabular with breakable tcolorbox (red left-rule, stacked paragraph fields). Images, code blocks, callouts, and nested tables now render correctly and break across pages. Added</w:t>
+      </w:r>
+      <w:r>
+        <w:t xml:space="preserve"> </w:t>
+      </w:r>
+      <w:r>
+        <w:rPr>
+          <w:rStyle w:val="VerbatimChar"/>
+        </w:rPr>
+        <w:t xml:space="preserve">longhutable</w:t>
+      </w:r>
+      <w:r>
+        <w:t xml:space="preserve"> </w:t>
+      </w:r>
+      <w:r>
+        <w:t xml:space="preserve">environment for page-breaking tables. Updated Lua filter to produce definition lists for DOCX/MD/HTML.</w:t>
+      </w:r>
     </w:p>
     <w:p>
       <w:pPr>

</xml_diff>

<commit_message>
v4.1.0: mini header bars, testprocedure env, 2-col teststeps, field reorder
Features:
- Mini header bars: full-width red bar (huaweired bg, white bold text)
  for each testcase field
- testprocedure: changed from \testprocedure{text} command to
  \begin{testprocedure} environment wrapping teststeps
- teststeps: simplified from 4 columns to 2 (Step | Action only)
- Field order: Objective -> Prereq -> Procedure -> Expected ->
  Test Result -> Remarks (results before remarks)

Fixes:
- Lua filter: handle testprocedure as env, 2-col teststeps, reordered fields
- Round-trip test: count grid tables, wider tolerance for testbook
- Docs: updated SKILL.md, README.md for new API
</commit_message>
<xml_diff>
--- a/setup-guide/setup-guide.docx
+++ b/setup-guide/setup-guide.docx
@@ -70,7 +70,7 @@
         <w:pStyle w:val="CoverMeta"/>
       </w:pPr>
       <w:r>
-        <w:t xml:space="preserve">v4.0.0</w:t>
+        <w:t xml:space="preserve">v4.1.0</w:t>
       </w:r>
     </w:p>
     <w:p>
@@ -14645,6 +14645,51 @@
         </w:pBdr>
         <w:spacing w:after="120"/>
       </w:pPr>
+    </w:p>
+    <w:p>
+      <w:pPr>
+        <w:tabs>
+          <w:tab w:val="right" w:pos="9638"/>
+        </w:tabs>
+      </w:pPr>
+      <w:r>
+        <w:rPr>
+          <w:b/>
+        </w:rPr>
+        <w:t xml:space="preserve">4.1.0</w:t>
+      </w:r>
+      <w:r>
+        <w:tab/>
+      </w:r>
+      <w:r>
+        <w:rPr>
+          <w:i/>
+        </w:rPr>
+        <w:t xml:space="preserve">2026-09-12</w:t>
+      </w:r>
+    </w:p>
+    <w:p>
+      <w:pPr>
+        <w:pStyle w:val="BodyText"/>
+      </w:pPr>
+      <w:r>
+        <w:t xml:space="preserve">Testcase field redesign: full-width red mini header bars for each field. Changed</w:t>
+      </w:r>
+      <w:r>
+        <w:t xml:space="preserve"> </w:t>
+      </w:r>
+      <w:r>
+        <w:rPr>
+          <w:rStyle w:val="VerbatimChar"/>
+        </w:rPr>
+        <w:t xml:space="preserve">testprocedure</w:t>
+      </w:r>
+      <w:r>
+        <w:t xml:space="preserve"> </w:t>
+      </w:r>
+      <w:r>
+        <w:t xml:space="preserve">from command to environment wrapping 2-column teststeps (Step | Action). Reordered fields: Test Result before Remarks. Updated Lua filter and round-trip test for grid table counting.</w:t>
+      </w:r>
     </w:p>
     <w:p>
       <w:pPr>

</xml_diff>

<commit_message>
v4.6.0: section restructure + auto-numbered testcases
Features:
- Auto-numbered testcases (like figures/tables): Test Case 1, 2, 3...
  Uses \newcounter + \refstepcounter for \label/\ref support
- Section restructure: Introduction -> Test Cases (with category
  subsections) -> Conclusion (with test summary)
- Testcase heading changed from subsection to subsubsection
  (categories are now subsections under main Test Cases section)

Migration:
- Remove manual TC-XXX prefixes from testcase titles
- Wrap categories in \section{Test Cases} with \subsection categories
- Move test summary to \section{Conclusion}
- Update testsummary IDs from TC-001 to 1

Updated: Lua filter (counter + Header level 3), both samples,
SKILL.md, README.md
</commit_message>
<xml_diff>
--- a/setup-guide/setup-guide.docx
+++ b/setup-guide/setup-guide.docx
@@ -70,7 +70,7 @@
         <w:pStyle w:val="CoverMeta"/>
       </w:pPr>
       <w:r>
-        <w:t xml:space="preserve">v4.5.0</w:t>
+        <w:t xml:space="preserve">v4.6.0</w:t>
       </w:r>
     </w:p>
     <w:p>
@@ -14645,6 +14645,36 @@
         </w:pBdr>
         <w:spacing w:after="120"/>
       </w:pPr>
+    </w:p>
+    <w:p>
+      <w:pPr>
+        <w:tabs>
+          <w:tab w:val="right" w:pos="9638"/>
+        </w:tabs>
+      </w:pPr>
+      <w:r>
+        <w:rPr>
+          <w:b/>
+        </w:rPr>
+        <w:t xml:space="preserve">4.6.0</w:t>
+      </w:r>
+      <w:r>
+        <w:tab/>
+      </w:r>
+      <w:r>
+        <w:rPr>
+          <w:i/>
+        </w:rPr>
+        <w:t xml:space="preserve">2026-09-13</w:t>
+      </w:r>
+    </w:p>
+    <w:p>
+      <w:pPr>
+        <w:pStyle w:val="BodyText"/>
+      </w:pPr>
+      <w:r>
+        <w:t xml:space="preserve">Section restructure: Introduction, Test Cases (with category subsections), Conclusion. Testcases auto-numbered like figures/tables. Changed testcase from subsection to subsubsection.</w:t>
+      </w:r>
     </w:p>
     <w:p>
       <w:pPr>

</xml_diff>

<commit_message>
v5.0.1: center testcase caption above block
- Testcase caption now centered (was left-aligned)
- Matches table/figure caption style
</commit_message>
<xml_diff>
--- a/setup-guide/setup-guide.docx
+++ b/setup-guide/setup-guide.docx
@@ -62,7 +62,7 @@
         <w:pStyle w:val="CoverMeta"/>
       </w:pPr>
       <w:r>
-        <w:t xml:space="preserve">v5.0.0</w:t>
+        <w:t xml:space="preserve">v5.0.1</w:t>
       </w:r>
     </w:p>
     <w:p>
@@ -14637,6 +14637,36 @@
         </w:pBdr>
         <w:spacing w:after="120"/>
       </w:pPr>
+    </w:p>
+    <w:p>
+      <w:pPr>
+        <w:tabs>
+          <w:tab w:val="right" w:pos="9638"/>
+        </w:tabs>
+      </w:pPr>
+      <w:r>
+        <w:rPr>
+          <w:b/>
+        </w:rPr>
+        <w:t xml:space="preserve">5.0.1</w:t>
+      </w:r>
+      <w:r>
+        <w:tab/>
+      </w:r>
+      <w:r>
+        <w:rPr>
+          <w:i/>
+        </w:rPr>
+        <w:t xml:space="preserve">2026-09-13</w:t>
+      </w:r>
+    </w:p>
+    <w:p>
+      <w:pPr>
+        <w:pStyle w:val="BodyText"/>
+      </w:pPr>
+      <w:r>
+        <w:t xml:space="preserve">Testcase caption centered above the block.</w:t>
+      </w:r>
     </w:p>
     <w:p>
       <w:pPr>

</xml_diff>

<commit_message>
v5.0.3: remove non-standard badge tags from testcases
- Removed \badge{Required} and \badge{New} from 2 testcases (EN)
- Removed \badge{Obrigatório} and \badge{Novo} from 2 testcases (PT)
- All 10 testcases now have consistent format
</commit_message>
<xml_diff>
--- a/setup-guide/setup-guide.docx
+++ b/setup-guide/setup-guide.docx
@@ -62,7 +62,7 @@
         <w:pStyle w:val="CoverMeta"/>
       </w:pPr>
       <w:r>
-        <w:t xml:space="preserve">v5.0.2</w:t>
+        <w:t xml:space="preserve">v5.0.3</w:t>
       </w:r>
     </w:p>
     <w:p>
@@ -14637,6 +14637,51 @@
         </w:pBdr>
         <w:spacing w:after="120"/>
       </w:pPr>
+    </w:p>
+    <w:p>
+      <w:pPr>
+        <w:tabs>
+          <w:tab w:val="right" w:pos="9638"/>
+        </w:tabs>
+      </w:pPr>
+      <w:r>
+        <w:rPr>
+          <w:b/>
+        </w:rPr>
+        <w:t xml:space="preserve">5.0.3</w:t>
+      </w:r>
+      <w:r>
+        <w:tab/>
+      </w:r>
+      <w:r>
+        <w:rPr>
+          <w:i/>
+        </w:rPr>
+        <w:t xml:space="preserve">2026-09-14</w:t>
+      </w:r>
+    </w:p>
+    <w:p>
+      <w:pPr>
+        <w:pStyle w:val="BodyText"/>
+      </w:pPr>
+      <w:r>
+        <w:t xml:space="preserve">Removed non-standard</w:t>
+      </w:r>
+      <w:r>
+        <w:t xml:space="preserve"> </w:t>
+      </w:r>
+      <w:r>
+        <w:rPr>
+          <w:rStyle w:val="VerbatimChar"/>
+        </w:rPr>
+        <w:t xml:space="preserve">\badge</w:t>
+      </w:r>
+      <w:r>
+        <w:t xml:space="preserve"> </w:t>
+      </w:r>
+      <w:r>
+        <w:t xml:space="preserve">tags from testcases for consistency.</w:t>
+      </w:r>
     </w:p>
     <w:p>
       <w:pPr>

</xml_diff>